<commit_message>
feat(auth): complete first basic Auth and JWT
</commit_message>
<xml_diff>
--- a/Document/Báo cáo thực tập.docx
+++ b/Document/Báo cáo thực tập.docx
@@ -85,7 +85,7 @@
           <w:noProof/>
         </w:rPr>
         <w:drawing>
-          <wp:inline distT="0" distB="0" distL="0" distR="0" wp14:anchorId="02E99A49" wp14:editId="656C864E">
+          <wp:inline distT="0" distB="0" distL="0" distR="0" wp14:anchorId="02E99A49" wp14:editId="45B82495">
             <wp:extent cx="2857500" cy="2000250"/>
             <wp:effectExtent l="0" t="0" r="0" b="0"/>
             <wp:docPr id="227165499" name="Picture 1" descr="Trường Đại học Kinh tế Tài chính TPHCM (Đại học UEF): Logo UEF - Logo ..."/>
@@ -402,7 +402,7 @@
           <w:noProof/>
         </w:rPr>
         <w:drawing>
-          <wp:inline distT="0" distB="0" distL="0" distR="0" wp14:anchorId="64D56510" wp14:editId="48865B61">
+          <wp:inline distT="0" distB="0" distL="0" distR="0" wp14:anchorId="64D56510" wp14:editId="5A7B42A2">
             <wp:extent cx="2352675" cy="1646873"/>
             <wp:effectExtent l="0" t="0" r="0" b="0"/>
             <wp:docPr id="1420072903" name="Picture 1" descr="Trường Đại học Kinh tế Tài chính TPHCM (Đại học UEF): Logo UEF - Logo ..."/>
@@ -677,7 +677,27 @@
           <w:szCs w:val="28"/>
           <w:lang w:val="vi-VN"/>
         </w:rPr>
-        <w:t>Nguyễn Huỳnh Duy Thiện</w:t>
+        <w:t>Huỳnh</w:t>
+      </w:r>
+      <w:r>
+        <w:rPr>
+          <w:b/>
+          <w:bCs/>
+          <w:sz w:val="28"/>
+          <w:szCs w:val="28"/>
+          <w:lang w:val="vi-VN"/>
+        </w:rPr>
+        <w:t xml:space="preserve"> Dương</w:t>
+      </w:r>
+      <w:r>
+        <w:rPr>
+          <w:b/>
+          <w:bCs/>
+          <w:sz w:val="28"/>
+          <w:szCs w:val="28"/>
+          <w:lang w:val="vi-VN"/>
+        </w:rPr>
+        <w:t xml:space="preserve"> Duy Thiện</w:t>
       </w:r>
     </w:p>
     <w:p>
@@ -1238,99 +1258,2283 @@
     </w:p>
     <w:p>
       <w:pPr>
-        <w:pStyle w:val="ListParagraph"/>
-        <w:numPr>
-          <w:ilvl w:val="0"/>
-          <w:numId w:val="2"/>
-        </w:numPr>
-        <w:rPr>
-          <w:lang w:val="vi-VN"/>
-        </w:rPr>
-      </w:pPr>
-      <w:r>
-        <w:rPr>
-          <w:lang w:val="vi-VN"/>
-        </w:rPr>
-        <w:t xml:space="preserve">Tuần 2: (Từ ngày </w:t>
-      </w:r>
-      <w:r>
-        <w:rPr>
-          <w:lang w:val="vi-VN"/>
-        </w:rPr>
-        <w:t>27</w:t>
-      </w:r>
-      <w:r>
-        <w:rPr>
-          <w:lang w:val="vi-VN"/>
-        </w:rPr>
-        <w:t xml:space="preserve">/04/2026 đến </w:t>
-      </w:r>
-      <w:r>
-        <w:rPr>
-          <w:lang w:val="vi-VN"/>
-        </w:rPr>
-        <w:t>01</w:t>
-      </w:r>
-      <w:r>
-        <w:rPr>
-          <w:lang w:val="vi-VN"/>
-        </w:rPr>
-        <w:t>/</w:t>
-      </w:r>
-      <w:r>
-        <w:rPr>
-          <w:lang w:val="vi-VN"/>
-        </w:rPr>
-        <w:t>05</w:t>
-      </w:r>
-      <w:r>
-        <w:rPr>
-          <w:lang w:val="vi-VN"/>
-        </w:rPr>
-        <w:t xml:space="preserve">/2025): Trong thời gian tuần 2, tôi được giao nhiệm vụ chọn đề tài thực tập, kiểm tra và cài đặt môi trường phát triển IDE, Git, Database cũng như thực hiện tạo cấu trúc dự án mẫu. Yêu cầu đẩu ra là việc cài thành công môi trường </w:t>
-      </w:r>
-      <w:r>
-        <w:rPr>
-          <w:lang w:val="vi-VN"/>
-        </w:rPr>
-        <w:t>IDE, Database, thực hiện liệt kê các đề tài mà bản thân nghĩ ra dưới dạng word.</w:t>
-      </w:r>
-    </w:p>
-    <w:p>
-      <w:pPr>
-        <w:pStyle w:val="ListParagraph"/>
-        <w:numPr>
-          <w:ilvl w:val="0"/>
-          <w:numId w:val="2"/>
-        </w:numPr>
-        <w:rPr>
-          <w:lang w:val="vi-VN"/>
-        </w:rPr>
-      </w:pPr>
-      <w:r>
-        <w:rPr>
-          <w:lang w:val="vi-VN"/>
-        </w:rPr>
-        <w:t>Tuần 3: (Từ ngày 04/05/2026 đến ngày 08/05/2026): Trong thời gian này, tôi được cho thêm thời gian chọn đề tài thực tập và thực hiện chốt đề tài thực tập. Sản phẩm đầu ra là một đề tài thực tập với mô tả kĩ về nghiệp vụ người dùng, các yêu cầu chức năng và phi chức năng cho ứng dụng để đáp ứng nhu cầu của công ty.</w:t>
-      </w:r>
-    </w:p>
-    <w:p>
-      <w:pPr>
-        <w:pStyle w:val="ListParagraph"/>
-        <w:numPr>
-          <w:ilvl w:val="0"/>
-          <w:numId w:val="2"/>
-        </w:numPr>
-        <w:rPr>
-          <w:lang w:val="vi-VN"/>
-        </w:rPr>
-      </w:pPr>
-      <w:r>
-        <w:rPr>
-          <w:lang w:val="vi-VN"/>
-        </w:rPr>
-        <w:t xml:space="preserve">Tuần 4: (Từ ngày 11/05/2026 đến ngày 15/05/2026): Trong thời gian này, tôi được nhận các quy tắc khi thực hiện các yêu cầu  </w:t>
-      </w:r>
+        <w:rPr>
+          <w:b/>
+          <w:bCs/>
+          <w:lang w:val="vi-VN"/>
+        </w:rPr>
+      </w:pPr>
+      <w:r>
+        <w:rPr>
+          <w:b/>
+          <w:bCs/>
+          <w:lang w:val="vi-VN"/>
+        </w:rPr>
+        <w:t>TUẦN 1 – LÀM QUEN VỚI MÔI TRƯỜNG PHÁT TRIỂN PHẦN MỀM VÀ QUY TRÌNH LÀM VIỆC</w:t>
+      </w:r>
+    </w:p>
+    <w:tbl>
+      <w:tblPr>
+        <w:tblStyle w:val="TableGrid"/>
+        <w:tblW w:w="0" w:type="auto"/>
+        <w:tblLook w:val="04A0" w:firstRow="1" w:lastRow="0" w:firstColumn="1" w:lastColumn="0" w:noHBand="0" w:noVBand="1"/>
+      </w:tblPr>
+      <w:tblGrid>
+        <w:gridCol w:w="2944"/>
+        <w:gridCol w:w="2944"/>
+        <w:gridCol w:w="2944"/>
+      </w:tblGrid>
+      <w:tr>
+        <w:trPr>
+          <w:tblHeader/>
+        </w:trPr>
+        <w:tc>
+          <w:tcPr>
+            <w:tcW w:w="2944" w:type="dxa"/>
+          </w:tcPr>
+          <w:p>
+            <w:pPr>
+              <w:jc w:val="center"/>
+              <w:rPr>
+                <w:lang w:val="vi-VN"/>
+              </w:rPr>
+            </w:pPr>
+            <w:r>
+              <w:rPr>
+                <w:lang w:val="vi-VN"/>
+              </w:rPr>
+              <w:t>Nội dung công việc</w:t>
+            </w:r>
+          </w:p>
+        </w:tc>
+        <w:tc>
+          <w:tcPr>
+            <w:tcW w:w="2944" w:type="dxa"/>
+          </w:tcPr>
+          <w:p>
+            <w:pPr>
+              <w:jc w:val="center"/>
+              <w:rPr>
+                <w:lang w:val="vi-VN"/>
+              </w:rPr>
+            </w:pPr>
+            <w:r>
+              <w:rPr>
+                <w:lang w:val="vi-VN"/>
+              </w:rPr>
+              <w:t>Phương pháp thực hiện</w:t>
+            </w:r>
+          </w:p>
+        </w:tc>
+        <w:tc>
+          <w:tcPr>
+            <w:tcW w:w="2944" w:type="dxa"/>
+          </w:tcPr>
+          <w:p>
+            <w:pPr>
+              <w:jc w:val="center"/>
+              <w:rPr>
+                <w:lang w:val="vi-VN"/>
+              </w:rPr>
+            </w:pPr>
+            <w:r>
+              <w:rPr>
+                <w:lang w:val="vi-VN"/>
+              </w:rPr>
+              <w:t>Kết quả đạt được</w:t>
+            </w:r>
+          </w:p>
+        </w:tc>
+      </w:tr>
+      <w:tr>
+        <w:tc>
+          <w:tcPr>
+            <w:tcW w:w="2944" w:type="dxa"/>
+          </w:tcPr>
+          <w:p>
+            <w:pPr>
+              <w:rPr>
+                <w:lang w:val="vi-VN"/>
+              </w:rPr>
+            </w:pPr>
+            <w:r>
+              <w:rPr>
+                <w:lang w:val="vi-VN"/>
+              </w:rPr>
+              <w:t>-</w:t>
+            </w:r>
+            <w:r>
+              <w:rPr>
+                <w:lang w:val="vi-VN"/>
+              </w:rPr>
+              <w:t xml:space="preserve"> Tham gia buổi giới thiệu về công ty, phòng công nghệ thông tin và bộ phận phát triển dự án.</w:t>
+            </w:r>
+          </w:p>
+          <w:p>
+            <w:pPr>
+              <w:rPr>
+                <w:lang w:val="vi-VN"/>
+              </w:rPr>
+            </w:pPr>
+            <w:r>
+              <w:rPr>
+                <w:lang w:val="vi-VN"/>
+              </w:rPr>
+              <w:t>- Tìm hiểu cơ cấu tổ chức, chức năng và nhiệm vụ của lập trình viên trong doanh nghiệp.</w:t>
+            </w:r>
+          </w:p>
+          <w:p>
+            <w:pPr>
+              <w:rPr>
+                <w:lang w:val="vi-VN"/>
+              </w:rPr>
+            </w:pPr>
+            <w:r>
+              <w:rPr>
+                <w:lang w:val="vi-VN"/>
+              </w:rPr>
+              <w:t>- Làm quen với quy trình phát triển ứng dụng từ thu thập nghiệp vụ người dùng, xây dựng và phát triển giải pháp đến triển khai dự án.</w:t>
+            </w:r>
+          </w:p>
+          <w:p>
+            <w:pPr>
+              <w:rPr>
+                <w:lang w:val="vi-VN"/>
+              </w:rPr>
+            </w:pPr>
+            <w:r>
+              <w:rPr>
+                <w:lang w:val="vi-VN"/>
+              </w:rPr>
+              <w:t>- Tìm hiểu nhiệm vụ của bản thân với vị trí thực tập sinh Backend.</w:t>
+            </w:r>
+          </w:p>
+          <w:p>
+            <w:pPr>
+              <w:rPr>
+                <w:lang w:val="vi-VN"/>
+              </w:rPr>
+            </w:pPr>
+            <w:r>
+              <w:rPr>
+                <w:lang w:val="vi-VN"/>
+              </w:rPr>
+              <w:t>- Tìm hiểu về các công nghệ mà công ty đang sử dụng.</w:t>
+            </w:r>
+          </w:p>
+        </w:tc>
+        <w:tc>
+          <w:tcPr>
+            <w:tcW w:w="2944" w:type="dxa"/>
+          </w:tcPr>
+          <w:p>
+            <w:pPr>
+              <w:rPr>
+                <w:lang w:val="vi-VN"/>
+              </w:rPr>
+            </w:pPr>
+            <w:r>
+              <w:rPr>
+                <w:lang w:val="vi-VN"/>
+              </w:rPr>
+              <w:t>- Lắng nghe hướng dẫn từ phòng nhân sự, cán bộ phụ trách và ghi chú về các nội dung quan trọng</w:t>
+            </w:r>
+          </w:p>
+          <w:p>
+            <w:pPr>
+              <w:rPr>
+                <w:lang w:val="vi-VN"/>
+              </w:rPr>
+            </w:pPr>
+            <w:r>
+              <w:rPr>
+                <w:lang w:val="vi-VN"/>
+              </w:rPr>
+              <w:t>- Đọc tài liệu nội bộ về tổ chức, các giải pháp, dự án mà công ty đã, đang và sẽ thực hiện trong tương lai.</w:t>
+            </w:r>
+          </w:p>
+          <w:p>
+            <w:pPr>
+              <w:rPr>
+                <w:lang w:val="vi-VN"/>
+              </w:rPr>
+            </w:pPr>
+            <w:r>
+              <w:rPr>
+                <w:lang w:val="vi-VN"/>
+              </w:rPr>
+              <w:t>- Quan sát trực tiếp cách các phòng ban phối hợp với nhau trong làm việc thực tế. Quan sát trực tiếp cách lập trình viên làm việc, giải quyết vấn đề.</w:t>
+            </w:r>
+          </w:p>
+          <w:p>
+            <w:pPr>
+              <w:rPr>
+                <w:lang w:val="vi-VN"/>
+              </w:rPr>
+            </w:pPr>
+            <w:r>
+              <w:rPr>
+                <w:lang w:val="vi-VN"/>
+              </w:rPr>
+              <w:t>- Trao đổi với người hướng dẫn về công việc để nắm rõ phạm vi công việc được phân công.</w:t>
+            </w:r>
+          </w:p>
+          <w:p>
+            <w:pPr>
+              <w:rPr>
+                <w:lang w:val="vi-VN"/>
+              </w:rPr>
+            </w:pPr>
+            <w:r>
+              <w:rPr>
+                <w:lang w:val="vi-VN"/>
+              </w:rPr>
+              <w:t>- Tổng hợp các công nghệ, framework mà công ty sử dụng</w:t>
+            </w:r>
+          </w:p>
+        </w:tc>
+        <w:tc>
+          <w:tcPr>
+            <w:tcW w:w="2944" w:type="dxa"/>
+          </w:tcPr>
+          <w:p>
+            <w:pPr>
+              <w:rPr>
+                <w:lang w:val="vi-VN"/>
+              </w:rPr>
+            </w:pPr>
+            <w:r>
+              <w:rPr>
+                <w:lang w:val="vi-VN"/>
+              </w:rPr>
+              <w:t>- Hiểu được lĩnh vực mà công ty phụ trách, những công việc mà một lập trình viên sẽ thực hiện xuyên suốt vòng đời dự án.</w:t>
+            </w:r>
+          </w:p>
+          <w:p>
+            <w:pPr>
+              <w:rPr>
+                <w:lang w:val="vi-VN"/>
+              </w:rPr>
+            </w:pPr>
+            <w:r>
+              <w:rPr>
+                <w:lang w:val="vi-VN"/>
+              </w:rPr>
+              <w:t>- Nắm được quy trình cơ bản của một dự án. Trách nhiệm và công việc thực hiện giữa các bên liên quan</w:t>
+            </w:r>
+          </w:p>
+          <w:p>
+            <w:pPr>
+              <w:rPr>
+                <w:lang w:val="vi-VN"/>
+              </w:rPr>
+            </w:pPr>
+            <w:r>
+              <w:rPr>
+                <w:lang w:val="vi-VN"/>
+              </w:rPr>
+              <w:t>- Làm quen với môi trường làm việc chuyên nghiệp trong lĩnh vực phát triển phần mềm và triển khai phần mềm.</w:t>
+            </w:r>
+          </w:p>
+          <w:p>
+            <w:pPr>
+              <w:rPr>
+                <w:lang w:val="vi-VN"/>
+              </w:rPr>
+            </w:pPr>
+            <w:r>
+              <w:rPr>
+                <w:lang w:val="vi-VN"/>
+              </w:rPr>
+              <w:t>- Có ý thức về tính bảo mật thông tin của công ty trong công việc phát triển phần mềm.</w:t>
+            </w:r>
+          </w:p>
+          <w:p>
+            <w:pPr>
+              <w:rPr>
+                <w:lang w:val="vi-VN"/>
+              </w:rPr>
+            </w:pPr>
+            <w:r>
+              <w:rPr>
+                <w:lang w:val="vi-VN"/>
+              </w:rPr>
+              <w:t xml:space="preserve">- Bước đầu tiên hiểu được mối quan hệ giữa phòng phát triển dự án phần mềm với các bên liên quan. </w:t>
+            </w:r>
+          </w:p>
+          <w:p>
+            <w:pPr>
+              <w:rPr>
+                <w:lang w:val="vi-VN"/>
+              </w:rPr>
+            </w:pPr>
+            <w:r>
+              <w:rPr>
+                <w:lang w:val="vi-VN"/>
+              </w:rPr>
+              <w:t>- Hoàn thành tuần hội nhập và sẵn sàng tham gia các công việc chuyên môn tiếp theo</w:t>
+            </w:r>
+          </w:p>
+        </w:tc>
+      </w:tr>
+    </w:tbl>
+    <w:p>
+      <w:pPr>
+        <w:rPr>
+          <w:lang w:val="vi-VN"/>
+        </w:rPr>
+      </w:pPr>
+    </w:p>
+    <w:p>
+      <w:pPr>
+        <w:rPr>
+          <w:b/>
+          <w:bCs/>
+          <w:lang w:val="vi-VN"/>
+        </w:rPr>
+      </w:pPr>
+      <w:r>
+        <w:rPr>
+          <w:b/>
+          <w:bCs/>
+          <w:lang w:val="vi-VN"/>
+        </w:rPr>
+        <w:t xml:space="preserve">TUẦN 2 – </w:t>
+      </w:r>
+      <w:r>
+        <w:rPr>
+          <w:b/>
+          <w:bCs/>
+          <w:lang w:val="vi-VN"/>
+        </w:rPr>
+        <w:t>ĐỀ XUẤT</w:t>
+      </w:r>
+      <w:r>
+        <w:rPr>
+          <w:b/>
+          <w:bCs/>
+          <w:lang w:val="vi-VN"/>
+        </w:rPr>
+        <w:t xml:space="preserve"> ĐỀ TÀI THỰC </w:t>
+      </w:r>
+      <w:r>
+        <w:rPr>
+          <w:b/>
+          <w:bCs/>
+          <w:lang w:val="vi-VN"/>
+        </w:rPr>
+        <w:t>TẬP, ÔN TẬP KIẾN THỨC NỀN TẢNG</w:t>
+      </w:r>
+    </w:p>
+    <w:tbl>
+      <w:tblPr>
+        <w:tblStyle w:val="TableGrid"/>
+        <w:tblW w:w="0" w:type="auto"/>
+        <w:tblLook w:val="04A0" w:firstRow="1" w:lastRow="0" w:firstColumn="1" w:lastColumn="0" w:noHBand="0" w:noVBand="1"/>
+      </w:tblPr>
+      <w:tblGrid>
+        <w:gridCol w:w="2944"/>
+        <w:gridCol w:w="2944"/>
+        <w:gridCol w:w="2944"/>
+      </w:tblGrid>
+      <w:tr>
+        <w:trPr>
+          <w:tblHeader/>
+        </w:trPr>
+        <w:tc>
+          <w:tcPr>
+            <w:tcW w:w="2944" w:type="dxa"/>
+          </w:tcPr>
+          <w:p>
+            <w:pPr>
+              <w:jc w:val="center"/>
+              <w:rPr>
+                <w:lang w:val="vi-VN"/>
+              </w:rPr>
+            </w:pPr>
+            <w:r>
+              <w:rPr>
+                <w:lang w:val="vi-VN"/>
+              </w:rPr>
+              <w:lastRenderedPageBreak/>
+              <w:t>Nội dung công việc</w:t>
+            </w:r>
+          </w:p>
+        </w:tc>
+        <w:tc>
+          <w:tcPr>
+            <w:tcW w:w="2944" w:type="dxa"/>
+          </w:tcPr>
+          <w:p>
+            <w:pPr>
+              <w:jc w:val="center"/>
+              <w:rPr>
+                <w:lang w:val="vi-VN"/>
+              </w:rPr>
+            </w:pPr>
+            <w:r>
+              <w:rPr>
+                <w:lang w:val="vi-VN"/>
+              </w:rPr>
+              <w:t>Phương pháp thực hiện</w:t>
+            </w:r>
+          </w:p>
+        </w:tc>
+        <w:tc>
+          <w:tcPr>
+            <w:tcW w:w="2944" w:type="dxa"/>
+          </w:tcPr>
+          <w:p>
+            <w:pPr>
+              <w:jc w:val="center"/>
+              <w:rPr>
+                <w:lang w:val="vi-VN"/>
+              </w:rPr>
+            </w:pPr>
+            <w:r>
+              <w:rPr>
+                <w:lang w:val="vi-VN"/>
+              </w:rPr>
+              <w:t>Kết quả đạt được</w:t>
+            </w:r>
+          </w:p>
+        </w:tc>
+      </w:tr>
+      <w:tr>
+        <w:tc>
+          <w:tcPr>
+            <w:tcW w:w="2944" w:type="dxa"/>
+          </w:tcPr>
+          <w:p>
+            <w:pPr>
+              <w:rPr>
+                <w:lang w:val="vi-VN"/>
+              </w:rPr>
+            </w:pPr>
+            <w:r>
+              <w:rPr>
+                <w:lang w:val="vi-VN"/>
+              </w:rPr>
+              <w:t>- Thực hiện đề xuất các đề tài thực tập cho cán bộ hướng dẫn.</w:t>
+            </w:r>
+          </w:p>
+          <w:p>
+            <w:pPr>
+              <w:rPr>
+                <w:lang w:val="vi-VN"/>
+              </w:rPr>
+            </w:pPr>
+            <w:r>
+              <w:rPr>
+                <w:lang w:val="vi-VN"/>
+              </w:rPr>
+              <w:t xml:space="preserve">- </w:t>
+            </w:r>
+            <w:r>
+              <w:rPr>
+                <w:lang w:val="vi-VN"/>
+              </w:rPr>
+              <w:t>Tìm hiểu quy trình quản lý dự án và phát triển dự án trên Git hoặc GitHub/GitLab.</w:t>
+            </w:r>
+          </w:p>
+          <w:p>
+            <w:pPr>
+              <w:rPr>
+                <w:lang w:val="vi-VN"/>
+              </w:rPr>
+            </w:pPr>
+            <w:r>
+              <w:rPr>
+                <w:lang w:val="vi-VN"/>
+              </w:rPr>
+              <w:t>- Làm quen với quy trình pull request, merge request và review code trong nhóm kỹ thuật.</w:t>
+            </w:r>
+          </w:p>
+          <w:p>
+            <w:pPr>
+              <w:rPr>
+                <w:lang w:val="vi-VN"/>
+              </w:rPr>
+            </w:pPr>
+            <w:r>
+              <w:rPr>
+                <w:lang w:val="vi-VN"/>
+              </w:rPr>
+              <w:t>- Tìm hiểu về kiến thức về dữ liệu, database và các kiến thức query data.</w:t>
+            </w:r>
+          </w:p>
+        </w:tc>
+        <w:tc>
+          <w:tcPr>
+            <w:tcW w:w="2944" w:type="dxa"/>
+          </w:tcPr>
+          <w:p>
+            <w:pPr>
+              <w:rPr>
+                <w:lang w:val="vi-VN"/>
+              </w:rPr>
+            </w:pPr>
+            <w:r>
+              <w:rPr>
+                <w:lang w:val="vi-VN"/>
+              </w:rPr>
+              <w:t>- Sử dụng Git command line theo hướng dẫn</w:t>
+            </w:r>
+          </w:p>
+          <w:p>
+            <w:pPr>
+              <w:rPr>
+                <w:lang w:val="vi-VN"/>
+              </w:rPr>
+            </w:pPr>
+            <w:r>
+              <w:rPr>
+                <w:lang w:val="vi-VN"/>
+              </w:rPr>
+              <w:t>- Đọc, tìm hiểu tài liệu quy chuẩn quản lý mã nguồn của dự án trước khi thực hiện thao tác.</w:t>
+            </w:r>
+          </w:p>
+          <w:p>
+            <w:pPr>
+              <w:rPr>
+                <w:lang w:val="vi-VN"/>
+              </w:rPr>
+            </w:pPr>
+            <w:r>
+              <w:rPr>
+                <w:lang w:val="vi-VN"/>
+              </w:rPr>
+              <w:t>- Tạo branch thử nghiệm trong phạm vi được cho phép để thực hành quy trình làm việc.</w:t>
+            </w:r>
+          </w:p>
+          <w:p>
+            <w:pPr>
+              <w:rPr>
+                <w:lang w:val="vi-VN"/>
+              </w:rPr>
+            </w:pPr>
+            <w:r>
+              <w:rPr>
+                <w:lang w:val="vi-VN"/>
+              </w:rPr>
+              <w:t>- Đối chiếu thay đổi trong file trước khi commit để tránh nhầm nội dung không cần thiết hoặc bị conflict.</w:t>
+            </w:r>
+          </w:p>
+          <w:p>
+            <w:pPr>
+              <w:rPr>
+                <w:lang w:val="vi-VN"/>
+              </w:rPr>
+            </w:pPr>
+            <w:r>
+              <w:rPr>
+                <w:lang w:val="vi-VN"/>
+              </w:rPr>
+              <w:t>- Ghi chép lại các lệnh Git thường dùng để phục vụ cho công việc sau này.</w:t>
+            </w:r>
+          </w:p>
+          <w:p>
+            <w:pPr>
+              <w:rPr>
+                <w:lang w:val="vi-VN"/>
+              </w:rPr>
+            </w:pPr>
+            <w:r>
+              <w:rPr>
+                <w:lang w:val="vi-VN"/>
+              </w:rPr>
+              <w:t xml:space="preserve">- Đọc tài liệu về dữ liệu, cách query và cách sử dụng MSSQL </w:t>
+            </w:r>
+          </w:p>
+        </w:tc>
+        <w:tc>
+          <w:tcPr>
+            <w:tcW w:w="2944" w:type="dxa"/>
+          </w:tcPr>
+          <w:p>
+            <w:pPr>
+              <w:rPr>
+                <w:lang w:val="vi-VN"/>
+              </w:rPr>
+            </w:pPr>
+            <w:r>
+              <w:rPr>
+                <w:lang w:val="vi-VN"/>
+              </w:rPr>
+              <w:t>- Biết cách thao tác cơ bản với Git trong môi trường dự án thực tế.</w:t>
+            </w:r>
+          </w:p>
+          <w:p>
+            <w:pPr>
+              <w:rPr>
+                <w:lang w:val="vi-VN"/>
+              </w:rPr>
+            </w:pPr>
+            <w:r>
+              <w:rPr>
+                <w:lang w:val="vi-VN"/>
+              </w:rPr>
+              <w:t>- Hiểu được vai trò của quản lý mã nguồn trong quy trình phát triển phần mềm.</w:t>
+            </w:r>
+          </w:p>
+          <w:p>
+            <w:pPr>
+              <w:rPr>
+                <w:lang w:val="vi-VN"/>
+              </w:rPr>
+            </w:pPr>
+            <w:r>
+              <w:rPr>
+                <w:lang w:val="vi-VN"/>
+              </w:rPr>
+              <w:t xml:space="preserve">- </w:t>
+            </w:r>
+            <w:r>
+              <w:rPr>
+                <w:lang w:val="vi-VN"/>
+              </w:rPr>
+              <w:t xml:space="preserve">Nắm được quy trình tạo branch, commit, pull request và merge request ở mức cơ bản. </w:t>
+            </w:r>
+          </w:p>
+          <w:p>
+            <w:pPr>
+              <w:rPr>
+                <w:lang w:val="vi-VN"/>
+              </w:rPr>
+            </w:pPr>
+            <w:r>
+              <w:rPr>
+                <w:lang w:val="vi-VN"/>
+              </w:rPr>
+              <w:t>- Nhận diện một số lỗi thường gặp khi làm việc với remote repository.</w:t>
+            </w:r>
+          </w:p>
+          <w:p>
+            <w:pPr>
+              <w:rPr>
+                <w:lang w:val="vi-VN"/>
+              </w:rPr>
+            </w:pPr>
+            <w:r>
+              <w:rPr>
+                <w:lang w:val="vi-VN"/>
+              </w:rPr>
+              <w:t>- Rèn luyện thói quen kiểm tra thay đổi trước khi đưa mã nguồn lên hệ thống.</w:t>
+            </w:r>
+          </w:p>
+          <w:p>
+            <w:pPr>
+              <w:rPr>
+                <w:lang w:val="vi-VN"/>
+              </w:rPr>
+            </w:pPr>
+            <w:r>
+              <w:rPr>
+                <w:lang w:val="vi-VN"/>
+              </w:rPr>
+              <w:t>- Rèn luyện cách sử dụng MSSQL và cách query, tối ưu query là gì?</w:t>
+            </w:r>
+          </w:p>
+        </w:tc>
+      </w:tr>
+    </w:tbl>
+    <w:p>
+      <w:pPr>
+        <w:rPr>
+          <w:lang w:val="vi-VN"/>
+        </w:rPr>
+      </w:pPr>
+    </w:p>
+    <w:p>
+      <w:pPr>
+        <w:rPr>
+          <w:b/>
+          <w:bCs/>
+          <w:lang w:val="vi-VN"/>
+        </w:rPr>
+      </w:pPr>
+      <w:r>
+        <w:rPr>
+          <w:b/>
+          <w:bCs/>
+          <w:lang w:val="vi-VN"/>
+        </w:rPr>
+        <w:t>TUẦN 3 – TIẾP NHẬN ĐỀ TÀI THỰC TẬP VÀ PHÂN RÃ TÍNH NĂNG.</w:t>
+      </w:r>
+    </w:p>
+    <w:tbl>
+      <w:tblPr>
+        <w:tblStyle w:val="TableGrid"/>
+        <w:tblW w:w="0" w:type="auto"/>
+        <w:tblLook w:val="04A0" w:firstRow="1" w:lastRow="0" w:firstColumn="1" w:lastColumn="0" w:noHBand="0" w:noVBand="1"/>
+      </w:tblPr>
+      <w:tblGrid>
+        <w:gridCol w:w="2944"/>
+        <w:gridCol w:w="2944"/>
+        <w:gridCol w:w="2944"/>
+      </w:tblGrid>
+      <w:tr>
+        <w:tc>
+          <w:tcPr>
+            <w:tcW w:w="2944" w:type="dxa"/>
+          </w:tcPr>
+          <w:p>
+            <w:pPr>
+              <w:jc w:val="center"/>
+              <w:rPr>
+                <w:lang w:val="vi-VN"/>
+              </w:rPr>
+            </w:pPr>
+            <w:r>
+              <w:rPr>
+                <w:lang w:val="vi-VN"/>
+              </w:rPr>
+              <w:t>Nội dung công việc</w:t>
+            </w:r>
+          </w:p>
+        </w:tc>
+        <w:tc>
+          <w:tcPr>
+            <w:tcW w:w="2944" w:type="dxa"/>
+          </w:tcPr>
+          <w:p>
+            <w:pPr>
+              <w:jc w:val="center"/>
+              <w:rPr>
+                <w:lang w:val="vi-VN"/>
+              </w:rPr>
+            </w:pPr>
+            <w:r>
+              <w:rPr>
+                <w:lang w:val="vi-VN"/>
+              </w:rPr>
+              <w:t>Phương pháp thực hiện</w:t>
+            </w:r>
+          </w:p>
+        </w:tc>
+        <w:tc>
+          <w:tcPr>
+            <w:tcW w:w="2944" w:type="dxa"/>
+          </w:tcPr>
+          <w:p>
+            <w:pPr>
+              <w:jc w:val="center"/>
+              <w:rPr>
+                <w:lang w:val="vi-VN"/>
+              </w:rPr>
+            </w:pPr>
+            <w:r>
+              <w:rPr>
+                <w:lang w:val="vi-VN"/>
+              </w:rPr>
+              <w:t>Kết quả đạt được</w:t>
+            </w:r>
+          </w:p>
+        </w:tc>
+      </w:tr>
+      <w:tr>
+        <w:tc>
+          <w:tcPr>
+            <w:tcW w:w="2944" w:type="dxa"/>
+          </w:tcPr>
+          <w:p>
+            <w:pPr>
+              <w:rPr>
+                <w:lang w:val="vi-VN"/>
+              </w:rPr>
+            </w:pPr>
+            <w:r>
+              <w:rPr>
+                <w:lang w:val="vi-VN"/>
+              </w:rPr>
+              <w:t>-</w:t>
+            </w:r>
+            <w:r>
+              <w:rPr>
+                <w:lang w:val="vi-VN"/>
+              </w:rPr>
+              <w:t xml:space="preserve"> Tìm hiểu môi trường phát triển dự án Visual Studio 2017, SQL Server Management Studio và GitHub cho việc phát triển dự án.</w:t>
+            </w:r>
+          </w:p>
+          <w:p>
+            <w:pPr>
+              <w:rPr>
+                <w:lang w:val="vi-VN"/>
+              </w:rPr>
+            </w:pPr>
+            <w:r>
+              <w:rPr>
+                <w:lang w:val="vi-VN"/>
+              </w:rPr>
+              <w:t>- Tiếp nhận đề tài thực tập của cán bộ hướng dẫn.</w:t>
+            </w:r>
+          </w:p>
+          <w:p>
+            <w:pPr>
+              <w:rPr>
+                <w:lang w:val="vi-VN"/>
+              </w:rPr>
+            </w:pPr>
+            <w:r>
+              <w:rPr>
+                <w:lang w:val="vi-VN"/>
+              </w:rPr>
+              <w:t>- Phân tích đề tài thực tập, phân rã tính năng và số lượng màn hình dự kiến.</w:t>
+            </w:r>
+          </w:p>
+        </w:tc>
+        <w:tc>
+          <w:tcPr>
+            <w:tcW w:w="2944" w:type="dxa"/>
+          </w:tcPr>
+          <w:p>
+            <w:pPr>
+              <w:rPr>
+                <w:lang w:val="vi-VN"/>
+              </w:rPr>
+            </w:pPr>
+            <w:r>
+              <w:rPr>
+                <w:lang w:val="vi-VN"/>
+              </w:rPr>
+              <w:t>- Sử dụng Visual Studio 2017 để tạo dự án, SQL Server Management Studio để tạo và quản lý database.</w:t>
+            </w:r>
+          </w:p>
+          <w:p>
+            <w:pPr>
+              <w:rPr>
+                <w:lang w:val="vi-VN"/>
+              </w:rPr>
+            </w:pPr>
+            <w:r>
+              <w:rPr>
+                <w:lang w:val="vi-VN"/>
+              </w:rPr>
+              <w:t>- Tiếp nhận tài liệu mô tả đề tài thực tập, phân tích và bàn giao tài liệu phân rã hệ thống cho cán bộ hướng dẫn.</w:t>
+            </w:r>
+          </w:p>
+          <w:p>
+            <w:pPr>
+              <w:rPr>
+                <w:lang w:val="vi-VN"/>
+              </w:rPr>
+            </w:pPr>
+            <w:r>
+              <w:rPr>
+                <w:lang w:val="vi-VN"/>
+              </w:rPr>
+              <w:t>- Trao đổi các thắc mắc về đề tài thực tập, các yêu cầu tối thiểu từ lúc khởi tạo dự án cho đến khi bàn giao và nghiệm thu đề tài.</w:t>
+            </w:r>
+          </w:p>
+        </w:tc>
+        <w:tc>
+          <w:tcPr>
+            <w:tcW w:w="2944" w:type="dxa"/>
+          </w:tcPr>
+          <w:p>
+            <w:pPr>
+              <w:rPr>
+                <w:lang w:val="vi-VN"/>
+              </w:rPr>
+            </w:pPr>
+            <w:r>
+              <w:rPr>
+                <w:lang w:val="vi-VN"/>
+              </w:rPr>
+              <w:t>- Biết cách sử dụng Visual Studio, SSMS và các công cụ đi kèm trong các công việc phát triển phần mềm.</w:t>
+            </w:r>
+          </w:p>
+          <w:p>
+            <w:pPr>
+              <w:rPr>
+                <w:lang w:val="vi-VN"/>
+              </w:rPr>
+            </w:pPr>
+            <w:r>
+              <w:rPr>
+                <w:lang w:val="vi-VN"/>
+              </w:rPr>
+              <w:t xml:space="preserve">- Rèn luyện khả năng phân tích dự án, </w:t>
+            </w:r>
+            <w:r>
+              <w:rPr>
+                <w:lang w:val="vi-VN"/>
+              </w:rPr>
+              <w:t>cách trao đổi v  làm rõ các yêu cầu thiết yếu của đề tài. Các kỳ vọng của cán bộ hướng dẫn cho đề tài này.</w:t>
+            </w:r>
+          </w:p>
+        </w:tc>
+      </w:tr>
+    </w:tbl>
+    <w:p>
+      <w:pPr>
+        <w:rPr>
+          <w:lang w:val="vi-VN"/>
+        </w:rPr>
+      </w:pPr>
+    </w:p>
+    <w:p>
+      <w:pPr>
+        <w:rPr>
+          <w:b/>
+          <w:bCs/>
+          <w:lang w:val="vi-VN"/>
+        </w:rPr>
+      </w:pPr>
+      <w:r>
+        <w:rPr>
+          <w:b/>
+          <w:bCs/>
+          <w:lang w:val="vi-VN"/>
+        </w:rPr>
+        <w:lastRenderedPageBreak/>
+        <w:t>TUẦN 4 – TRIỂN KHAI CẤU TRÚC DỰ ÁN VÀ XÂY DỰNG CÁC CHỨC NĂNG CƠ BẢN</w:t>
+      </w:r>
+    </w:p>
+    <w:tbl>
+      <w:tblPr>
+        <w:tblStyle w:val="TableGrid"/>
+        <w:tblW w:w="0" w:type="auto"/>
+        <w:tblLook w:val="04A0" w:firstRow="1" w:lastRow="0" w:firstColumn="1" w:lastColumn="0" w:noHBand="0" w:noVBand="1"/>
+      </w:tblPr>
+      <w:tblGrid>
+        <w:gridCol w:w="2944"/>
+        <w:gridCol w:w="2944"/>
+        <w:gridCol w:w="2944"/>
+      </w:tblGrid>
+      <w:tr>
+        <w:tc>
+          <w:tcPr>
+            <w:tcW w:w="2944" w:type="dxa"/>
+            <w:tcBorders>
+              <w:top w:val="single" w:sz="4" w:space="0" w:color="auto"/>
+              <w:left w:val="single" w:sz="4" w:space="0" w:color="auto"/>
+              <w:bottom w:val="single" w:sz="4" w:space="0" w:color="auto"/>
+              <w:right w:val="single" w:sz="4" w:space="0" w:color="auto"/>
+            </w:tcBorders>
+            <w:hideMark/>
+          </w:tcPr>
+          <w:p>
+            <w:pPr>
+              <w:spacing w:after="160" w:line="278" w:lineRule="auto"/>
+              <w:rPr>
+                <w:lang w:val="vi-VN"/>
+              </w:rPr>
+            </w:pPr>
+            <w:r>
+              <w:rPr>
+                <w:lang w:val="vi-VN"/>
+              </w:rPr>
+              <w:t>Nội dung công việc</w:t>
+            </w:r>
+          </w:p>
+        </w:tc>
+        <w:tc>
+          <w:tcPr>
+            <w:tcW w:w="2944" w:type="dxa"/>
+            <w:tcBorders>
+              <w:top w:val="single" w:sz="4" w:space="0" w:color="auto"/>
+              <w:left w:val="single" w:sz="4" w:space="0" w:color="auto"/>
+              <w:bottom w:val="single" w:sz="4" w:space="0" w:color="auto"/>
+              <w:right w:val="single" w:sz="4" w:space="0" w:color="auto"/>
+            </w:tcBorders>
+            <w:hideMark/>
+          </w:tcPr>
+          <w:p>
+            <w:pPr>
+              <w:spacing w:after="160" w:line="278" w:lineRule="auto"/>
+              <w:rPr>
+                <w:lang w:val="vi-VN"/>
+              </w:rPr>
+            </w:pPr>
+            <w:r>
+              <w:rPr>
+                <w:lang w:val="vi-VN"/>
+              </w:rPr>
+              <w:t>Phương pháp thực hiện</w:t>
+            </w:r>
+          </w:p>
+        </w:tc>
+        <w:tc>
+          <w:tcPr>
+            <w:tcW w:w="2944" w:type="dxa"/>
+            <w:tcBorders>
+              <w:top w:val="single" w:sz="4" w:space="0" w:color="auto"/>
+              <w:left w:val="single" w:sz="4" w:space="0" w:color="auto"/>
+              <w:bottom w:val="single" w:sz="4" w:space="0" w:color="auto"/>
+              <w:right w:val="single" w:sz="4" w:space="0" w:color="auto"/>
+            </w:tcBorders>
+            <w:hideMark/>
+          </w:tcPr>
+          <w:p>
+            <w:pPr>
+              <w:spacing w:after="160" w:line="278" w:lineRule="auto"/>
+              <w:rPr>
+                <w:lang w:val="vi-VN"/>
+              </w:rPr>
+            </w:pPr>
+            <w:r>
+              <w:rPr>
+                <w:lang w:val="vi-VN"/>
+              </w:rPr>
+              <w:t>Kết quả đạt được</w:t>
+            </w:r>
+          </w:p>
+        </w:tc>
+      </w:tr>
+      <w:tr>
+        <w:tc>
+          <w:tcPr>
+            <w:tcW w:w="2944" w:type="dxa"/>
+            <w:tcBorders>
+              <w:top w:val="single" w:sz="4" w:space="0" w:color="auto"/>
+              <w:left w:val="single" w:sz="4" w:space="0" w:color="auto"/>
+              <w:bottom w:val="single" w:sz="4" w:space="0" w:color="auto"/>
+              <w:right w:val="single" w:sz="4" w:space="0" w:color="auto"/>
+            </w:tcBorders>
+          </w:tcPr>
+          <w:p>
+            <w:pPr>
+              <w:rPr>
+                <w:lang w:val="vi-VN"/>
+              </w:rPr>
+            </w:pPr>
+            <w:r>
+              <w:rPr>
+                <w:lang w:val="vi-VN"/>
+              </w:rPr>
+              <w:t>-</w:t>
+            </w:r>
+            <w:r>
+              <w:rPr>
+                <w:lang w:val="vi-VN"/>
+              </w:rPr>
+              <w:t xml:space="preserve"> Tìm hiểu, ôn tập kiến thức về công nghệ C#. </w:t>
+            </w:r>
+          </w:p>
+          <w:p>
+            <w:pPr>
+              <w:rPr>
+                <w:lang w:val="vi-VN"/>
+              </w:rPr>
+            </w:pPr>
+            <w:r>
+              <w:rPr>
+                <w:lang w:val="vi-VN"/>
+              </w:rPr>
+              <w:t xml:space="preserve">- Thực hiện chọn công nghệ, liệt kê các framework dự kiến sử </w:t>
+            </w:r>
+            <w:r>
+              <w:rPr>
+                <w:lang w:val="vi-VN"/>
+              </w:rPr>
+              <w:t>dụng.</w:t>
+            </w:r>
+          </w:p>
+          <w:p>
+            <w:pPr>
+              <w:rPr>
+                <w:lang w:val="vi-VN"/>
+              </w:rPr>
+            </w:pPr>
+            <w:r>
+              <w:rPr>
+                <w:lang w:val="vi-VN"/>
+              </w:rPr>
+              <w:t>- Tạo server database và tạo database phục vụ cho dự án.</w:t>
+            </w:r>
+          </w:p>
+          <w:p>
+            <w:pPr>
+              <w:rPr>
+                <w:lang w:val="vi-VN"/>
+              </w:rPr>
+            </w:pPr>
+            <w:r>
+              <w:rPr>
+                <w:lang w:val="vi-VN"/>
+              </w:rPr>
+              <w:t>- Tạo dự án backend và kết nối với database</w:t>
+            </w:r>
+          </w:p>
+          <w:p>
+            <w:pPr>
+              <w:rPr>
+                <w:lang w:val="vi-VN"/>
+              </w:rPr>
+            </w:pPr>
+            <w:r>
+              <w:rPr>
+                <w:lang w:val="vi-VN"/>
+              </w:rPr>
+              <w:t>- Tạo dự án frontend</w:t>
+            </w:r>
+          </w:p>
+        </w:tc>
+        <w:tc>
+          <w:tcPr>
+            <w:tcW w:w="2944" w:type="dxa"/>
+            <w:tcBorders>
+              <w:top w:val="single" w:sz="4" w:space="0" w:color="auto"/>
+              <w:left w:val="single" w:sz="4" w:space="0" w:color="auto"/>
+              <w:bottom w:val="single" w:sz="4" w:space="0" w:color="auto"/>
+              <w:right w:val="single" w:sz="4" w:space="0" w:color="auto"/>
+            </w:tcBorders>
+          </w:tcPr>
+          <w:p>
+            <w:pPr>
+              <w:spacing w:after="160" w:line="278" w:lineRule="auto"/>
+              <w:rPr>
+                <w:lang w:val="vi-VN"/>
+              </w:rPr>
+            </w:pPr>
+            <w:r>
+              <w:rPr>
+                <w:lang w:val="vi-VN"/>
+              </w:rPr>
+              <w:t>- Sử dụng SSMS để tạo database mới. Thực hành tìm hiểu và sử dụng SSMS trong môi trường thực tế.</w:t>
+            </w:r>
+          </w:p>
+          <w:p>
+            <w:pPr>
+              <w:spacing w:after="160" w:line="278" w:lineRule="auto"/>
+              <w:rPr>
+                <w:lang w:val="vi-VN"/>
+              </w:rPr>
+            </w:pPr>
+            <w:r>
+              <w:rPr>
+                <w:lang w:val="vi-VN"/>
+              </w:rPr>
+              <w:t>- Sử dụng Visual Studio để tạo cấu trúc dự án backend. Tìm hiểu cấu trúc và định hình các file cấu hình. Thực hiện kết nối và kiểm tra kết nối giữa backend .NET Core và database.</w:t>
+            </w:r>
+          </w:p>
+          <w:p>
+            <w:pPr>
+              <w:spacing w:after="160" w:line="278" w:lineRule="auto"/>
+              <w:rPr>
+                <w:lang w:val="vi-VN"/>
+              </w:rPr>
+            </w:pPr>
+            <w:r>
+              <w:rPr>
+                <w:lang w:val="vi-VN"/>
+              </w:rPr>
+              <w:t xml:space="preserve">- Thực hiện dùng </w:t>
+            </w:r>
+            <w:r>
+              <w:rPr>
+                <w:lang w:val="vi-VN"/>
+              </w:rPr>
+              <w:t>CLI</w:t>
+            </w:r>
+            <w:r>
+              <w:rPr>
+                <w:lang w:val="vi-VN"/>
+              </w:rPr>
+              <w:t xml:space="preserve"> để tạo dự án frontend ReactJS và thực hiện kết nối dự án với backend</w:t>
+            </w:r>
+          </w:p>
+          <w:p>
+            <w:pPr>
+              <w:spacing w:after="160" w:line="278" w:lineRule="auto"/>
+              <w:rPr>
+                <w:lang w:val="vi-VN"/>
+              </w:rPr>
+            </w:pPr>
+            <w:r>
+              <w:rPr>
+                <w:lang w:val="vi-VN"/>
+              </w:rPr>
+              <w:t>- Thực hiện trao đổi những thắc mắc với cán bộ hướng dẫn về đề tài thực tập.</w:t>
+            </w:r>
+          </w:p>
+        </w:tc>
+        <w:tc>
+          <w:tcPr>
+            <w:tcW w:w="2944" w:type="dxa"/>
+            <w:tcBorders>
+              <w:top w:val="single" w:sz="4" w:space="0" w:color="auto"/>
+              <w:left w:val="single" w:sz="4" w:space="0" w:color="auto"/>
+              <w:bottom w:val="single" w:sz="4" w:space="0" w:color="auto"/>
+              <w:right w:val="single" w:sz="4" w:space="0" w:color="auto"/>
+            </w:tcBorders>
+          </w:tcPr>
+          <w:p>
+            <w:pPr>
+              <w:spacing w:after="160" w:line="278" w:lineRule="auto"/>
+              <w:rPr>
+                <w:lang w:val="vi-VN"/>
+              </w:rPr>
+            </w:pPr>
+            <w:r>
+              <w:rPr>
+                <w:lang w:val="vi-VN"/>
+              </w:rPr>
+              <w:t xml:space="preserve">- Hiểu được cách sử dụng SSMS trong môi trường thực tế. </w:t>
+            </w:r>
+            <w:r>
+              <w:rPr>
+                <w:lang w:val="vi-VN"/>
+              </w:rPr>
+              <w:t>Query tạo bảng và tương tác CRUD với các đối tượng trong database.</w:t>
+            </w:r>
+          </w:p>
+          <w:p>
+            <w:pPr>
+              <w:spacing w:after="160" w:line="278" w:lineRule="auto"/>
+              <w:rPr>
+                <w:lang w:val="vi-VN"/>
+              </w:rPr>
+            </w:pPr>
+            <w:r>
+              <w:rPr>
+                <w:lang w:val="vi-VN"/>
+              </w:rPr>
+              <w:t>- Hiểu được cách sử dụng Visual Studio trong môi trường thực tế, cách kết nối giữa backend và các dự án khác.</w:t>
+            </w:r>
+          </w:p>
+        </w:tc>
+      </w:tr>
+    </w:tbl>
+    <w:p>
+      <w:pPr>
+        <w:rPr>
+          <w:lang w:val="vi-VN"/>
+        </w:rPr>
+      </w:pPr>
+    </w:p>
+    <w:p>
+      <w:pPr>
+        <w:rPr>
+          <w:b/>
+          <w:bCs/>
+          <w:lang w:val="vi-VN"/>
+        </w:rPr>
+      </w:pPr>
+      <w:r>
+        <w:rPr>
+          <w:b/>
+          <w:bCs/>
+          <w:lang w:val="vi-VN"/>
+        </w:rPr>
+        <w:t>TUẦN 5 – LÀM QUEN VỚI CÁC CÔNG CỤ PHÁT TRIỂN FRONTEND – XÂY DỰNG TÍNH NĂNG QUẢN LÝ CHUYÊN ĐỂ</w:t>
+      </w:r>
+    </w:p>
+    <w:tbl>
+      <w:tblPr>
+        <w:tblStyle w:val="TableGrid"/>
+        <w:tblW w:w="0" w:type="auto"/>
+        <w:tblLook w:val="04A0" w:firstRow="1" w:lastRow="0" w:firstColumn="1" w:lastColumn="0" w:noHBand="0" w:noVBand="1"/>
+      </w:tblPr>
+      <w:tblGrid>
+        <w:gridCol w:w="2944"/>
+        <w:gridCol w:w="2944"/>
+        <w:gridCol w:w="2944"/>
+      </w:tblGrid>
+      <w:tr>
+        <w:tc>
+          <w:tcPr>
+            <w:tcW w:w="2944" w:type="dxa"/>
+            <w:tcBorders>
+              <w:top w:val="single" w:sz="4" w:space="0" w:color="auto"/>
+              <w:left w:val="single" w:sz="4" w:space="0" w:color="auto"/>
+              <w:bottom w:val="single" w:sz="4" w:space="0" w:color="auto"/>
+              <w:right w:val="single" w:sz="4" w:space="0" w:color="auto"/>
+            </w:tcBorders>
+            <w:hideMark/>
+          </w:tcPr>
+          <w:p>
+            <w:pPr>
+              <w:spacing w:after="160" w:line="278" w:lineRule="auto"/>
+              <w:rPr>
+                <w:lang w:val="vi-VN"/>
+              </w:rPr>
+            </w:pPr>
+            <w:r>
+              <w:rPr>
+                <w:lang w:val="vi-VN"/>
+              </w:rPr>
+              <w:t>Nội dung công việc</w:t>
+            </w:r>
+          </w:p>
+        </w:tc>
+        <w:tc>
+          <w:tcPr>
+            <w:tcW w:w="2944" w:type="dxa"/>
+            <w:tcBorders>
+              <w:top w:val="single" w:sz="4" w:space="0" w:color="auto"/>
+              <w:left w:val="single" w:sz="4" w:space="0" w:color="auto"/>
+              <w:bottom w:val="single" w:sz="4" w:space="0" w:color="auto"/>
+              <w:right w:val="single" w:sz="4" w:space="0" w:color="auto"/>
+            </w:tcBorders>
+            <w:hideMark/>
+          </w:tcPr>
+          <w:p>
+            <w:pPr>
+              <w:spacing w:after="160" w:line="278" w:lineRule="auto"/>
+              <w:rPr>
+                <w:lang w:val="vi-VN"/>
+              </w:rPr>
+            </w:pPr>
+            <w:r>
+              <w:rPr>
+                <w:lang w:val="vi-VN"/>
+              </w:rPr>
+              <w:t>Phương pháp thực hiện</w:t>
+            </w:r>
+          </w:p>
+        </w:tc>
+        <w:tc>
+          <w:tcPr>
+            <w:tcW w:w="2944" w:type="dxa"/>
+            <w:tcBorders>
+              <w:top w:val="single" w:sz="4" w:space="0" w:color="auto"/>
+              <w:left w:val="single" w:sz="4" w:space="0" w:color="auto"/>
+              <w:bottom w:val="single" w:sz="4" w:space="0" w:color="auto"/>
+              <w:right w:val="single" w:sz="4" w:space="0" w:color="auto"/>
+            </w:tcBorders>
+            <w:hideMark/>
+          </w:tcPr>
+          <w:p>
+            <w:pPr>
+              <w:spacing w:after="160" w:line="278" w:lineRule="auto"/>
+              <w:rPr>
+                <w:lang w:val="vi-VN"/>
+              </w:rPr>
+            </w:pPr>
+            <w:r>
+              <w:rPr>
+                <w:lang w:val="vi-VN"/>
+              </w:rPr>
+              <w:t>Kết quả đạt được</w:t>
+            </w:r>
+          </w:p>
+        </w:tc>
+      </w:tr>
+      <w:tr>
+        <w:tc>
+          <w:tcPr>
+            <w:tcW w:w="2944" w:type="dxa"/>
+            <w:tcBorders>
+              <w:top w:val="single" w:sz="4" w:space="0" w:color="auto"/>
+              <w:left w:val="single" w:sz="4" w:space="0" w:color="auto"/>
+              <w:bottom w:val="single" w:sz="4" w:space="0" w:color="auto"/>
+              <w:right w:val="single" w:sz="4" w:space="0" w:color="auto"/>
+            </w:tcBorders>
+          </w:tcPr>
+          <w:p>
+            <w:pPr>
+              <w:rPr>
+                <w:lang w:val="vi-VN"/>
+              </w:rPr>
+            </w:pPr>
+            <w:r>
+              <w:rPr>
+                <w:lang w:val="vi-VN"/>
+              </w:rPr>
+              <w:t>-</w:t>
+            </w:r>
+            <w:r>
+              <w:rPr>
+                <w:lang w:val="vi-VN"/>
+              </w:rPr>
+              <w:t xml:space="preserve"> Thực hiện phân tích tính năng quản lý chuyên đề</w:t>
+            </w:r>
+          </w:p>
+          <w:p>
+            <w:pPr>
+              <w:rPr>
+                <w:lang w:val="vi-VN"/>
+              </w:rPr>
+            </w:pPr>
+            <w:r>
+              <w:rPr>
+                <w:lang w:val="vi-VN"/>
+              </w:rPr>
+              <w:t>- Thực hiện tạo các bảng, dữ liệu cho chức năng quản lý chuyên đề</w:t>
+            </w:r>
+          </w:p>
+          <w:p>
+            <w:pPr>
+              <w:rPr>
+                <w:lang w:val="vi-VN"/>
+              </w:rPr>
+            </w:pPr>
+            <w:r>
+              <w:rPr>
+                <w:lang w:val="vi-VN"/>
+              </w:rPr>
+              <w:t xml:space="preserve">- Phân tích các yêu cầu thực hiện xử lý, thực hiện </w:t>
+            </w:r>
+            <w:r>
+              <w:rPr>
+                <w:lang w:val="vi-VN"/>
+              </w:rPr>
+              <w:lastRenderedPageBreak/>
+              <w:t>tạo use case diagram, class diagram, xác định các</w:t>
+            </w:r>
+            <w:r>
+              <w:rPr>
+                <w:lang w:val="vi-VN"/>
+              </w:rPr>
+              <w:t xml:space="preserve"> ràng buộc, yêu cầu bắt buộc về nghiệp vụ khi thực hiện.</w:t>
+            </w:r>
+          </w:p>
+        </w:tc>
+        <w:tc>
+          <w:tcPr>
+            <w:tcW w:w="2944" w:type="dxa"/>
+            <w:tcBorders>
+              <w:top w:val="single" w:sz="4" w:space="0" w:color="auto"/>
+              <w:left w:val="single" w:sz="4" w:space="0" w:color="auto"/>
+              <w:bottom w:val="single" w:sz="4" w:space="0" w:color="auto"/>
+              <w:right w:val="single" w:sz="4" w:space="0" w:color="auto"/>
+            </w:tcBorders>
+          </w:tcPr>
+          <w:p>
+            <w:pPr>
+              <w:spacing w:after="160" w:line="278" w:lineRule="auto"/>
+              <w:rPr>
+                <w:lang w:val="vi-VN"/>
+              </w:rPr>
+            </w:pPr>
+            <w:r>
+              <w:rPr>
+                <w:lang w:val="vi-VN"/>
+              </w:rPr>
+              <w:lastRenderedPageBreak/>
+              <w:t>- Đọc tài liệu mô tả đề tài thực tập, thực hiện phân tích và trao đổi về yêu cầu nghiệp vụ cho chức năng.</w:t>
+            </w:r>
+          </w:p>
+          <w:p>
+            <w:pPr>
+              <w:spacing w:after="160" w:line="278" w:lineRule="auto"/>
+              <w:rPr>
+                <w:lang w:val="vi-VN"/>
+              </w:rPr>
+            </w:pPr>
+            <w:r>
+              <w:rPr>
+                <w:lang w:val="vi-VN"/>
+              </w:rPr>
+              <w:lastRenderedPageBreak/>
+              <w:t>- Sử dụng Draw.io để phác thảo use case diagram cho nghiệp vụ.</w:t>
+            </w:r>
+          </w:p>
+          <w:p>
+            <w:pPr>
+              <w:spacing w:after="160" w:line="278" w:lineRule="auto"/>
+              <w:rPr>
+                <w:lang w:val="vi-VN"/>
+              </w:rPr>
+            </w:pPr>
+            <w:r>
+              <w:rPr>
+                <w:lang w:val="vi-VN"/>
+              </w:rPr>
+              <w:t>- Xác định các trường hợp và ràng buộc cho chức năng.</w:t>
+            </w:r>
+          </w:p>
+          <w:p>
+            <w:pPr>
+              <w:spacing w:after="160" w:line="278" w:lineRule="auto"/>
+              <w:rPr>
+                <w:lang w:val="vi-VN"/>
+              </w:rPr>
+            </w:pPr>
+            <w:r>
+              <w:rPr>
+                <w:lang w:val="vi-VN"/>
+              </w:rPr>
+              <w:t>- Thiết kế database, xây dựng tầng Repository, Service và Controller cho chức năng quản lý chuyên đề.</w:t>
+            </w:r>
+          </w:p>
+          <w:p>
+            <w:pPr>
+              <w:spacing w:after="160" w:line="278" w:lineRule="auto"/>
+              <w:rPr>
+                <w:lang w:val="vi-VN"/>
+              </w:rPr>
+            </w:pPr>
+            <w:r>
+              <w:rPr>
+                <w:lang w:val="vi-VN"/>
+              </w:rPr>
+              <w:t>- Trao đổi với cán bộ hướng dẫn về những thắc mắc trong quá trình thực hiện.</w:t>
+            </w:r>
+          </w:p>
+          <w:p>
+            <w:pPr>
+              <w:spacing w:after="160" w:line="278" w:lineRule="auto"/>
+              <w:rPr>
+                <w:lang w:val="vi-VN"/>
+              </w:rPr>
+            </w:pPr>
+            <w:r>
+              <w:rPr>
+                <w:lang w:val="vi-VN"/>
+              </w:rPr>
+              <w:t xml:space="preserve">- Báo cáo tiến độ hoàn thành và </w:t>
+            </w:r>
+            <w:r>
+              <w:rPr>
+                <w:lang w:val="vi-VN"/>
+              </w:rPr>
+              <w:t>kiểm tra code trong quá trình thực hiện</w:t>
+            </w:r>
+          </w:p>
+        </w:tc>
+        <w:tc>
+          <w:tcPr>
+            <w:tcW w:w="2944" w:type="dxa"/>
+            <w:tcBorders>
+              <w:top w:val="single" w:sz="4" w:space="0" w:color="auto"/>
+              <w:left w:val="single" w:sz="4" w:space="0" w:color="auto"/>
+              <w:bottom w:val="single" w:sz="4" w:space="0" w:color="auto"/>
+              <w:right w:val="single" w:sz="4" w:space="0" w:color="auto"/>
+            </w:tcBorders>
+          </w:tcPr>
+          <w:p>
+            <w:pPr>
+              <w:spacing w:after="160" w:line="278" w:lineRule="auto"/>
+              <w:rPr>
+                <w:lang w:val="vi-VN"/>
+              </w:rPr>
+            </w:pPr>
+            <w:r>
+              <w:rPr>
+                <w:lang w:val="vi-VN"/>
+              </w:rPr>
+              <w:lastRenderedPageBreak/>
+              <w:t xml:space="preserve">- Hiểu được quy trình nghiệp vụ của chức năng quản lý chuyên </w:t>
+            </w:r>
+            <w:r>
+              <w:rPr>
+                <w:lang w:val="vi-VN"/>
+              </w:rPr>
+              <w:t>đề.</w:t>
+            </w:r>
+          </w:p>
+          <w:p>
+            <w:pPr>
+              <w:spacing w:after="160" w:line="278" w:lineRule="auto"/>
+              <w:rPr>
+                <w:lang w:val="vi-VN"/>
+              </w:rPr>
+            </w:pPr>
+            <w:r>
+              <w:rPr>
+                <w:lang w:val="vi-VN"/>
+              </w:rPr>
+              <w:lastRenderedPageBreak/>
+              <w:t>- Hiểu được cách triển khai, thực hiện nghiệp vụ trong thực tế.</w:t>
+            </w:r>
+          </w:p>
+          <w:p>
+            <w:pPr>
+              <w:spacing w:after="160" w:line="278" w:lineRule="auto"/>
+              <w:rPr>
+                <w:lang w:val="vi-VN"/>
+              </w:rPr>
+            </w:pPr>
+            <w:r>
+              <w:rPr>
+                <w:lang w:val="vi-VN"/>
+              </w:rPr>
+              <w:t>- Rèn luyện khả năng tự debug lỗi, sử dụng Visual Studio để thực hiện kiểm tra dòng code bị lỗi.</w:t>
+            </w:r>
+          </w:p>
+          <w:p>
+            <w:pPr>
+              <w:spacing w:after="160" w:line="278" w:lineRule="auto"/>
+              <w:rPr>
+                <w:lang w:val="vi-VN"/>
+              </w:rPr>
+            </w:pPr>
+            <w:r>
+              <w:rPr>
+                <w:lang w:val="vi-VN"/>
+              </w:rPr>
+              <w:t>- Rèn luyện tư duy tách biệt giữa UI/UX và luồng hoạt động của backend, cách tổ chức dữ liệu để phù hợp với nhu cầu người dùng.</w:t>
+            </w:r>
+          </w:p>
+          <w:p>
+            <w:pPr>
+              <w:spacing w:after="160" w:line="278" w:lineRule="auto"/>
+              <w:rPr>
+                <w:lang w:val="vi-VN"/>
+              </w:rPr>
+            </w:pPr>
+            <w:r>
+              <w:rPr>
+                <w:lang w:val="vi-VN"/>
+              </w:rPr>
+              <w:t>- Rèn luyện cách trao đổi để làm rõ yêu cầu của người dùng.</w:t>
+            </w:r>
+          </w:p>
+        </w:tc>
+      </w:tr>
+    </w:tbl>
+    <w:p>
+      <w:pPr>
+        <w:rPr>
+          <w:lang w:val="vi-VN"/>
+        </w:rPr>
+      </w:pPr>
+    </w:p>
+    <w:p>
+      <w:pPr>
+        <w:rPr>
+          <w:b/>
+          <w:bCs/>
+          <w:lang w:val="vi-VN"/>
+        </w:rPr>
+      </w:pPr>
+      <w:r>
+        <w:rPr>
+          <w:b/>
+          <w:bCs/>
+          <w:lang w:val="vi-VN"/>
+        </w:rPr>
+        <w:t xml:space="preserve">TUẦN </w:t>
+      </w:r>
+      <w:r>
+        <w:rPr>
+          <w:b/>
+          <w:bCs/>
+          <w:lang w:val="vi-VN"/>
+        </w:rPr>
+        <w:t>6 -</w:t>
+      </w:r>
+      <w:r>
+        <w:rPr>
+          <w:b/>
+          <w:bCs/>
+          <w:lang w:val="vi-VN"/>
+        </w:rPr>
+        <w:t xml:space="preserve"> TIẾP TỤC HOÀN THÀNH CHỨC NĂNG QUẢN LÝ CHUYÊN ĐỀ</w:t>
+      </w:r>
+    </w:p>
+    <w:tbl>
+      <w:tblPr>
+        <w:tblStyle w:val="TableGrid"/>
+        <w:tblW w:w="0" w:type="auto"/>
+        <w:tblLook w:val="04A0" w:firstRow="1" w:lastRow="0" w:firstColumn="1" w:lastColumn="0" w:noHBand="0" w:noVBand="1"/>
+      </w:tblPr>
+      <w:tblGrid>
+        <w:gridCol w:w="2944"/>
+        <w:gridCol w:w="2944"/>
+        <w:gridCol w:w="2944"/>
+      </w:tblGrid>
+      <w:tr>
+        <w:tc>
+          <w:tcPr>
+            <w:tcW w:w="2944" w:type="dxa"/>
+            <w:tcBorders>
+              <w:top w:val="single" w:sz="4" w:space="0" w:color="auto"/>
+              <w:left w:val="single" w:sz="4" w:space="0" w:color="auto"/>
+              <w:bottom w:val="single" w:sz="4" w:space="0" w:color="auto"/>
+              <w:right w:val="single" w:sz="4" w:space="0" w:color="auto"/>
+            </w:tcBorders>
+            <w:hideMark/>
+          </w:tcPr>
+          <w:p>
+            <w:pPr>
+              <w:spacing w:after="160" w:line="278" w:lineRule="auto"/>
+              <w:rPr>
+                <w:lang w:val="vi-VN"/>
+              </w:rPr>
+            </w:pPr>
+            <w:r>
+              <w:rPr>
+                <w:lang w:val="vi-VN"/>
+              </w:rPr>
+              <w:t>Nội dung công việc</w:t>
+            </w:r>
+          </w:p>
+        </w:tc>
+        <w:tc>
+          <w:tcPr>
+            <w:tcW w:w="2944" w:type="dxa"/>
+            <w:tcBorders>
+              <w:top w:val="single" w:sz="4" w:space="0" w:color="auto"/>
+              <w:left w:val="single" w:sz="4" w:space="0" w:color="auto"/>
+              <w:bottom w:val="single" w:sz="4" w:space="0" w:color="auto"/>
+              <w:right w:val="single" w:sz="4" w:space="0" w:color="auto"/>
+            </w:tcBorders>
+            <w:hideMark/>
+          </w:tcPr>
+          <w:p>
+            <w:pPr>
+              <w:spacing w:after="160" w:line="278" w:lineRule="auto"/>
+              <w:rPr>
+                <w:lang w:val="vi-VN"/>
+              </w:rPr>
+            </w:pPr>
+            <w:r>
+              <w:rPr>
+                <w:lang w:val="vi-VN"/>
+              </w:rPr>
+              <w:t>Phương pháp thực hiện</w:t>
+            </w:r>
+          </w:p>
+        </w:tc>
+        <w:tc>
+          <w:tcPr>
+            <w:tcW w:w="2944" w:type="dxa"/>
+            <w:tcBorders>
+              <w:top w:val="single" w:sz="4" w:space="0" w:color="auto"/>
+              <w:left w:val="single" w:sz="4" w:space="0" w:color="auto"/>
+              <w:bottom w:val="single" w:sz="4" w:space="0" w:color="auto"/>
+              <w:right w:val="single" w:sz="4" w:space="0" w:color="auto"/>
+            </w:tcBorders>
+            <w:hideMark/>
+          </w:tcPr>
+          <w:p>
+            <w:pPr>
+              <w:spacing w:after="160" w:line="278" w:lineRule="auto"/>
+              <w:rPr>
+                <w:lang w:val="vi-VN"/>
+              </w:rPr>
+            </w:pPr>
+            <w:r>
+              <w:rPr>
+                <w:lang w:val="vi-VN"/>
+              </w:rPr>
+              <w:t>Kết quả đạt được</w:t>
+            </w:r>
+          </w:p>
+        </w:tc>
+      </w:tr>
+      <w:tr>
+        <w:tc>
+          <w:tcPr>
+            <w:tcW w:w="2944" w:type="dxa"/>
+            <w:tcBorders>
+              <w:top w:val="single" w:sz="4" w:space="0" w:color="auto"/>
+              <w:left w:val="single" w:sz="4" w:space="0" w:color="auto"/>
+              <w:bottom w:val="single" w:sz="4" w:space="0" w:color="auto"/>
+              <w:right w:val="single" w:sz="4" w:space="0" w:color="auto"/>
+            </w:tcBorders>
+          </w:tcPr>
+          <w:p>
+            <w:pPr>
+              <w:rPr>
+                <w:lang w:val="vi-VN"/>
+              </w:rPr>
+            </w:pPr>
+            <w:r>
+              <w:rPr>
+                <w:lang w:val="vi-VN"/>
+              </w:rPr>
+              <w:t>-</w:t>
+            </w:r>
+            <w:r>
+              <w:rPr>
+                <w:lang w:val="vi-VN"/>
+              </w:rPr>
+              <w:t xml:space="preserve"> Tiếp tục thực hiện chức năng quản lý chuyên đề (tầng Controller).</w:t>
+            </w:r>
+          </w:p>
+          <w:p>
+            <w:pPr>
+              <w:rPr>
+                <w:lang w:val="vi-VN"/>
+              </w:rPr>
+            </w:pPr>
+            <w:r>
+              <w:rPr>
+                <w:lang w:val="vi-VN"/>
+              </w:rPr>
+              <w:t>- Phân tích, phân rã tính năng quản lý giảng viên, học viên.</w:t>
+            </w:r>
+          </w:p>
+          <w:p>
+            <w:pPr>
+              <w:rPr>
+                <w:lang w:val="vi-VN"/>
+              </w:rPr>
+            </w:pPr>
+            <w:r>
+              <w:rPr>
+                <w:lang w:val="vi-VN"/>
+              </w:rPr>
+              <w:t>- Dựng màn hình dự kiến cho chức năng quản lý học viên, giảng viên</w:t>
+            </w:r>
+          </w:p>
+          <w:p>
+            <w:pPr>
+              <w:rPr>
+                <w:lang w:val="vi-VN"/>
+              </w:rPr>
+            </w:pPr>
+            <w:r>
+              <w:rPr>
+                <w:lang w:val="vi-VN"/>
+              </w:rPr>
+              <w:t>- Thiết kế database phục vụ cho chức năng quản lý giảng viên, học viên</w:t>
+            </w:r>
+          </w:p>
+        </w:tc>
+        <w:tc>
+          <w:tcPr>
+            <w:tcW w:w="2944" w:type="dxa"/>
+            <w:tcBorders>
+              <w:top w:val="single" w:sz="4" w:space="0" w:color="auto"/>
+              <w:left w:val="single" w:sz="4" w:space="0" w:color="auto"/>
+              <w:bottom w:val="single" w:sz="4" w:space="0" w:color="auto"/>
+              <w:right w:val="single" w:sz="4" w:space="0" w:color="auto"/>
+            </w:tcBorders>
+          </w:tcPr>
+          <w:p>
+            <w:pPr>
+              <w:spacing w:after="160" w:line="278" w:lineRule="auto"/>
+              <w:rPr>
+                <w:lang w:val="vi-VN"/>
+              </w:rPr>
+            </w:pPr>
+            <w:r>
+              <w:rPr>
+                <w:lang w:val="vi-VN"/>
+              </w:rPr>
+              <w:t>- Dựa trên tài liệu mô tả đề tài, thực hiện phân tích chức năng quản lý giảng viên, học viên.</w:t>
+            </w:r>
+          </w:p>
+          <w:p>
+            <w:pPr>
+              <w:spacing w:after="160" w:line="278" w:lineRule="auto"/>
+              <w:rPr>
+                <w:lang w:val="vi-VN"/>
+              </w:rPr>
+            </w:pPr>
+            <w:r>
+              <w:rPr>
+                <w:lang w:val="vi-VN"/>
+              </w:rPr>
+              <w:t>- Sử dụng công cụ AI sinh màn hình dự kiến cho chức năng quản lý học viên, giảng viên.</w:t>
+            </w:r>
+          </w:p>
+          <w:p>
+            <w:pPr>
+              <w:spacing w:after="160" w:line="278" w:lineRule="auto"/>
+              <w:rPr>
+                <w:lang w:val="vi-VN"/>
+              </w:rPr>
+            </w:pPr>
+            <w:r>
+              <w:rPr>
+                <w:lang w:val="vi-VN"/>
+              </w:rPr>
+              <w:t xml:space="preserve">- Sử dụng SSMS tạo database thực hiện cho </w:t>
+            </w:r>
+            <w:r>
+              <w:rPr>
+                <w:lang w:val="vi-VN"/>
+              </w:rPr>
+              <w:lastRenderedPageBreak/>
+              <w:t>chức năng quản lý giảng viên, học viên.</w:t>
+            </w:r>
+          </w:p>
+          <w:p>
+            <w:pPr>
+              <w:spacing w:after="160" w:line="278" w:lineRule="auto"/>
+              <w:rPr>
+                <w:lang w:val="vi-VN"/>
+              </w:rPr>
+            </w:pPr>
+            <w:r>
+              <w:rPr>
+                <w:lang w:val="vi-VN"/>
+              </w:rPr>
+              <w:t>- Báo cáo những thay đổi, tiếp nhận các đề xuất của cán bộ hướng dẫn với chức năng.</w:t>
+            </w:r>
+          </w:p>
+        </w:tc>
+        <w:tc>
+          <w:tcPr>
+            <w:tcW w:w="2944" w:type="dxa"/>
+            <w:tcBorders>
+              <w:top w:val="single" w:sz="4" w:space="0" w:color="auto"/>
+              <w:left w:val="single" w:sz="4" w:space="0" w:color="auto"/>
+              <w:bottom w:val="single" w:sz="4" w:space="0" w:color="auto"/>
+              <w:right w:val="single" w:sz="4" w:space="0" w:color="auto"/>
+            </w:tcBorders>
+          </w:tcPr>
+          <w:p>
+            <w:pPr>
+              <w:spacing w:after="160" w:line="278" w:lineRule="auto"/>
+              <w:rPr>
+                <w:lang w:val="vi-VN"/>
+              </w:rPr>
+            </w:pPr>
+            <w:r>
+              <w:rPr>
+                <w:lang w:val="vi-VN"/>
+              </w:rPr>
+              <w:lastRenderedPageBreak/>
+              <w:t>- Hiểu được nghiệp vụ quản lý giảng viên, học viên.</w:t>
+            </w:r>
+          </w:p>
+          <w:p>
+            <w:pPr>
+              <w:spacing w:after="160" w:line="278" w:lineRule="auto"/>
+              <w:rPr>
+                <w:lang w:val="vi-VN"/>
+              </w:rPr>
+            </w:pPr>
+            <w:r>
+              <w:rPr>
+                <w:lang w:val="vi-VN"/>
+              </w:rPr>
+              <w:t>- Rèn luyện việc sinh triển khai database dựa theo nghiệp vụ người dùng.</w:t>
+            </w:r>
+          </w:p>
+          <w:p>
+            <w:pPr>
+              <w:spacing w:after="160" w:line="278" w:lineRule="auto"/>
+              <w:rPr>
+                <w:lang w:val="vi-VN"/>
+              </w:rPr>
+            </w:pPr>
+            <w:r>
+              <w:rPr>
+                <w:lang w:val="vi-VN"/>
+              </w:rPr>
+              <w:t>- Rèn luyện việc trao đổi về nghiệp vụ để đảm bảo hiệu quả công việc</w:t>
+            </w:r>
+          </w:p>
+        </w:tc>
+      </w:tr>
+    </w:tbl>
+    <w:p>
+      <w:pPr>
+        <w:rPr>
+          <w:lang w:val="vi-VN"/>
+        </w:rPr>
+      </w:pPr>
+    </w:p>
+    <w:p>
+      <w:pPr>
+        <w:rPr>
+          <w:lang w:val="vi-VN"/>
+        </w:rPr>
+      </w:pPr>
+      <w:r>
+        <w:rPr>
+          <w:lang w:val="vi-VN"/>
+        </w:rPr>
+        <w:t xml:space="preserve">TUẦN 7 – THỰC HIỆN CHỨC NĂNG QUẢN LÝ KHÓA HỌC </w:t>
+      </w:r>
+    </w:p>
+    <w:tbl>
+      <w:tblPr>
+        <w:tblStyle w:val="TableGrid"/>
+        <w:tblW w:w="0" w:type="auto"/>
+        <w:tblLook w:val="04A0" w:firstRow="1" w:lastRow="0" w:firstColumn="1" w:lastColumn="0" w:noHBand="0" w:noVBand="1"/>
+      </w:tblPr>
+      <w:tblGrid>
+        <w:gridCol w:w="2944"/>
+        <w:gridCol w:w="2944"/>
+        <w:gridCol w:w="2944"/>
+      </w:tblGrid>
+      <w:tr>
+        <w:tc>
+          <w:tcPr>
+            <w:tcW w:w="2944" w:type="dxa"/>
+            <w:tcBorders>
+              <w:top w:val="single" w:sz="4" w:space="0" w:color="auto"/>
+              <w:left w:val="single" w:sz="4" w:space="0" w:color="auto"/>
+              <w:bottom w:val="single" w:sz="4" w:space="0" w:color="auto"/>
+              <w:right w:val="single" w:sz="4" w:space="0" w:color="auto"/>
+            </w:tcBorders>
+            <w:hideMark/>
+          </w:tcPr>
+          <w:p>
+            <w:pPr>
+              <w:spacing w:after="160" w:line="278" w:lineRule="auto"/>
+              <w:rPr>
+                <w:lang w:val="vi-VN"/>
+              </w:rPr>
+            </w:pPr>
+            <w:r>
+              <w:rPr>
+                <w:lang w:val="vi-VN"/>
+              </w:rPr>
+              <w:t>Nội dung công việc</w:t>
+            </w:r>
+          </w:p>
+        </w:tc>
+        <w:tc>
+          <w:tcPr>
+            <w:tcW w:w="2944" w:type="dxa"/>
+            <w:tcBorders>
+              <w:top w:val="single" w:sz="4" w:space="0" w:color="auto"/>
+              <w:left w:val="single" w:sz="4" w:space="0" w:color="auto"/>
+              <w:bottom w:val="single" w:sz="4" w:space="0" w:color="auto"/>
+              <w:right w:val="single" w:sz="4" w:space="0" w:color="auto"/>
+            </w:tcBorders>
+            <w:hideMark/>
+          </w:tcPr>
+          <w:p>
+            <w:pPr>
+              <w:spacing w:after="160" w:line="278" w:lineRule="auto"/>
+              <w:rPr>
+                <w:lang w:val="vi-VN"/>
+              </w:rPr>
+            </w:pPr>
+            <w:r>
+              <w:rPr>
+                <w:lang w:val="vi-VN"/>
+              </w:rPr>
+              <w:t>Phương pháp thực hiện</w:t>
+            </w:r>
+          </w:p>
+        </w:tc>
+        <w:tc>
+          <w:tcPr>
+            <w:tcW w:w="2944" w:type="dxa"/>
+            <w:tcBorders>
+              <w:top w:val="single" w:sz="4" w:space="0" w:color="auto"/>
+              <w:left w:val="single" w:sz="4" w:space="0" w:color="auto"/>
+              <w:bottom w:val="single" w:sz="4" w:space="0" w:color="auto"/>
+              <w:right w:val="single" w:sz="4" w:space="0" w:color="auto"/>
+            </w:tcBorders>
+            <w:hideMark/>
+          </w:tcPr>
+          <w:p>
+            <w:pPr>
+              <w:spacing w:after="160" w:line="278" w:lineRule="auto"/>
+              <w:rPr>
+                <w:lang w:val="vi-VN"/>
+              </w:rPr>
+            </w:pPr>
+            <w:r>
+              <w:rPr>
+                <w:lang w:val="vi-VN"/>
+              </w:rPr>
+              <w:t>Kết quả đạt được</w:t>
+            </w:r>
+          </w:p>
+        </w:tc>
+      </w:tr>
+      <w:tr>
+        <w:tc>
+          <w:tcPr>
+            <w:tcW w:w="2944" w:type="dxa"/>
+            <w:tcBorders>
+              <w:top w:val="single" w:sz="4" w:space="0" w:color="auto"/>
+              <w:left w:val="single" w:sz="4" w:space="0" w:color="auto"/>
+              <w:bottom w:val="single" w:sz="4" w:space="0" w:color="auto"/>
+              <w:right w:val="single" w:sz="4" w:space="0" w:color="auto"/>
+            </w:tcBorders>
+          </w:tcPr>
+          <w:p>
+            <w:pPr>
+              <w:rPr>
+                <w:lang w:val="vi-VN"/>
+              </w:rPr>
+            </w:pPr>
+            <w:r>
+              <w:rPr>
+                <w:lang w:val="vi-VN"/>
+              </w:rPr>
+              <w:t>- Thực hiện khảo sát nghiệp vụ, phân rã công việc của các tầng của chức năng quản lý khóa học.</w:t>
+            </w:r>
+          </w:p>
+          <w:p>
+            <w:pPr>
+              <w:rPr>
+                <w:lang w:val="vi-VN"/>
+              </w:rPr>
+            </w:pPr>
+            <w:r>
+              <w:rPr>
+                <w:lang w:val="vi-VN"/>
+              </w:rPr>
+              <w:t>- Dựng màn hình dự kiến cho chức năng</w:t>
+            </w:r>
+          </w:p>
+          <w:p>
+            <w:pPr>
+              <w:rPr>
+                <w:lang w:val="vi-VN"/>
+              </w:rPr>
+            </w:pPr>
+            <w:r>
+              <w:rPr>
+                <w:lang w:val="vi-VN"/>
+              </w:rPr>
+              <w:t>- Hoàn thiện chức năng quản lý khóa học, thực hiển kiểm thử API</w:t>
+            </w:r>
+          </w:p>
+        </w:tc>
+        <w:tc>
+          <w:tcPr>
+            <w:tcW w:w="2944" w:type="dxa"/>
+            <w:tcBorders>
+              <w:top w:val="single" w:sz="4" w:space="0" w:color="auto"/>
+              <w:left w:val="single" w:sz="4" w:space="0" w:color="auto"/>
+              <w:bottom w:val="single" w:sz="4" w:space="0" w:color="auto"/>
+              <w:right w:val="single" w:sz="4" w:space="0" w:color="auto"/>
+            </w:tcBorders>
+          </w:tcPr>
+          <w:p>
+            <w:pPr>
+              <w:spacing w:after="160" w:line="278" w:lineRule="auto"/>
+              <w:rPr>
+                <w:lang w:val="vi-VN"/>
+              </w:rPr>
+            </w:pPr>
+            <w:r>
+              <w:rPr>
+                <w:lang w:val="vi-VN"/>
+              </w:rPr>
+              <w:t>- Dựa trên tài liệu mô tả đề tài, thực hiện phân tích chức năng quản lý</w:t>
+            </w:r>
+            <w:r>
+              <w:rPr>
+                <w:lang w:val="vi-VN"/>
+              </w:rPr>
+              <w:t xml:space="preserve"> khóa học</w:t>
+            </w:r>
+            <w:r>
+              <w:rPr>
+                <w:lang w:val="vi-VN"/>
+              </w:rPr>
+              <w:t>.</w:t>
+            </w:r>
+          </w:p>
+          <w:p>
+            <w:pPr>
+              <w:spacing w:after="160" w:line="278" w:lineRule="auto"/>
+              <w:rPr>
+                <w:lang w:val="vi-VN"/>
+              </w:rPr>
+            </w:pPr>
+            <w:r>
+              <w:rPr>
+                <w:lang w:val="vi-VN"/>
+              </w:rPr>
+              <w:t>- Sử dụng công cụ AI sinh màn hình dự kiến cho chức năng quản lý.</w:t>
+            </w:r>
+          </w:p>
+          <w:p>
+            <w:pPr>
+              <w:spacing w:after="160" w:line="278" w:lineRule="auto"/>
+              <w:rPr>
+                <w:lang w:val="vi-VN"/>
+              </w:rPr>
+            </w:pPr>
+            <w:r>
+              <w:rPr>
+                <w:lang w:val="vi-VN"/>
+              </w:rPr>
+              <w:t>- Sử dụng SSMS tạo database thực hiện cho chức năng.</w:t>
+            </w:r>
+          </w:p>
+          <w:p>
+            <w:pPr>
+              <w:spacing w:after="160" w:line="278" w:lineRule="auto"/>
+              <w:rPr>
+                <w:lang w:val="vi-VN"/>
+              </w:rPr>
+            </w:pPr>
+            <w:r>
+              <w:rPr>
+                <w:lang w:val="vi-VN"/>
+              </w:rPr>
+              <w:t>- Thực hiện code chức năng quản lý khóa học trên Visual Studio, thực hiện kiểm thử API trên Postman và bàn giao sản phẩm.</w:t>
+            </w:r>
+          </w:p>
+          <w:p>
+            <w:pPr>
+              <w:spacing w:after="160" w:line="278" w:lineRule="auto"/>
+              <w:rPr>
+                <w:lang w:val="vi-VN"/>
+              </w:rPr>
+            </w:pPr>
+            <w:r>
+              <w:rPr>
+                <w:lang w:val="vi-VN"/>
+              </w:rPr>
+              <w:t>- Báo cáo những thay đổi, tiếp nhận các đề xuất của cán bộ hướng dẫn với chức năng.</w:t>
+            </w:r>
+          </w:p>
+        </w:tc>
+        <w:tc>
+          <w:tcPr>
+            <w:tcW w:w="2944" w:type="dxa"/>
+            <w:tcBorders>
+              <w:top w:val="single" w:sz="4" w:space="0" w:color="auto"/>
+              <w:left w:val="single" w:sz="4" w:space="0" w:color="auto"/>
+              <w:bottom w:val="single" w:sz="4" w:space="0" w:color="auto"/>
+              <w:right w:val="single" w:sz="4" w:space="0" w:color="auto"/>
+            </w:tcBorders>
+          </w:tcPr>
+          <w:p>
+            <w:pPr>
+              <w:spacing w:after="160" w:line="278" w:lineRule="auto"/>
+              <w:rPr>
+                <w:lang w:val="vi-VN"/>
+              </w:rPr>
+            </w:pPr>
+            <w:r>
+              <w:rPr>
+                <w:lang w:val="vi-VN"/>
+              </w:rPr>
+              <w:t xml:space="preserve">- Hiểu được nghiệp vụ quản lý </w:t>
+            </w:r>
+            <w:r>
+              <w:rPr>
+                <w:lang w:val="vi-VN"/>
+              </w:rPr>
+              <w:t>khóa học</w:t>
+            </w:r>
+            <w:r>
+              <w:rPr>
+                <w:lang w:val="vi-VN"/>
+              </w:rPr>
+              <w:t>.</w:t>
+            </w:r>
+          </w:p>
+          <w:p>
+            <w:pPr>
+              <w:spacing w:after="160" w:line="278" w:lineRule="auto"/>
+              <w:rPr>
+                <w:lang w:val="vi-VN"/>
+              </w:rPr>
+            </w:pPr>
+            <w:r>
+              <w:rPr>
+                <w:lang w:val="vi-VN"/>
+              </w:rPr>
+              <w:t>- Rèn luyện việc sinh triển khai database dựa theo nghiệp vụ người dùng.</w:t>
+            </w:r>
+          </w:p>
+          <w:p>
+            <w:pPr>
+              <w:spacing w:after="160" w:line="278" w:lineRule="auto"/>
+              <w:rPr>
+                <w:lang w:val="vi-VN"/>
+              </w:rPr>
+            </w:pPr>
+            <w:r>
+              <w:rPr>
+                <w:lang w:val="vi-VN"/>
+              </w:rPr>
+              <w:t>- Rèn luyện việc trao đổi về nghiệp vụ để đảm bảo hiệu quả công việc</w:t>
+            </w:r>
+          </w:p>
+        </w:tc>
+      </w:tr>
+    </w:tbl>
+    <w:p>
+      <w:pPr>
+        <w:rPr>
+          <w:lang w:val="vi-VN"/>
+        </w:rPr>
+      </w:pPr>
       <w:r>
         <w:rPr>
           <w:lang w:val="vi-VN"/>
@@ -1338,6 +3542,341 @@
         <w:br w:type="page"/>
       </w:r>
     </w:p>
+    <w:p>
+      <w:pPr>
+        <w:rPr>
+          <w:lang w:val="vi-VN"/>
+        </w:rPr>
+      </w:pPr>
+      <w:r>
+        <w:rPr>
+          <w:lang w:val="vi-VN"/>
+        </w:rPr>
+        <w:lastRenderedPageBreak/>
+        <w:t>TUẦN 8 – THỰC HIỆN CHỨC NĂNG QUẢN LÝ LỊCH HỌC, TÌM HIỂU CÁC KIẾN THỨC ĐÓNG GÓI SẢN PHẨM BẰNG DOCKER VÀ QUY TRÌNH DEPLOY ỨNG DỤNG</w:t>
+      </w:r>
+    </w:p>
+    <w:tbl>
+      <w:tblPr>
+        <w:tblStyle w:val="TableGrid"/>
+        <w:tblW w:w="0" w:type="auto"/>
+        <w:tblLook w:val="04A0" w:firstRow="1" w:lastRow="0" w:firstColumn="1" w:lastColumn="0" w:noHBand="0" w:noVBand="1"/>
+      </w:tblPr>
+      <w:tblGrid>
+        <w:gridCol w:w="2944"/>
+        <w:gridCol w:w="2944"/>
+        <w:gridCol w:w="2944"/>
+      </w:tblGrid>
+      <w:tr>
+        <w:tc>
+          <w:tcPr>
+            <w:tcW w:w="2944" w:type="dxa"/>
+            <w:tcBorders>
+              <w:top w:val="single" w:sz="4" w:space="0" w:color="auto"/>
+              <w:left w:val="single" w:sz="4" w:space="0" w:color="auto"/>
+              <w:bottom w:val="single" w:sz="4" w:space="0" w:color="auto"/>
+              <w:right w:val="single" w:sz="4" w:space="0" w:color="auto"/>
+            </w:tcBorders>
+            <w:hideMark/>
+          </w:tcPr>
+          <w:p>
+            <w:pPr>
+              <w:spacing w:after="160" w:line="278" w:lineRule="auto"/>
+              <w:rPr>
+                <w:lang w:val="vi-VN"/>
+              </w:rPr>
+            </w:pPr>
+            <w:r>
+              <w:rPr>
+                <w:lang w:val="vi-VN"/>
+              </w:rPr>
+              <w:t>Nội dung công việc</w:t>
+            </w:r>
+          </w:p>
+        </w:tc>
+        <w:tc>
+          <w:tcPr>
+            <w:tcW w:w="2944" w:type="dxa"/>
+            <w:tcBorders>
+              <w:top w:val="single" w:sz="4" w:space="0" w:color="auto"/>
+              <w:left w:val="single" w:sz="4" w:space="0" w:color="auto"/>
+              <w:bottom w:val="single" w:sz="4" w:space="0" w:color="auto"/>
+              <w:right w:val="single" w:sz="4" w:space="0" w:color="auto"/>
+            </w:tcBorders>
+            <w:hideMark/>
+          </w:tcPr>
+          <w:p>
+            <w:pPr>
+              <w:spacing w:after="160" w:line="278" w:lineRule="auto"/>
+              <w:rPr>
+                <w:lang w:val="vi-VN"/>
+              </w:rPr>
+            </w:pPr>
+            <w:r>
+              <w:rPr>
+                <w:lang w:val="vi-VN"/>
+              </w:rPr>
+              <w:t>Phương pháp thực hiện</w:t>
+            </w:r>
+          </w:p>
+        </w:tc>
+        <w:tc>
+          <w:tcPr>
+            <w:tcW w:w="2944" w:type="dxa"/>
+            <w:tcBorders>
+              <w:top w:val="single" w:sz="4" w:space="0" w:color="auto"/>
+              <w:left w:val="single" w:sz="4" w:space="0" w:color="auto"/>
+              <w:bottom w:val="single" w:sz="4" w:space="0" w:color="auto"/>
+              <w:right w:val="single" w:sz="4" w:space="0" w:color="auto"/>
+            </w:tcBorders>
+            <w:hideMark/>
+          </w:tcPr>
+          <w:p>
+            <w:pPr>
+              <w:spacing w:after="160" w:line="278" w:lineRule="auto"/>
+              <w:rPr>
+                <w:lang w:val="vi-VN"/>
+              </w:rPr>
+            </w:pPr>
+            <w:r>
+              <w:rPr>
+                <w:lang w:val="vi-VN"/>
+              </w:rPr>
+              <w:t>Kết quả đạt được</w:t>
+            </w:r>
+          </w:p>
+        </w:tc>
+      </w:tr>
+      <w:tr>
+        <w:tc>
+          <w:tcPr>
+            <w:tcW w:w="2944" w:type="dxa"/>
+            <w:tcBorders>
+              <w:top w:val="single" w:sz="4" w:space="0" w:color="auto"/>
+              <w:left w:val="single" w:sz="4" w:space="0" w:color="auto"/>
+              <w:bottom w:val="single" w:sz="4" w:space="0" w:color="auto"/>
+              <w:right w:val="single" w:sz="4" w:space="0" w:color="auto"/>
+            </w:tcBorders>
+          </w:tcPr>
+          <w:p>
+            <w:pPr>
+              <w:rPr>
+                <w:lang w:val="vi-VN"/>
+              </w:rPr>
+            </w:pPr>
+            <w:r>
+              <w:rPr>
+                <w:lang w:val="vi-VN"/>
+              </w:rPr>
+              <w:t xml:space="preserve">- Thực hiện khảo sát nghiệp vụ, phân rã công việc của các tầng của chức năng quản lý </w:t>
+            </w:r>
+            <w:r>
+              <w:rPr>
+                <w:lang w:val="vi-VN"/>
+              </w:rPr>
+              <w:t>lịch học</w:t>
+            </w:r>
+            <w:r>
+              <w:rPr>
+                <w:lang w:val="vi-VN"/>
+              </w:rPr>
+              <w:t>.</w:t>
+            </w:r>
+          </w:p>
+          <w:p>
+            <w:pPr>
+              <w:rPr>
+                <w:lang w:val="vi-VN"/>
+              </w:rPr>
+            </w:pPr>
+            <w:r>
+              <w:rPr>
+                <w:lang w:val="vi-VN"/>
+              </w:rPr>
+              <w:t>- Dựng màn hình dự kiến cho chức năng</w:t>
+            </w:r>
+          </w:p>
+          <w:p>
+            <w:pPr>
+              <w:rPr>
+                <w:lang w:val="vi-VN"/>
+              </w:rPr>
+            </w:pPr>
+            <w:r>
+              <w:rPr>
+                <w:lang w:val="vi-VN"/>
+              </w:rPr>
+              <w:t xml:space="preserve">- Hoàn thiện chức năng quản lý </w:t>
+            </w:r>
+            <w:r>
+              <w:rPr>
+                <w:lang w:val="vi-VN"/>
+              </w:rPr>
+              <w:t>lịch học</w:t>
+            </w:r>
+          </w:p>
+          <w:p>
+            <w:pPr>
+              <w:rPr>
+                <w:lang w:val="vi-VN"/>
+              </w:rPr>
+            </w:pPr>
+            <w:r>
+              <w:rPr>
+                <w:lang w:val="vi-VN"/>
+              </w:rPr>
+              <w:t>- Thực hiện tìm hiểu quy trình đóng gói sản phẩm bằng docker, quy trình deploy và các môi trường deploy sản phẩm.</w:t>
+            </w:r>
+          </w:p>
+        </w:tc>
+        <w:tc>
+          <w:tcPr>
+            <w:tcW w:w="2944" w:type="dxa"/>
+            <w:tcBorders>
+              <w:top w:val="single" w:sz="4" w:space="0" w:color="auto"/>
+              <w:left w:val="single" w:sz="4" w:space="0" w:color="auto"/>
+              <w:bottom w:val="single" w:sz="4" w:space="0" w:color="auto"/>
+              <w:right w:val="single" w:sz="4" w:space="0" w:color="auto"/>
+            </w:tcBorders>
+          </w:tcPr>
+          <w:p>
+            <w:pPr>
+              <w:spacing w:after="160" w:line="278" w:lineRule="auto"/>
+              <w:rPr>
+                <w:lang w:val="vi-VN"/>
+              </w:rPr>
+            </w:pPr>
+            <w:r>
+              <w:rPr>
+                <w:lang w:val="vi-VN"/>
+              </w:rPr>
+              <w:t>- Dựa trên tài liệu mô tả đề tài, thực hiện phân tích chức năng quản lý</w:t>
+            </w:r>
+            <w:r>
+              <w:rPr>
+                <w:lang w:val="vi-VN"/>
+              </w:rPr>
+              <w:t xml:space="preserve"> lịch học</w:t>
+            </w:r>
+            <w:r>
+              <w:rPr>
+                <w:lang w:val="vi-VN"/>
+              </w:rPr>
+              <w:t>.</w:t>
+            </w:r>
+          </w:p>
+          <w:p>
+            <w:pPr>
+              <w:spacing w:after="160" w:line="278" w:lineRule="auto"/>
+              <w:rPr>
+                <w:lang w:val="vi-VN"/>
+              </w:rPr>
+            </w:pPr>
+            <w:r>
+              <w:rPr>
+                <w:lang w:val="vi-VN"/>
+              </w:rPr>
+              <w:t>- Sử dụng công cụ AI sinh màn hình dự kiến cho chức năng.</w:t>
+            </w:r>
+          </w:p>
+          <w:p>
+            <w:pPr>
+              <w:spacing w:after="160" w:line="278" w:lineRule="auto"/>
+              <w:rPr>
+                <w:lang w:val="vi-VN"/>
+              </w:rPr>
+            </w:pPr>
+            <w:r>
+              <w:rPr>
+                <w:lang w:val="vi-VN"/>
+              </w:rPr>
+              <w:t>- Sử dụng SSMS tạo database thực hiện cho chức năng.</w:t>
+            </w:r>
+          </w:p>
+          <w:p>
+            <w:pPr>
+              <w:spacing w:after="160" w:line="278" w:lineRule="auto"/>
+              <w:rPr>
+                <w:lang w:val="vi-VN"/>
+              </w:rPr>
+            </w:pPr>
+            <w:r>
+              <w:rPr>
+                <w:lang w:val="vi-VN"/>
+              </w:rPr>
+              <w:t>- Thực hiện code chức năng trên Visual Studio, thực hiện kiểm thử API trên Postman và bàn giao sản phẩm.</w:t>
+            </w:r>
+          </w:p>
+          <w:p>
+            <w:pPr>
+              <w:spacing w:after="160" w:line="278" w:lineRule="auto"/>
+              <w:rPr>
+                <w:lang w:val="vi-VN"/>
+              </w:rPr>
+            </w:pPr>
+            <w:r>
+              <w:rPr>
+                <w:lang w:val="vi-VN"/>
+              </w:rPr>
+              <w:t>- Báo cáo những thay đổi, tiếp nhận các đề xuất của cán bộ hướng dẫn với chức năng.</w:t>
+            </w:r>
+          </w:p>
+        </w:tc>
+        <w:tc>
+          <w:tcPr>
+            <w:tcW w:w="2944" w:type="dxa"/>
+            <w:tcBorders>
+              <w:top w:val="single" w:sz="4" w:space="0" w:color="auto"/>
+              <w:left w:val="single" w:sz="4" w:space="0" w:color="auto"/>
+              <w:bottom w:val="single" w:sz="4" w:space="0" w:color="auto"/>
+              <w:right w:val="single" w:sz="4" w:space="0" w:color="auto"/>
+            </w:tcBorders>
+          </w:tcPr>
+          <w:p>
+            <w:pPr>
+              <w:spacing w:after="160" w:line="278" w:lineRule="auto"/>
+              <w:rPr>
+                <w:lang w:val="vi-VN"/>
+              </w:rPr>
+            </w:pPr>
+            <w:r>
+              <w:rPr>
+                <w:lang w:val="vi-VN"/>
+              </w:rPr>
+              <w:t>- Hiểu được nghiệp vụ quản lý khóa học.</w:t>
+            </w:r>
+          </w:p>
+          <w:p>
+            <w:pPr>
+              <w:spacing w:after="160" w:line="278" w:lineRule="auto"/>
+              <w:rPr>
+                <w:lang w:val="vi-VN"/>
+              </w:rPr>
+            </w:pPr>
+            <w:r>
+              <w:rPr>
+                <w:lang w:val="vi-VN"/>
+              </w:rPr>
+              <w:t>- Rèn luyện việc sinh triển khai database dựa theo nghiệp vụ người dùng.</w:t>
+            </w:r>
+          </w:p>
+          <w:p>
+            <w:pPr>
+              <w:spacing w:after="160" w:line="278" w:lineRule="auto"/>
+              <w:rPr>
+                <w:lang w:val="vi-VN"/>
+              </w:rPr>
+            </w:pPr>
+            <w:r>
+              <w:rPr>
+                <w:lang w:val="vi-VN"/>
+              </w:rPr>
+              <w:t>- Rèn luyện việc trao đổi về nghiệp vụ để đảm bảo hiệu quả công việc</w:t>
+            </w:r>
+          </w:p>
+        </w:tc>
+      </w:tr>
+    </w:tbl>
     <w:p>
       <w:pPr>
         <w:rPr>
@@ -2045,7 +4584,7 @@
   <w:style w:type="paragraph" w:default="1" w:styleId="Normal">
     <w:name w:val="Normal"/>
     <w:qFormat/>
-    <w:rsid w:val="001B6BA0"/>
+    <w:rsid w:val="00F1007A"/>
     <w:pPr>
       <w:jc w:val="both"/>
     </w:pPr>
@@ -2264,7 +4803,6 @@
   <w:style w:type="character" w:default="1" w:styleId="DefaultParagraphFont">
     <w:name w:val="Default Paragraph Font"/>
     <w:uiPriority w:val="1"/>
-    <w:semiHidden/>
     <w:unhideWhenUsed/>
   </w:style>
   <w:style w:type="table" w:default="1" w:styleId="TableNormal">

</xml_diff>

<commit_message>
feat(cert)#001: change layout and add cert function
</commit_message>
<xml_diff>
--- a/Document/Báo cáo thực tập.docx
+++ b/Document/Báo cáo thực tập.docx
@@ -85,7 +85,7 @@
           <w:noProof/>
         </w:rPr>
         <w:drawing>
-          <wp:inline distT="0" distB="0" distL="0" distR="0" wp14:anchorId="02E99A49" wp14:editId="45B82495">
+          <wp:inline distT="0" distB="0" distL="0" distR="0" wp14:anchorId="02E99A49" wp14:editId="68A0F12C">
             <wp:extent cx="2857500" cy="2000250"/>
             <wp:effectExtent l="0" t="0" r="0" b="0"/>
             <wp:docPr id="227165499" name="Picture 1" descr="Trường Đại học Kinh tế Tài chính TPHCM (Đại học UEF): Logo UEF - Logo ..."/>
@@ -402,7 +402,7 @@
           <w:noProof/>
         </w:rPr>
         <w:drawing>
-          <wp:inline distT="0" distB="0" distL="0" distR="0" wp14:anchorId="64D56510" wp14:editId="5A7B42A2">
+          <wp:inline distT="0" distB="0" distL="0" distR="0" wp14:anchorId="64D56510" wp14:editId="167D8696">
             <wp:extent cx="2352675" cy="1646873"/>
             <wp:effectExtent l="0" t="0" r="0" b="0"/>
             <wp:docPr id="1420072903" name="Picture 1" descr="Trường Đại học Kinh tế Tài chính TPHCM (Đại học UEF): Logo UEF - Logo ..."/>
@@ -3217,11 +3217,15 @@
     <w:p>
       <w:pPr>
         <w:rPr>
-          <w:lang w:val="vi-VN"/>
-        </w:rPr>
-      </w:pPr>
-      <w:r>
-        <w:rPr>
+          <w:b/>
+          <w:bCs/>
+          <w:lang w:val="vi-VN"/>
+        </w:rPr>
+      </w:pPr>
+      <w:r>
+        <w:rPr>
+          <w:b/>
+          <w:bCs/>
           <w:lang w:val="vi-VN"/>
         </w:rPr>
         <w:t xml:space="preserve">TUẦN 7 – THỰC HIỆN CHỨC NĂNG QUẢN LÝ KHÓA HỌC </w:t>
@@ -3390,19 +3394,7 @@
               <w:rPr>
                 <w:lang w:val="vi-VN"/>
               </w:rPr>
-              <w:t>- Dựa trên tài liệu mô tả đề tài, thực hiện phân tích chức năng quản lý</w:t>
-            </w:r>
-            <w:r>
-              <w:rPr>
-                <w:lang w:val="vi-VN"/>
-              </w:rPr>
-              <w:t xml:space="preserve"> khóa học</w:t>
-            </w:r>
-            <w:r>
-              <w:rPr>
-                <w:lang w:val="vi-VN"/>
-              </w:rPr>
-              <w:t>.</w:t>
+              <w:t>- Dựa trên tài liệu mô tả đề tài, thực hiện phân tích chức năng quản lý khóa học.</w:t>
             </w:r>
           </w:p>
           <w:p>
@@ -3483,19 +3475,7 @@
               <w:rPr>
                 <w:lang w:val="vi-VN"/>
               </w:rPr>
-              <w:t xml:space="preserve">- Hiểu được nghiệp vụ quản lý </w:t>
-            </w:r>
-            <w:r>
-              <w:rPr>
-                <w:lang w:val="vi-VN"/>
-              </w:rPr>
-              <w:t>khóa học</w:t>
-            </w:r>
-            <w:r>
-              <w:rPr>
-                <w:lang w:val="vi-VN"/>
-              </w:rPr>
-              <w:t>.</w:t>
+              <w:t>- Hiểu được nghiệp vụ quản lý khóa học.</w:t>
             </w:r>
           </w:p>
           <w:p>
@@ -3545,11 +3525,15 @@
     <w:p>
       <w:pPr>
         <w:rPr>
-          <w:lang w:val="vi-VN"/>
-        </w:rPr>
-      </w:pPr>
-      <w:r>
-        <w:rPr>
+          <w:b/>
+          <w:bCs/>
+          <w:lang w:val="vi-VN"/>
+        </w:rPr>
+      </w:pPr>
+      <w:r>
+        <w:rPr>
+          <w:b/>
+          <w:bCs/>
           <w:lang w:val="vi-VN"/>
         </w:rPr>
         <w:lastRenderedPageBreak/>
@@ -3668,19 +3652,7 @@
               <w:rPr>
                 <w:lang w:val="vi-VN"/>
               </w:rPr>
-              <w:t xml:space="preserve">- Thực hiện khảo sát nghiệp vụ, phân rã công việc của các tầng của chức năng quản lý </w:t>
-            </w:r>
-            <w:r>
-              <w:rPr>
-                <w:lang w:val="vi-VN"/>
-              </w:rPr>
-              <w:t>lịch học</w:t>
-            </w:r>
-            <w:r>
-              <w:rPr>
-                <w:lang w:val="vi-VN"/>
-              </w:rPr>
-              <w:t>.</w:t>
+              <w:t>- Thực hiện khảo sát nghiệp vụ, phân rã công việc của các tầng của chức năng quản lý lịch học.</w:t>
             </w:r>
           </w:p>
           <w:p>
@@ -3694,25 +3666,6 @@
                 <w:lang w:val="vi-VN"/>
               </w:rPr>
               <w:t>- Dựng màn hình dự kiến cho chức năng</w:t>
-            </w:r>
-          </w:p>
-          <w:p>
-            <w:pPr>
-              <w:rPr>
-                <w:lang w:val="vi-VN"/>
-              </w:rPr>
-            </w:pPr>
-            <w:r>
-              <w:rPr>
-                <w:lang w:val="vi-VN"/>
-              </w:rPr>
-              <w:t xml:space="preserve">- Hoàn thiện chức năng quản lý </w:t>
-            </w:r>
-            <w:r>
-              <w:rPr>
-                <w:lang w:val="vi-VN"/>
-              </w:rPr>
-              <w:t>lịch học</w:t>
             </w:r>
           </w:p>
           <w:p>
@@ -3750,19 +3703,7 @@
               <w:rPr>
                 <w:lang w:val="vi-VN"/>
               </w:rPr>
-              <w:t>- Dựa trên tài liệu mô tả đề tài, thực hiện phân tích chức năng quản lý</w:t>
-            </w:r>
-            <w:r>
-              <w:rPr>
-                <w:lang w:val="vi-VN"/>
-              </w:rPr>
-              <w:t xml:space="preserve"> lịch học</w:t>
-            </w:r>
-            <w:r>
-              <w:rPr>
-                <w:lang w:val="vi-VN"/>
-              </w:rPr>
-              <w:t>.</w:t>
+              <w:t>- Dựa trên tài liệu mô tả đề tài, thực hiện phân tích chức năng quản lý lịch học.</w:t>
             </w:r>
           </w:p>
           <w:p>
@@ -3877,6 +3818,2746 @@
         </w:tc>
       </w:tr>
     </w:tbl>
+    <w:p/>
+    <w:p>
+      <w:pPr>
+        <w:rPr>
+          <w:b/>
+          <w:bCs/>
+          <w:lang w:val="vi-VN"/>
+        </w:rPr>
+      </w:pPr>
+      <w:r>
+        <w:rPr>
+          <w:b/>
+          <w:bCs/>
+          <w:lang w:val="vi-VN"/>
+        </w:rPr>
+        <w:t xml:space="preserve">TUẦN </w:t>
+      </w:r>
+      <w:r>
+        <w:rPr>
+          <w:b/>
+          <w:bCs/>
+        </w:rPr>
+        <w:t xml:space="preserve">9 </w:t>
+      </w:r>
+      <w:r>
+        <w:rPr>
+          <w:b/>
+          <w:bCs/>
+          <w:lang w:val="vi-VN"/>
+        </w:rPr>
+        <w:t xml:space="preserve"> – </w:t>
+      </w:r>
+      <w:r>
+        <w:rPr>
+          <w:b/>
+          <w:bCs/>
+          <w:lang w:val="vi-VN"/>
+        </w:rPr>
+        <w:t>HOÀN THÀNH CHỨC NĂNG QUẢN LÝ</w:t>
+      </w:r>
+      <w:r>
+        <w:rPr>
+          <w:b/>
+          <w:bCs/>
+          <w:lang w:val="vi-VN"/>
+        </w:rPr>
+        <w:t xml:space="preserve"> BUỔI THỰC HÀNH</w:t>
+      </w:r>
+    </w:p>
+    <w:tbl>
+      <w:tblPr>
+        <w:tblStyle w:val="TableGrid"/>
+        <w:tblW w:w="0" w:type="auto"/>
+        <w:tblLook w:val="04A0" w:firstRow="1" w:lastRow="0" w:firstColumn="1" w:lastColumn="0" w:noHBand="0" w:noVBand="1"/>
+      </w:tblPr>
+      <w:tblGrid>
+        <w:gridCol w:w="2944"/>
+        <w:gridCol w:w="2944"/>
+        <w:gridCol w:w="2944"/>
+      </w:tblGrid>
+      <w:tr>
+        <w:tc>
+          <w:tcPr>
+            <w:tcW w:w="2944" w:type="dxa"/>
+            <w:tcBorders>
+              <w:top w:val="single" w:sz="4" w:space="0" w:color="auto"/>
+              <w:left w:val="single" w:sz="4" w:space="0" w:color="auto"/>
+              <w:bottom w:val="single" w:sz="4" w:space="0" w:color="auto"/>
+              <w:right w:val="single" w:sz="4" w:space="0" w:color="auto"/>
+            </w:tcBorders>
+            <w:hideMark/>
+          </w:tcPr>
+          <w:p>
+            <w:pPr>
+              <w:spacing w:after="160" w:line="278" w:lineRule="auto"/>
+              <w:rPr>
+                <w:lang w:val="vi-VN"/>
+              </w:rPr>
+            </w:pPr>
+            <w:r>
+              <w:rPr>
+                <w:lang w:val="vi-VN"/>
+              </w:rPr>
+              <w:t>Nội dung công việc</w:t>
+            </w:r>
+          </w:p>
+        </w:tc>
+        <w:tc>
+          <w:tcPr>
+            <w:tcW w:w="2944" w:type="dxa"/>
+            <w:tcBorders>
+              <w:top w:val="single" w:sz="4" w:space="0" w:color="auto"/>
+              <w:left w:val="single" w:sz="4" w:space="0" w:color="auto"/>
+              <w:bottom w:val="single" w:sz="4" w:space="0" w:color="auto"/>
+              <w:right w:val="single" w:sz="4" w:space="0" w:color="auto"/>
+            </w:tcBorders>
+            <w:hideMark/>
+          </w:tcPr>
+          <w:p>
+            <w:pPr>
+              <w:spacing w:after="160" w:line="278" w:lineRule="auto"/>
+              <w:rPr>
+                <w:lang w:val="vi-VN"/>
+              </w:rPr>
+            </w:pPr>
+            <w:r>
+              <w:rPr>
+                <w:lang w:val="vi-VN"/>
+              </w:rPr>
+              <w:t>Phương pháp thực hiện</w:t>
+            </w:r>
+          </w:p>
+        </w:tc>
+        <w:tc>
+          <w:tcPr>
+            <w:tcW w:w="2944" w:type="dxa"/>
+            <w:tcBorders>
+              <w:top w:val="single" w:sz="4" w:space="0" w:color="auto"/>
+              <w:left w:val="single" w:sz="4" w:space="0" w:color="auto"/>
+              <w:bottom w:val="single" w:sz="4" w:space="0" w:color="auto"/>
+              <w:right w:val="single" w:sz="4" w:space="0" w:color="auto"/>
+            </w:tcBorders>
+            <w:hideMark/>
+          </w:tcPr>
+          <w:p>
+            <w:pPr>
+              <w:spacing w:after="160" w:line="278" w:lineRule="auto"/>
+              <w:rPr>
+                <w:lang w:val="vi-VN"/>
+              </w:rPr>
+            </w:pPr>
+            <w:r>
+              <w:rPr>
+                <w:lang w:val="vi-VN"/>
+              </w:rPr>
+              <w:t>Kết quả đạt được</w:t>
+            </w:r>
+          </w:p>
+        </w:tc>
+      </w:tr>
+      <w:tr>
+        <w:tc>
+          <w:tcPr>
+            <w:tcW w:w="2944" w:type="dxa"/>
+            <w:tcBorders>
+              <w:top w:val="single" w:sz="4" w:space="0" w:color="auto"/>
+              <w:left w:val="single" w:sz="4" w:space="0" w:color="auto"/>
+              <w:bottom w:val="single" w:sz="4" w:space="0" w:color="auto"/>
+              <w:right w:val="single" w:sz="4" w:space="0" w:color="auto"/>
+            </w:tcBorders>
+          </w:tcPr>
+          <w:p>
+            <w:pPr>
+              <w:rPr>
+                <w:lang w:val="vi-VN"/>
+              </w:rPr>
+            </w:pPr>
+            <w:r>
+              <w:rPr>
+                <w:lang w:val="vi-VN"/>
+              </w:rPr>
+              <w:t>-</w:t>
+            </w:r>
+            <w:r>
+              <w:rPr>
+                <w:lang w:val="vi-VN"/>
+              </w:rPr>
+              <w:t xml:space="preserve"> </w:t>
+            </w:r>
+            <w:r>
+              <w:t>Khảo sát nghiệp vụ, phân rã API cho chức năng quản lý buổi thực hành</w:t>
+            </w:r>
+            <w:r>
+              <w:rPr>
+                <w:lang w:val="vi-VN"/>
+              </w:rPr>
+              <w:t>.</w:t>
+            </w:r>
+          </w:p>
+          <w:p>
+            <w:pPr>
+              <w:rPr>
+                <w:lang w:val="vi-VN"/>
+              </w:rPr>
+            </w:pPr>
+            <w:r>
+              <w:rPr>
+                <w:lang w:val="vi-VN"/>
+              </w:rPr>
+              <w:t>- Dựng màn hình dự kiến cho chức năng.</w:t>
+            </w:r>
+          </w:p>
+          <w:p>
+            <w:pPr>
+              <w:rPr>
+                <w:lang w:val="vi-VN"/>
+              </w:rPr>
+            </w:pPr>
+            <w:r>
+              <w:rPr>
+                <w:lang w:val="vi-VN"/>
+              </w:rPr>
+              <w:t>- Hoàn thiện chức năng quản lý thực hành.</w:t>
+            </w:r>
+          </w:p>
+          <w:p>
+            <w:pPr>
+              <w:rPr>
+                <w:lang w:val="vi-VN"/>
+              </w:rPr>
+            </w:pPr>
+            <w:r>
+              <w:rPr>
+                <w:lang w:val="vi-VN"/>
+              </w:rPr>
+              <w:lastRenderedPageBreak/>
+              <w:t>- Fix bug, sửa lỗi tính năng.</w:t>
+            </w:r>
+          </w:p>
+          <w:p>
+            <w:pPr>
+              <w:rPr>
+                <w:lang w:val="vi-VN"/>
+              </w:rPr>
+            </w:pPr>
+          </w:p>
+        </w:tc>
+        <w:tc>
+          <w:tcPr>
+            <w:tcW w:w="2944" w:type="dxa"/>
+            <w:tcBorders>
+              <w:top w:val="single" w:sz="4" w:space="0" w:color="auto"/>
+              <w:left w:val="single" w:sz="4" w:space="0" w:color="auto"/>
+              <w:bottom w:val="single" w:sz="4" w:space="0" w:color="auto"/>
+              <w:right w:val="single" w:sz="4" w:space="0" w:color="auto"/>
+            </w:tcBorders>
+          </w:tcPr>
+          <w:p>
+            <w:pPr>
+              <w:rPr>
+                <w:lang w:val="vi-VN"/>
+              </w:rPr>
+            </w:pPr>
+            <w:r>
+              <w:rPr>
+                <w:lang w:val="vi-VN"/>
+              </w:rPr>
+              <w:lastRenderedPageBreak/>
+              <w:t>-</w:t>
+            </w:r>
+            <w:r>
+              <w:rPr>
+                <w:lang w:val="vi-VN"/>
+              </w:rPr>
+              <w:t xml:space="preserve"> </w:t>
+            </w:r>
+            <w:r>
+              <w:rPr>
+                <w:lang w:val="vi-VN"/>
+              </w:rPr>
+              <w:t>Nghiên cứu tài liệu mô tả, trao đổi với cán bộ quản lý để xác định các nghiệp vụ chính (tạo, sửa, xoá, xem buổi thực hành).</w:t>
+            </w:r>
+          </w:p>
+          <w:p>
+            <w:pPr>
+              <w:rPr>
+                <w:lang w:val="vi-VN"/>
+              </w:rPr>
+            </w:pPr>
+            <w:r>
+              <w:rPr>
+                <w:lang w:val="vi-VN"/>
+              </w:rPr>
+              <w:t xml:space="preserve">- </w:t>
+            </w:r>
+            <w:r>
+              <w:t>Phân rã thành các endpoint RESTful.</w:t>
+            </w:r>
+          </w:p>
+          <w:p>
+            <w:pPr>
+              <w:rPr>
+                <w:lang w:val="vi-VN"/>
+              </w:rPr>
+            </w:pPr>
+            <w:r>
+              <w:rPr>
+                <w:lang w:val="vi-VN"/>
+              </w:rPr>
+              <w:lastRenderedPageBreak/>
+              <w:t xml:space="preserve">- </w:t>
+            </w:r>
+            <w:r>
+              <w:rPr>
+                <w:lang w:val="vi-VN"/>
+              </w:rPr>
+              <w:t>Sử dụng công cụ AI (ví dụ: ChatGPT, Claude, Figma với plugin AI) để thiết kế giao diện dạng bảng, form nhập liệu, bộ lọc tìm kiếm.</w:t>
+            </w:r>
+          </w:p>
+          <w:p>
+            <w:pPr>
+              <w:rPr>
+                <w:lang w:val="vi-VN"/>
+              </w:rPr>
+            </w:pPr>
+            <w:r>
+              <w:rPr>
+                <w:lang w:val="vi-VN"/>
+              </w:rPr>
+              <w:t xml:space="preserve">- </w:t>
+            </w:r>
+            <w:r>
+              <w:t>Lập trình trên Visual Studio (</w:t>
+            </w:r>
+            <w:hyperlink r:id="rId9" w:tgtFrame="_blank" w:history="1">
+              <w:r>
+                <w:rPr>
+                  <w:rStyle w:val="Hyperlink"/>
+                </w:rPr>
+                <w:t>ASP.NET</w:t>
+              </w:r>
+            </w:hyperlink>
+            <w:r>
+              <w:t> Core hoặc tương tự). Viết API, kết nối database. Kiểm thử API bằng Swagger và Postman.</w:t>
+            </w:r>
+            <w:r>
+              <w:rPr>
+                <w:lang w:val="vi-VN"/>
+              </w:rPr>
+              <w:t xml:space="preserve"> </w:t>
+            </w:r>
+          </w:p>
+          <w:p>
+            <w:pPr>
+              <w:rPr>
+                <w:lang w:val="vi-VN"/>
+              </w:rPr>
+            </w:pPr>
+            <w:r>
+              <w:rPr>
+                <w:lang w:val="vi-VN"/>
+              </w:rPr>
+              <w:t xml:space="preserve">- </w:t>
+            </w:r>
+            <w:r>
+              <w:rPr>
+                <w:lang w:val="vi-VN"/>
+              </w:rPr>
+              <w:t xml:space="preserve">Kiểm thử toàn diện trên màn hình, ghi nhận lỗi (validate dữ liệu, xử lý ngoại lệ, giao diện). </w:t>
+            </w:r>
+            <w:r>
+              <w:t>Dùng debugger và log để sửa.</w:t>
+            </w:r>
+          </w:p>
+        </w:tc>
+        <w:tc>
+          <w:tcPr>
+            <w:tcW w:w="2944" w:type="dxa"/>
+            <w:tcBorders>
+              <w:top w:val="single" w:sz="4" w:space="0" w:color="auto"/>
+              <w:left w:val="single" w:sz="4" w:space="0" w:color="auto"/>
+              <w:bottom w:val="single" w:sz="4" w:space="0" w:color="auto"/>
+              <w:right w:val="single" w:sz="4" w:space="0" w:color="auto"/>
+            </w:tcBorders>
+          </w:tcPr>
+          <w:p>
+            <w:pPr>
+              <w:spacing w:after="160" w:line="278" w:lineRule="auto"/>
+              <w:rPr>
+                <w:lang w:val="vi-VN"/>
+              </w:rPr>
+            </w:pPr>
+            <w:r>
+              <w:rPr>
+                <w:lang w:val="vi-VN"/>
+              </w:rPr>
+              <w:lastRenderedPageBreak/>
+              <w:t xml:space="preserve">- </w:t>
+            </w:r>
+            <w:r>
+              <w:rPr>
+                <w:lang w:val="vi-VN"/>
+              </w:rPr>
+              <w:t>Hiểu rõ quy trình nghiệp vụ quản lý thực hành; xây dựng được danh sách API logic, rõ ràng.</w:t>
+            </w:r>
+          </w:p>
+          <w:p>
+            <w:pPr>
+              <w:spacing w:after="160" w:line="278" w:lineRule="auto"/>
+              <w:rPr>
+                <w:lang w:val="vi-VN"/>
+              </w:rPr>
+            </w:pPr>
+            <w:r>
+              <w:rPr>
+                <w:lang w:val="vi-VN"/>
+              </w:rPr>
+              <w:t xml:space="preserve">- </w:t>
+            </w:r>
+            <w:r>
+              <w:rPr>
+                <w:lang w:val="vi-VN"/>
+              </w:rPr>
+              <w:t xml:space="preserve">Có bản thiết kế màn hình trực quan, hỗ trợ trao đổi </w:t>
+            </w:r>
+            <w:r>
+              <w:rPr>
+                <w:lang w:val="vi-VN"/>
+              </w:rPr>
+              <w:lastRenderedPageBreak/>
+              <w:t>với người dùng và lập trình viên</w:t>
+            </w:r>
+            <w:r>
+              <w:rPr>
+                <w:lang w:val="vi-VN"/>
+              </w:rPr>
+              <w:t>.</w:t>
+            </w:r>
+          </w:p>
+          <w:p>
+            <w:pPr>
+              <w:spacing w:after="160" w:line="278" w:lineRule="auto"/>
+              <w:rPr>
+                <w:lang w:val="vi-VN"/>
+              </w:rPr>
+            </w:pPr>
+            <w:r>
+              <w:rPr>
+                <w:lang w:val="vi-VN"/>
+              </w:rPr>
+              <w:t xml:space="preserve">- </w:t>
+            </w:r>
+            <w:r>
+              <w:rPr>
+                <w:lang w:val="vi-VN"/>
+              </w:rPr>
+              <w:t>Chức năng hoạt động cơ bản (CRUD buổi thực hành). Rèn luyện kỹ năng triển khai thêm bảng dựa trên nghiệp vụ.</w:t>
+            </w:r>
+          </w:p>
+          <w:p>
+            <w:pPr>
+              <w:spacing w:after="160" w:line="278" w:lineRule="auto"/>
+              <w:rPr>
+                <w:lang w:val="vi-VN"/>
+              </w:rPr>
+            </w:pPr>
+            <w:r>
+              <w:rPr>
+                <w:lang w:val="vi-VN"/>
+              </w:rPr>
+              <w:t xml:space="preserve">- </w:t>
+            </w:r>
+            <w:r>
+              <w:rPr>
+                <w:lang w:val="vi-VN"/>
+              </w:rPr>
+              <w:t>Hệ thống ổn định, ít lỗi phát sinh. Rèn luyện kỹ năng trao đổi với cán bộ quản lý để đảm bảo hiệu quả công việc và đáp ứng đúng nghiệp vụ.</w:t>
+            </w:r>
+          </w:p>
+        </w:tc>
+      </w:tr>
+    </w:tbl>
+    <w:p>
+      <w:pPr>
+        <w:rPr>
+          <w:lang w:val="vi-VN"/>
+        </w:rPr>
+      </w:pPr>
+    </w:p>
+    <w:p>
+      <w:pPr>
+        <w:rPr>
+          <w:b/>
+          <w:bCs/>
+          <w:lang w:val="vi-VN"/>
+        </w:rPr>
+      </w:pPr>
+      <w:r>
+        <w:rPr>
+          <w:b/>
+          <w:bCs/>
+          <w:lang w:val="vi-VN"/>
+        </w:rPr>
+        <w:t>TUẦN 10 – PHÂN TÍCH YÊU CẦU/ CHỨC NĂNG QUẢN LÝ BÀI THU HOẠCH</w:t>
+      </w:r>
+    </w:p>
+    <w:tbl>
+      <w:tblPr>
+        <w:tblStyle w:val="TableGrid"/>
+        <w:tblW w:w="0" w:type="auto"/>
+        <w:tblLook w:val="04A0" w:firstRow="1" w:lastRow="0" w:firstColumn="1" w:lastColumn="0" w:noHBand="0" w:noVBand="1"/>
+      </w:tblPr>
+      <w:tblGrid>
+        <w:gridCol w:w="2944"/>
+        <w:gridCol w:w="2944"/>
+        <w:gridCol w:w="2944"/>
+      </w:tblGrid>
+      <w:tr>
+        <w:tc>
+          <w:tcPr>
+            <w:tcW w:w="2944" w:type="dxa"/>
+            <w:tcBorders>
+              <w:top w:val="single" w:sz="4" w:space="0" w:color="auto"/>
+              <w:left w:val="single" w:sz="4" w:space="0" w:color="auto"/>
+              <w:bottom w:val="single" w:sz="4" w:space="0" w:color="auto"/>
+              <w:right w:val="single" w:sz="4" w:space="0" w:color="auto"/>
+            </w:tcBorders>
+            <w:hideMark/>
+          </w:tcPr>
+          <w:p>
+            <w:pPr>
+              <w:spacing w:after="160" w:line="278" w:lineRule="auto"/>
+              <w:rPr>
+                <w:lang w:val="vi-VN"/>
+              </w:rPr>
+            </w:pPr>
+            <w:r>
+              <w:rPr>
+                <w:lang w:val="vi-VN"/>
+              </w:rPr>
+              <w:t>Nội dung công việc</w:t>
+            </w:r>
+          </w:p>
+        </w:tc>
+        <w:tc>
+          <w:tcPr>
+            <w:tcW w:w="2944" w:type="dxa"/>
+            <w:tcBorders>
+              <w:top w:val="single" w:sz="4" w:space="0" w:color="auto"/>
+              <w:left w:val="single" w:sz="4" w:space="0" w:color="auto"/>
+              <w:bottom w:val="single" w:sz="4" w:space="0" w:color="auto"/>
+              <w:right w:val="single" w:sz="4" w:space="0" w:color="auto"/>
+            </w:tcBorders>
+            <w:hideMark/>
+          </w:tcPr>
+          <w:p>
+            <w:pPr>
+              <w:spacing w:after="160" w:line="278" w:lineRule="auto"/>
+              <w:rPr>
+                <w:lang w:val="vi-VN"/>
+              </w:rPr>
+            </w:pPr>
+            <w:r>
+              <w:rPr>
+                <w:lang w:val="vi-VN"/>
+              </w:rPr>
+              <w:t>Phương pháp thực hiện</w:t>
+            </w:r>
+          </w:p>
+        </w:tc>
+        <w:tc>
+          <w:tcPr>
+            <w:tcW w:w="2944" w:type="dxa"/>
+            <w:tcBorders>
+              <w:top w:val="single" w:sz="4" w:space="0" w:color="auto"/>
+              <w:left w:val="single" w:sz="4" w:space="0" w:color="auto"/>
+              <w:bottom w:val="single" w:sz="4" w:space="0" w:color="auto"/>
+              <w:right w:val="single" w:sz="4" w:space="0" w:color="auto"/>
+            </w:tcBorders>
+            <w:hideMark/>
+          </w:tcPr>
+          <w:p>
+            <w:pPr>
+              <w:spacing w:after="160" w:line="278" w:lineRule="auto"/>
+              <w:rPr>
+                <w:lang w:val="vi-VN"/>
+              </w:rPr>
+            </w:pPr>
+            <w:r>
+              <w:rPr>
+                <w:lang w:val="vi-VN"/>
+              </w:rPr>
+              <w:t>Kết quả đạt được</w:t>
+            </w:r>
+          </w:p>
+        </w:tc>
+      </w:tr>
+      <w:tr>
+        <w:tc>
+          <w:tcPr>
+            <w:tcW w:w="2944" w:type="dxa"/>
+            <w:tcBorders>
+              <w:top w:val="single" w:sz="4" w:space="0" w:color="auto"/>
+              <w:left w:val="single" w:sz="4" w:space="0" w:color="auto"/>
+              <w:bottom w:val="single" w:sz="4" w:space="0" w:color="auto"/>
+              <w:right w:val="single" w:sz="4" w:space="0" w:color="auto"/>
+            </w:tcBorders>
+          </w:tcPr>
+          <w:p>
+            <w:pPr>
+              <w:rPr>
+                <w:lang w:val="vi-VN"/>
+              </w:rPr>
+            </w:pPr>
+            <w:r>
+              <w:rPr>
+                <w:lang w:val="vi-VN"/>
+              </w:rPr>
+              <w:t>-</w:t>
+            </w:r>
+            <w:r>
+              <w:rPr>
+                <w:lang w:val="vi-VN"/>
+              </w:rPr>
+              <w:t xml:space="preserve"> </w:t>
+            </w:r>
+            <w:r>
+              <w:t>Khảo sát chức năng quản lý bài thu hoạch</w:t>
+            </w:r>
+            <w:r>
+              <w:rPr>
+                <w:lang w:val="vi-VN"/>
+              </w:rPr>
+              <w:t>.</w:t>
+            </w:r>
+          </w:p>
+          <w:p>
+            <w:pPr>
+              <w:rPr>
+                <w:lang w:val="vi-VN"/>
+              </w:rPr>
+            </w:pPr>
+            <w:r>
+              <w:rPr>
+                <w:lang w:val="vi-VN"/>
+              </w:rPr>
+              <w:t xml:space="preserve">- </w:t>
+            </w:r>
+            <w:r>
+              <w:rPr>
+                <w:lang w:val="vi-VN"/>
+              </w:rPr>
+              <w:t>Nghiên cứu trình tự luồng hoạt động của chức năng quản lý bài thu hoạch, hoạt động thực hiện bài thu hoạch</w:t>
+            </w:r>
+            <w:r>
+              <w:rPr>
+                <w:lang w:val="vi-VN"/>
+              </w:rPr>
+              <w:t>.</w:t>
+            </w:r>
+          </w:p>
+          <w:p>
+            <w:pPr>
+              <w:rPr>
+                <w:lang w:val="vi-VN"/>
+              </w:rPr>
+            </w:pPr>
+            <w:r>
+              <w:rPr>
+                <w:lang w:val="vi-VN"/>
+              </w:rPr>
+              <w:t xml:space="preserve">- </w:t>
+            </w:r>
+            <w:r>
+              <w:rPr>
+                <w:lang w:val="vi-VN"/>
+              </w:rPr>
+              <w:t>Dựng màn hình dự kiến cho chức năng quản lý bài thu hoạch.</w:t>
+            </w:r>
+          </w:p>
+          <w:p>
+            <w:pPr>
+              <w:rPr>
+                <w:lang w:val="vi-VN"/>
+              </w:rPr>
+            </w:pPr>
+            <w:r>
+              <w:rPr>
+                <w:lang w:val="vi-VN"/>
+              </w:rPr>
+              <w:t xml:space="preserve">- Thiết kế API, màn hình cho chức năng quản lý bài thu </w:t>
+            </w:r>
+            <w:r>
+              <w:rPr>
+                <w:lang w:val="vi-VN"/>
+              </w:rPr>
+              <w:t>hoạch.</w:t>
+            </w:r>
+          </w:p>
+          <w:p>
+            <w:pPr>
+              <w:rPr>
+                <w:lang w:val="vi-VN"/>
+              </w:rPr>
+            </w:pPr>
+            <w:r>
+              <w:rPr>
+                <w:lang w:val="vi-VN"/>
+              </w:rPr>
+              <w:t xml:space="preserve">- </w:t>
+            </w:r>
+            <w:r>
+              <w:rPr>
+                <w:lang w:val="vi-VN"/>
+              </w:rPr>
+              <w:t xml:space="preserve">Thu thập ý kiến của cán bộ hướng dẫn trong quá trình thực </w:t>
+            </w:r>
+            <w:r>
+              <w:rPr>
+                <w:lang w:val="vi-VN"/>
+              </w:rPr>
+              <w:t>hiện.</w:t>
+            </w:r>
+          </w:p>
+        </w:tc>
+        <w:tc>
+          <w:tcPr>
+            <w:tcW w:w="2944" w:type="dxa"/>
+            <w:tcBorders>
+              <w:top w:val="single" w:sz="4" w:space="0" w:color="auto"/>
+              <w:left w:val="single" w:sz="4" w:space="0" w:color="auto"/>
+              <w:bottom w:val="single" w:sz="4" w:space="0" w:color="auto"/>
+              <w:right w:val="single" w:sz="4" w:space="0" w:color="auto"/>
+            </w:tcBorders>
+          </w:tcPr>
+          <w:p>
+            <w:pPr>
+              <w:rPr>
+                <w:lang w:val="vi-VN"/>
+              </w:rPr>
+            </w:pPr>
+            <w:r>
+              <w:rPr>
+                <w:lang w:val="vi-VN"/>
+              </w:rPr>
+              <w:t xml:space="preserve">- </w:t>
+            </w:r>
+            <w:r>
+              <w:rPr>
+                <w:lang w:val="vi-VN"/>
+              </w:rPr>
+              <w:t>Dựa trên tài liệu mô tả, trao đổi trực tiếp với cán bộ hướng dẫn để xác định các nghiệp vụ chính: nộp bài, chấm điểm, xem kết quả.</w:t>
+            </w:r>
+          </w:p>
+          <w:p>
+            <w:pPr>
+              <w:rPr>
+                <w:lang w:val="vi-VN"/>
+              </w:rPr>
+            </w:pPr>
+            <w:r>
+              <w:rPr>
+                <w:lang w:val="vi-VN"/>
+              </w:rPr>
+              <w:t xml:space="preserve">- </w:t>
+            </w:r>
+            <w:r>
+              <w:rPr>
+                <w:lang w:val="vi-VN"/>
+              </w:rPr>
+              <w:t>Vẽ sơ đồ luồng (flowchart) dựa trên khảo sát, phân tích các bước từ khi giảng viên tạo bài thu hoạch đến khi sinh viên nộp và được chấm.</w:t>
+            </w:r>
+          </w:p>
+          <w:p>
+            <w:pPr>
+              <w:rPr>
+                <w:lang w:val="vi-VN"/>
+              </w:rPr>
+            </w:pPr>
+            <w:r>
+              <w:rPr>
+                <w:lang w:val="vi-VN"/>
+              </w:rPr>
+              <w:t xml:space="preserve">- </w:t>
+            </w:r>
+            <w:r>
+              <w:rPr>
+                <w:lang w:val="vi-VN"/>
+              </w:rPr>
+              <w:t>Sử dụng công cụ AI (ChatGPT, Claude, Figma AI) để thiết kế giao diện: danh sách bài thu hoạch, form nộp bài, giao diện chấm điểm.</w:t>
+            </w:r>
+          </w:p>
+          <w:p>
+            <w:pPr>
+              <w:rPr>
+                <w:lang w:val="vi-VN"/>
+              </w:rPr>
+            </w:pPr>
+            <w:r>
+              <w:rPr>
+                <w:lang w:val="vi-VN"/>
+              </w:rPr>
+              <w:t xml:space="preserve">- </w:t>
+            </w:r>
+            <w:r>
+              <w:rPr>
+                <w:lang w:val="vi-VN"/>
+              </w:rPr>
+              <w:t xml:space="preserve">Thực hiện code chức năng trên Visual Studio </w:t>
+            </w:r>
+            <w:r>
+              <w:rPr>
+                <w:lang w:val="vi-VN"/>
+              </w:rPr>
+              <w:lastRenderedPageBreak/>
+              <w:t>Code, viết RESTful API, kiểm thử bằng Postman, sau đó bàn giao sản phẩm.</w:t>
+            </w:r>
+          </w:p>
+          <w:p>
+            <w:pPr>
+              <w:rPr>
+                <w:lang w:val="vi-VN"/>
+              </w:rPr>
+            </w:pPr>
+            <w:r>
+              <w:rPr>
+                <w:lang w:val="vi-VN"/>
+              </w:rPr>
+              <w:t>- Thực hiện thu thập ý kiến của cán bộ hướng dẫn trong quá trình thực hiện</w:t>
+            </w:r>
+          </w:p>
+        </w:tc>
+        <w:tc>
+          <w:tcPr>
+            <w:tcW w:w="2944" w:type="dxa"/>
+            <w:tcBorders>
+              <w:top w:val="single" w:sz="4" w:space="0" w:color="auto"/>
+              <w:left w:val="single" w:sz="4" w:space="0" w:color="auto"/>
+              <w:bottom w:val="single" w:sz="4" w:space="0" w:color="auto"/>
+              <w:right w:val="single" w:sz="4" w:space="0" w:color="auto"/>
+            </w:tcBorders>
+          </w:tcPr>
+          <w:p>
+            <w:pPr>
+              <w:spacing w:after="160" w:line="278" w:lineRule="auto"/>
+              <w:rPr>
+                <w:lang w:val="vi-VN"/>
+              </w:rPr>
+            </w:pPr>
+            <w:r>
+              <w:rPr>
+                <w:lang w:val="vi-VN"/>
+              </w:rPr>
+              <w:lastRenderedPageBreak/>
+              <w:t xml:space="preserve">- </w:t>
+            </w:r>
+            <w:r>
+              <w:rPr>
+                <w:lang w:val="vi-VN"/>
+              </w:rPr>
+              <w:t>Hiểu rõ nghiệp vụ quản lý bài thu hoạch và quy trình thực tế làm bài thi (nộp bài, lưu trữ, đánh giá).</w:t>
+            </w:r>
+          </w:p>
+          <w:p>
+            <w:pPr>
+              <w:spacing w:after="160" w:line="278" w:lineRule="auto"/>
+              <w:rPr>
+                <w:lang w:val="vi-VN"/>
+              </w:rPr>
+            </w:pPr>
+            <w:r>
+              <w:rPr>
+                <w:lang w:val="vi-VN"/>
+              </w:rPr>
+              <w:t xml:space="preserve">- </w:t>
+            </w:r>
+            <w:r>
+              <w:rPr>
+                <w:lang w:val="vi-VN"/>
+              </w:rPr>
+              <w:t>Nắm được logic xử lý theo thời gian thực, làm cơ sở thiết kế API và giao diện.</w:t>
+            </w:r>
+          </w:p>
+          <w:p>
+            <w:pPr>
+              <w:spacing w:after="160" w:line="278" w:lineRule="auto"/>
+              <w:rPr>
+                <w:lang w:val="vi-VN"/>
+              </w:rPr>
+            </w:pPr>
+            <w:r>
+              <w:rPr>
+                <w:lang w:val="vi-VN"/>
+              </w:rPr>
+              <w:t xml:space="preserve">- </w:t>
+            </w:r>
+            <w:r>
+              <w:rPr>
+                <w:lang w:val="vi-VN"/>
+              </w:rPr>
+              <w:t>Có bản thiết kế trực quan, dễ trao đổi với cán bộ quản lý và lập trình viên.</w:t>
+            </w:r>
+          </w:p>
+          <w:p>
+            <w:pPr>
+              <w:spacing w:after="160" w:line="278" w:lineRule="auto"/>
+              <w:rPr>
+                <w:lang w:val="vi-VN"/>
+              </w:rPr>
+            </w:pPr>
+            <w:r>
+              <w:rPr>
+                <w:lang w:val="vi-VN"/>
+              </w:rPr>
+              <w:lastRenderedPageBreak/>
+              <w:t>- Rèn luyện việc triển khai dữ liệu dựa trên nghiệp vụ người dùng.</w:t>
+            </w:r>
+          </w:p>
+          <w:p>
+            <w:pPr>
+              <w:spacing w:after="160" w:line="278" w:lineRule="auto"/>
+              <w:rPr>
+                <w:lang w:val="vi-VN"/>
+              </w:rPr>
+            </w:pPr>
+            <w:r>
+              <w:rPr>
+                <w:lang w:val="vi-VN"/>
+              </w:rPr>
+              <w:t>- Rèn luyện việc trao đổi với cán bộ quản lý để đảm bảo hiệu quả công việc</w:t>
+            </w:r>
+          </w:p>
+        </w:tc>
+      </w:tr>
+    </w:tbl>
+    <w:p>
+      <w:pPr>
+        <w:rPr>
+          <w:b/>
+          <w:bCs/>
+          <w:lang w:val="vi-VN"/>
+        </w:rPr>
+      </w:pPr>
+      <w:r>
+        <w:rPr>
+          <w:b/>
+          <w:bCs/>
+          <w:lang w:val="vi-VN"/>
+        </w:rPr>
+        <w:t xml:space="preserve">TUẦN </w:t>
+      </w:r>
+      <w:r>
+        <w:rPr>
+          <w:b/>
+          <w:bCs/>
+          <w:lang w:val="vi-VN"/>
+        </w:rPr>
+        <w:t xml:space="preserve">11 </w:t>
+      </w:r>
+      <w:r>
+        <w:rPr>
+          <w:b/>
+          <w:bCs/>
+          <w:lang w:val="vi-VN"/>
+        </w:rPr>
+        <w:t xml:space="preserve"> – </w:t>
+      </w:r>
+      <w:r>
+        <w:rPr>
+          <w:b/>
+          <w:bCs/>
+          <w:lang w:val="vi-VN"/>
+        </w:rPr>
+        <w:t>PHÂN TÍCH YÊU CẦU/ CHỨC NĂNG ĐIỂM DANH LỊCH HỌC, BUỔI THỰC HÀNH</w:t>
+      </w:r>
+    </w:p>
+    <w:tbl>
+      <w:tblPr>
+        <w:tblStyle w:val="TableGrid"/>
+        <w:tblW w:w="0" w:type="auto"/>
+        <w:tblLook w:val="04A0" w:firstRow="1" w:lastRow="0" w:firstColumn="1" w:lastColumn="0" w:noHBand="0" w:noVBand="1"/>
+      </w:tblPr>
+      <w:tblGrid>
+        <w:gridCol w:w="2944"/>
+        <w:gridCol w:w="2944"/>
+        <w:gridCol w:w="2944"/>
+      </w:tblGrid>
+      <w:tr>
+        <w:tc>
+          <w:tcPr>
+            <w:tcW w:w="2944" w:type="dxa"/>
+            <w:tcBorders>
+              <w:top w:val="single" w:sz="4" w:space="0" w:color="auto"/>
+              <w:left w:val="single" w:sz="4" w:space="0" w:color="auto"/>
+              <w:bottom w:val="single" w:sz="4" w:space="0" w:color="auto"/>
+              <w:right w:val="single" w:sz="4" w:space="0" w:color="auto"/>
+            </w:tcBorders>
+            <w:hideMark/>
+          </w:tcPr>
+          <w:p>
+            <w:pPr>
+              <w:spacing w:after="160" w:line="278" w:lineRule="auto"/>
+              <w:rPr>
+                <w:lang w:val="vi-VN"/>
+              </w:rPr>
+            </w:pPr>
+            <w:r>
+              <w:rPr>
+                <w:lang w:val="vi-VN"/>
+              </w:rPr>
+              <w:t>Nội dung công việc</w:t>
+            </w:r>
+          </w:p>
+        </w:tc>
+        <w:tc>
+          <w:tcPr>
+            <w:tcW w:w="2944" w:type="dxa"/>
+            <w:tcBorders>
+              <w:top w:val="single" w:sz="4" w:space="0" w:color="auto"/>
+              <w:left w:val="single" w:sz="4" w:space="0" w:color="auto"/>
+              <w:bottom w:val="single" w:sz="4" w:space="0" w:color="auto"/>
+              <w:right w:val="single" w:sz="4" w:space="0" w:color="auto"/>
+            </w:tcBorders>
+            <w:hideMark/>
+          </w:tcPr>
+          <w:p>
+            <w:pPr>
+              <w:spacing w:after="160" w:line="278" w:lineRule="auto"/>
+              <w:rPr>
+                <w:lang w:val="vi-VN"/>
+              </w:rPr>
+            </w:pPr>
+            <w:r>
+              <w:rPr>
+                <w:lang w:val="vi-VN"/>
+              </w:rPr>
+              <w:t>Phương pháp thực hiện</w:t>
+            </w:r>
+          </w:p>
+        </w:tc>
+        <w:tc>
+          <w:tcPr>
+            <w:tcW w:w="2944" w:type="dxa"/>
+            <w:tcBorders>
+              <w:top w:val="single" w:sz="4" w:space="0" w:color="auto"/>
+              <w:left w:val="single" w:sz="4" w:space="0" w:color="auto"/>
+              <w:bottom w:val="single" w:sz="4" w:space="0" w:color="auto"/>
+              <w:right w:val="single" w:sz="4" w:space="0" w:color="auto"/>
+            </w:tcBorders>
+            <w:hideMark/>
+          </w:tcPr>
+          <w:p>
+            <w:pPr>
+              <w:spacing w:after="160" w:line="278" w:lineRule="auto"/>
+              <w:rPr>
+                <w:lang w:val="vi-VN"/>
+              </w:rPr>
+            </w:pPr>
+            <w:r>
+              <w:rPr>
+                <w:lang w:val="vi-VN"/>
+              </w:rPr>
+              <w:t>Kết quả đạt được</w:t>
+            </w:r>
+          </w:p>
+        </w:tc>
+      </w:tr>
+      <w:tr>
+        <w:tc>
+          <w:tcPr>
+            <w:tcW w:w="2944" w:type="dxa"/>
+            <w:tcBorders>
+              <w:top w:val="single" w:sz="4" w:space="0" w:color="auto"/>
+              <w:left w:val="single" w:sz="4" w:space="0" w:color="auto"/>
+              <w:bottom w:val="single" w:sz="4" w:space="0" w:color="auto"/>
+              <w:right w:val="single" w:sz="4" w:space="0" w:color="auto"/>
+            </w:tcBorders>
+          </w:tcPr>
+          <w:p>
+            <w:pPr>
+              <w:rPr>
+                <w:lang w:val="vi-VN"/>
+              </w:rPr>
+            </w:pPr>
+            <w:r>
+              <w:rPr>
+                <w:lang w:val="vi-VN"/>
+              </w:rPr>
+              <w:t>-</w:t>
+            </w:r>
+            <w:r>
+              <w:rPr>
+                <w:lang w:val="vi-VN"/>
+              </w:rPr>
+              <w:t xml:space="preserve"> </w:t>
+            </w:r>
+            <w:r>
+              <w:t>Khảo sát chức năng điểm danh lịch học</w:t>
+            </w:r>
+            <w:r>
+              <w:rPr>
+                <w:lang w:val="vi-VN"/>
+              </w:rPr>
+              <w:t>.</w:t>
+            </w:r>
+          </w:p>
+          <w:p>
+            <w:pPr>
+              <w:rPr>
+                <w:lang w:val="vi-VN"/>
+              </w:rPr>
+            </w:pPr>
+            <w:r>
+              <w:rPr>
+                <w:lang w:val="vi-VN"/>
+              </w:rPr>
+              <w:t xml:space="preserve">- </w:t>
+            </w:r>
+            <w:r>
+              <w:rPr>
+                <w:lang w:val="vi-VN"/>
+              </w:rPr>
+              <w:t>Nghiên cứu trình tự luồng hoạt động của chức năng điểm danh, hoạt động thực hiện điểm danh</w:t>
+            </w:r>
+            <w:r>
+              <w:rPr>
+                <w:lang w:val="vi-VN"/>
+              </w:rPr>
+              <w:t>.</w:t>
+            </w:r>
+          </w:p>
+          <w:p>
+            <w:pPr>
+              <w:rPr>
+                <w:lang w:val="vi-VN"/>
+              </w:rPr>
+            </w:pPr>
+            <w:r>
+              <w:rPr>
+                <w:lang w:val="vi-VN"/>
+              </w:rPr>
+              <w:t xml:space="preserve">- Dựng màn hình dự kiến cho chức năng </w:t>
+            </w:r>
+            <w:r>
+              <w:rPr>
+                <w:lang w:val="vi-VN"/>
+              </w:rPr>
+              <w:t>điểm danh</w:t>
+            </w:r>
+            <w:r>
+              <w:rPr>
+                <w:lang w:val="vi-VN"/>
+              </w:rPr>
+              <w:t>.</w:t>
+            </w:r>
+          </w:p>
+          <w:p>
+            <w:pPr>
+              <w:rPr>
+                <w:lang w:val="vi-VN"/>
+              </w:rPr>
+            </w:pPr>
+            <w:r>
+              <w:rPr>
+                <w:lang w:val="vi-VN"/>
+              </w:rPr>
+              <w:t xml:space="preserve">- Thiết kế API, màn hình cho chức </w:t>
+            </w:r>
+            <w:r>
+              <w:rPr>
+                <w:lang w:val="vi-VN"/>
+              </w:rPr>
+              <w:t>năng.</w:t>
+            </w:r>
+          </w:p>
+          <w:p>
+            <w:pPr>
+              <w:rPr>
+                <w:lang w:val="vi-VN"/>
+              </w:rPr>
+            </w:pPr>
+            <w:r>
+              <w:rPr>
+                <w:lang w:val="vi-VN"/>
+              </w:rPr>
+              <w:t xml:space="preserve">- </w:t>
+            </w:r>
+            <w:r>
+              <w:rPr>
+                <w:lang w:val="vi-VN"/>
+              </w:rPr>
+              <w:t>Thu thập ý kiến của cán bộ hướng dẫn trong quá trình thực hiện</w:t>
+            </w:r>
+          </w:p>
+        </w:tc>
+        <w:tc>
+          <w:tcPr>
+            <w:tcW w:w="2944" w:type="dxa"/>
+            <w:tcBorders>
+              <w:top w:val="single" w:sz="4" w:space="0" w:color="auto"/>
+              <w:left w:val="single" w:sz="4" w:space="0" w:color="auto"/>
+              <w:bottom w:val="single" w:sz="4" w:space="0" w:color="auto"/>
+              <w:right w:val="single" w:sz="4" w:space="0" w:color="auto"/>
+            </w:tcBorders>
+          </w:tcPr>
+          <w:p>
+            <w:pPr>
+              <w:rPr>
+                <w:lang w:val="vi-VN"/>
+              </w:rPr>
+            </w:pPr>
+            <w:r>
+              <w:rPr>
+                <w:lang w:val="vi-VN"/>
+              </w:rPr>
+              <w:t xml:space="preserve">- </w:t>
+            </w:r>
+            <w:r>
+              <w:rPr>
+                <w:lang w:val="vi-VN"/>
+              </w:rPr>
+              <w:t>Dựa trên tài liệu mô tả, trao đổi với cán bộ hướng dẫn để xác định nghiệp vụ: điểm danh sinh viên theo buổi học, theo buổi thực hành, ghi nhận trạng thái (có mặt, vắng, muộn).</w:t>
+            </w:r>
+          </w:p>
+          <w:p>
+            <w:pPr>
+              <w:rPr>
+                <w:lang w:val="vi-VN"/>
+              </w:rPr>
+            </w:pPr>
+            <w:r>
+              <w:rPr>
+                <w:lang w:val="vi-VN"/>
+              </w:rPr>
+              <w:t xml:space="preserve">- </w:t>
+            </w:r>
+            <w:r>
+              <w:rPr>
+                <w:lang w:val="vi-VN"/>
+              </w:rPr>
+              <w:t>Phân tích các bước: giảng viên chọn lớp/buổi học → hiển thị danh sách sinh viên → thực hiện điểm danh → lưu kết quả → thống kê tỷ lệ chuyên cần.</w:t>
+            </w:r>
+          </w:p>
+          <w:p>
+            <w:pPr>
+              <w:rPr>
+                <w:lang w:val="vi-VN"/>
+              </w:rPr>
+            </w:pPr>
+            <w:r>
+              <w:rPr>
+                <w:lang w:val="vi-VN"/>
+              </w:rPr>
+              <w:t xml:space="preserve">- </w:t>
+            </w:r>
+            <w:r>
+              <w:rPr>
+                <w:lang w:val="vi-VN"/>
+              </w:rPr>
+              <w:t>Sử dụng công cụ AI (ChatGPT, Claude, Figma AI) để thiết kế giao diện: danh sách buổi học cần điểm danh, bảng điểm danh có checkbox/radio, nút lưu, hiển thị tổng kết.</w:t>
+            </w:r>
+          </w:p>
+          <w:p>
+            <w:pPr>
+              <w:rPr>
+                <w:lang w:val="vi-VN"/>
+              </w:rPr>
+            </w:pPr>
+            <w:r>
+              <w:rPr>
+                <w:lang w:val="vi-VN"/>
+              </w:rPr>
+              <w:t>- Thực hiện code chức năng trên Visual Studio Code, kiểm thử API bằng Postman và bàn giao sản phẩm</w:t>
+            </w:r>
+          </w:p>
+          <w:p>
+            <w:pPr>
+              <w:rPr>
+                <w:lang w:val="vi-VN"/>
+              </w:rPr>
+            </w:pPr>
+            <w:r>
+              <w:rPr>
+                <w:lang w:val="vi-VN"/>
+              </w:rPr>
+              <w:t xml:space="preserve">- </w:t>
+            </w:r>
+            <w:r>
+              <w:rPr>
+                <w:lang w:val="vi-VN"/>
+              </w:rPr>
+              <w:t xml:space="preserve">Phân tích đối tượng thực hiện (giảng viên, trợ giảng, sinh viên tự điểm danh nếu có). </w:t>
+            </w:r>
+            <w:r>
+              <w:t xml:space="preserve">Code chức </w:t>
+            </w:r>
+            <w:r>
+              <w:lastRenderedPageBreak/>
+              <w:t>năng trên Visual Studio Code, viết RESTful API, kiểm thử bằng Postman, bàn giao sản phẩm.</w:t>
+            </w:r>
+          </w:p>
+          <w:p>
+            <w:pPr>
+              <w:rPr>
+                <w:lang w:val="vi-VN"/>
+              </w:rPr>
+            </w:pPr>
+          </w:p>
+        </w:tc>
+        <w:tc>
+          <w:tcPr>
+            <w:tcW w:w="2944" w:type="dxa"/>
+            <w:tcBorders>
+              <w:top w:val="single" w:sz="4" w:space="0" w:color="auto"/>
+              <w:left w:val="single" w:sz="4" w:space="0" w:color="auto"/>
+              <w:bottom w:val="single" w:sz="4" w:space="0" w:color="auto"/>
+              <w:right w:val="single" w:sz="4" w:space="0" w:color="auto"/>
+            </w:tcBorders>
+          </w:tcPr>
+          <w:p>
+            <w:pPr>
+              <w:rPr>
+                <w:lang w:val="vi-VN"/>
+              </w:rPr>
+            </w:pPr>
+            <w:r>
+              <w:rPr>
+                <w:lang w:val="vi-VN"/>
+              </w:rPr>
+              <w:lastRenderedPageBreak/>
+              <w:t>-</w:t>
+            </w:r>
+            <w:r>
+              <w:rPr>
+                <w:lang w:val="vi-VN"/>
+              </w:rPr>
+              <w:t xml:space="preserve"> </w:t>
+            </w:r>
+            <w:r>
+              <w:rPr>
+                <w:lang w:val="vi-VN"/>
+              </w:rPr>
+              <w:t>Hiểu rõ nghiệp vụ điểm danh trong đào tạo tín chỉ, phân biệt điểm danh lý thuyết và thực hành.</w:t>
+            </w:r>
+          </w:p>
+          <w:p>
+            <w:pPr>
+              <w:rPr>
+                <w:lang w:val="vi-VN"/>
+              </w:rPr>
+            </w:pPr>
+            <w:r>
+              <w:rPr>
+                <w:lang w:val="vi-VN"/>
+              </w:rPr>
+              <w:t xml:space="preserve">- </w:t>
+            </w:r>
+            <w:r>
+              <w:rPr>
+                <w:lang w:val="vi-VN"/>
+              </w:rPr>
+              <w:t>Xây dựng được sơ đồ luồng rõ ràng, làm cơ sở thiết kế API và giao diện điểm danh nhanh.</w:t>
+            </w:r>
+          </w:p>
+          <w:p>
+            <w:pPr>
+              <w:rPr>
+                <w:lang w:val="vi-VN"/>
+              </w:rPr>
+            </w:pPr>
+            <w:r>
+              <w:rPr>
+                <w:lang w:val="vi-VN"/>
+              </w:rPr>
+              <w:t xml:space="preserve">- </w:t>
+            </w:r>
+            <w:r>
+              <w:rPr>
+                <w:lang w:val="vi-VN"/>
+              </w:rPr>
+              <w:t>Có bản thiết kế trực quan, hỗ trợ trao đổi với giảng viên và người dùng.</w:t>
+            </w:r>
+          </w:p>
+          <w:p>
+            <w:pPr>
+              <w:rPr>
+                <w:lang w:val="vi-VN"/>
+              </w:rPr>
+            </w:pPr>
+            <w:r>
+              <w:rPr>
+                <w:lang w:val="vi-VN"/>
+              </w:rPr>
+              <w:t xml:space="preserve">- </w:t>
+            </w:r>
+            <w:r>
+              <w:rPr>
+                <w:lang w:val="vi-VN"/>
+              </w:rPr>
+              <w:t>Rèn luyện kỹ năng triển khai dữ liệu (bảng điểm danh, chi tiết điểm danh) dựa trên nghiệp vụ người dùng; hoàn thiện chức năng cơ bản.</w:t>
+            </w:r>
+          </w:p>
+          <w:p>
+            <w:pPr>
+              <w:rPr>
+                <w:lang w:val="vi-VN"/>
+              </w:rPr>
+            </w:pPr>
+            <w:r>
+              <w:rPr>
+                <w:lang w:val="vi-VN"/>
+              </w:rPr>
+              <w:t xml:space="preserve">- </w:t>
+            </w:r>
+            <w:r>
+              <w:rPr>
+                <w:lang w:val="vi-VN"/>
+              </w:rPr>
+              <w:t>Rèn luyện kỹ năng trao đổi với cán bộ quản lý để đảm bảo chức năng điểm danh chính xác, hiệu quả trong thực tế.</w:t>
+            </w:r>
+          </w:p>
+        </w:tc>
+      </w:tr>
+    </w:tbl>
+    <w:p>
+      <w:pPr>
+        <w:rPr>
+          <w:lang w:val="vi-VN"/>
+        </w:rPr>
+      </w:pPr>
+    </w:p>
+    <w:p>
+      <w:pPr>
+        <w:rPr>
+          <w:b/>
+          <w:bCs/>
+          <w:lang w:val="vi-VN"/>
+        </w:rPr>
+      </w:pPr>
+      <w:r>
+        <w:rPr>
+          <w:b/>
+          <w:bCs/>
+          <w:lang w:val="vi-VN"/>
+        </w:rPr>
+        <w:t xml:space="preserve">TUẦN </w:t>
+      </w:r>
+      <w:r>
+        <w:rPr>
+          <w:b/>
+          <w:bCs/>
+          <w:lang w:val="vi-VN"/>
+        </w:rPr>
+        <w:t>12</w:t>
+      </w:r>
+      <w:r>
+        <w:rPr>
+          <w:b/>
+          <w:bCs/>
+          <w:lang w:val="vi-VN"/>
+        </w:rPr>
+        <w:t xml:space="preserve">  – </w:t>
+      </w:r>
+      <w:r>
+        <w:rPr>
+          <w:b/>
+          <w:bCs/>
+          <w:lang w:val="vi-VN"/>
+        </w:rPr>
+        <w:t>THỰC HIỆN DEPLOY ỨNG DỤNG, TỔNG KẾT HỌC PHẦN THỰC TẬP</w:t>
+      </w:r>
+    </w:p>
+    <w:tbl>
+      <w:tblPr>
+        <w:tblStyle w:val="TableGrid"/>
+        <w:tblW w:w="0" w:type="auto"/>
+        <w:tblLook w:val="04A0" w:firstRow="1" w:lastRow="0" w:firstColumn="1" w:lastColumn="0" w:noHBand="0" w:noVBand="1"/>
+      </w:tblPr>
+      <w:tblGrid>
+        <w:gridCol w:w="2944"/>
+        <w:gridCol w:w="2944"/>
+        <w:gridCol w:w="2944"/>
+      </w:tblGrid>
+      <w:tr>
+        <w:tc>
+          <w:tcPr>
+            <w:tcW w:w="2944" w:type="dxa"/>
+            <w:tcBorders>
+              <w:top w:val="single" w:sz="4" w:space="0" w:color="auto"/>
+              <w:left w:val="single" w:sz="4" w:space="0" w:color="auto"/>
+              <w:bottom w:val="single" w:sz="4" w:space="0" w:color="auto"/>
+              <w:right w:val="single" w:sz="4" w:space="0" w:color="auto"/>
+            </w:tcBorders>
+            <w:hideMark/>
+          </w:tcPr>
+          <w:p>
+            <w:pPr>
+              <w:spacing w:after="160" w:line="278" w:lineRule="auto"/>
+              <w:rPr>
+                <w:lang w:val="vi-VN"/>
+              </w:rPr>
+            </w:pPr>
+            <w:r>
+              <w:rPr>
+                <w:lang w:val="vi-VN"/>
+              </w:rPr>
+              <w:t>Nội dung công việc</w:t>
+            </w:r>
+          </w:p>
+        </w:tc>
+        <w:tc>
+          <w:tcPr>
+            <w:tcW w:w="2944" w:type="dxa"/>
+            <w:tcBorders>
+              <w:top w:val="single" w:sz="4" w:space="0" w:color="auto"/>
+              <w:left w:val="single" w:sz="4" w:space="0" w:color="auto"/>
+              <w:bottom w:val="single" w:sz="4" w:space="0" w:color="auto"/>
+              <w:right w:val="single" w:sz="4" w:space="0" w:color="auto"/>
+            </w:tcBorders>
+            <w:hideMark/>
+          </w:tcPr>
+          <w:p>
+            <w:pPr>
+              <w:spacing w:after="160" w:line="278" w:lineRule="auto"/>
+              <w:rPr>
+                <w:lang w:val="vi-VN"/>
+              </w:rPr>
+            </w:pPr>
+            <w:r>
+              <w:rPr>
+                <w:lang w:val="vi-VN"/>
+              </w:rPr>
+              <w:t>Phương pháp thực hiện</w:t>
+            </w:r>
+          </w:p>
+        </w:tc>
+        <w:tc>
+          <w:tcPr>
+            <w:tcW w:w="2944" w:type="dxa"/>
+            <w:tcBorders>
+              <w:top w:val="single" w:sz="4" w:space="0" w:color="auto"/>
+              <w:left w:val="single" w:sz="4" w:space="0" w:color="auto"/>
+              <w:bottom w:val="single" w:sz="4" w:space="0" w:color="auto"/>
+              <w:right w:val="single" w:sz="4" w:space="0" w:color="auto"/>
+            </w:tcBorders>
+            <w:hideMark/>
+          </w:tcPr>
+          <w:p>
+            <w:pPr>
+              <w:spacing w:after="160" w:line="278" w:lineRule="auto"/>
+              <w:rPr>
+                <w:lang w:val="vi-VN"/>
+              </w:rPr>
+            </w:pPr>
+            <w:r>
+              <w:rPr>
+                <w:lang w:val="vi-VN"/>
+              </w:rPr>
+              <w:t>Kết quả đạt được</w:t>
+            </w:r>
+          </w:p>
+        </w:tc>
+      </w:tr>
+      <w:tr>
+        <w:tc>
+          <w:tcPr>
+            <w:tcW w:w="2944" w:type="dxa"/>
+            <w:tcBorders>
+              <w:top w:val="single" w:sz="4" w:space="0" w:color="auto"/>
+              <w:left w:val="single" w:sz="4" w:space="0" w:color="auto"/>
+              <w:bottom w:val="single" w:sz="4" w:space="0" w:color="auto"/>
+              <w:right w:val="single" w:sz="4" w:space="0" w:color="auto"/>
+            </w:tcBorders>
+          </w:tcPr>
+          <w:p>
+            <w:pPr>
+              <w:rPr>
+                <w:lang w:val="vi-VN"/>
+              </w:rPr>
+            </w:pPr>
+            <w:r>
+              <w:rPr>
+                <w:lang w:val="vi-VN"/>
+              </w:rPr>
+              <w:t xml:space="preserve">- </w:t>
+            </w:r>
+            <w:r>
+              <w:rPr>
+                <w:lang w:val="vi-VN"/>
+              </w:rPr>
+              <w:t>Đóng gói ứng dụng, tìm hiểu về các nền tảng VPS deploy ứng dụng.</w:t>
+            </w:r>
+          </w:p>
+          <w:p>
+            <w:pPr>
+              <w:rPr>
+                <w:lang w:val="vi-VN"/>
+              </w:rPr>
+            </w:pPr>
+            <w:r>
+              <w:rPr>
+                <w:lang w:val="vi-VN"/>
+              </w:rPr>
+              <w:t>- Tìm hiểu quy trình deploy, CI/CD và môi trường production.</w:t>
+            </w:r>
+          </w:p>
+          <w:p>
+            <w:pPr>
+              <w:rPr>
+                <w:lang w:val="vi-VN"/>
+              </w:rPr>
+            </w:pPr>
+            <w:r>
+              <w:rPr>
+                <w:lang w:val="vi-VN"/>
+              </w:rPr>
+              <w:t>- Tiến hành kiểm tra tổng thể ứng dụng, kiểm thử và thực hiện bàn giao sản phẩm.</w:t>
+            </w:r>
+          </w:p>
+          <w:p>
+            <w:pPr>
+              <w:rPr>
+                <w:lang w:val="vi-VN"/>
+              </w:rPr>
+            </w:pPr>
+            <w:r>
+              <w:rPr>
+                <w:lang w:val="vi-VN"/>
+              </w:rPr>
+              <w:t>- Tổng kết học phần thực tập tại doanh nghiệp</w:t>
+            </w:r>
+          </w:p>
+        </w:tc>
+        <w:tc>
+          <w:tcPr>
+            <w:tcW w:w="2944" w:type="dxa"/>
+            <w:tcBorders>
+              <w:top w:val="single" w:sz="4" w:space="0" w:color="auto"/>
+              <w:left w:val="single" w:sz="4" w:space="0" w:color="auto"/>
+              <w:bottom w:val="single" w:sz="4" w:space="0" w:color="auto"/>
+              <w:right w:val="single" w:sz="4" w:space="0" w:color="auto"/>
+            </w:tcBorders>
+          </w:tcPr>
+          <w:p>
+            <w:pPr>
+              <w:rPr>
+                <w:lang w:val="vi-VN"/>
+              </w:rPr>
+            </w:pPr>
+            <w:r>
+              <w:rPr>
+                <w:lang w:val="vi-VN"/>
+              </w:rPr>
+              <w:t xml:space="preserve">- </w:t>
+            </w:r>
+            <w:r>
+              <w:t>Sử dụng Docker để đóng gói ứng dụng (viết Dockerfile, build image). Nghiên cứu các nền tảng VPS phổ biến như Azure, AWS, hoặc Google Cloud.</w:t>
+            </w:r>
+          </w:p>
+          <w:p>
+            <w:pPr>
+              <w:rPr>
+                <w:lang w:val="vi-VN"/>
+              </w:rPr>
+            </w:pPr>
+            <w:r>
+              <w:rPr>
+                <w:lang w:val="vi-VN"/>
+              </w:rPr>
+              <w:t xml:space="preserve">- </w:t>
+            </w:r>
+            <w:r>
+              <w:t>Tìm hiểu pipeline CI/CD (GitHub Actions, Azure DevOps). Phân biệt môi trường dev, test, production và các yêu cầu về bảo mật (biến môi trường, secret)</w:t>
+            </w:r>
+            <w:r>
+              <w:rPr>
+                <w:lang w:val="vi-VN"/>
+              </w:rPr>
+              <w:t>.</w:t>
+            </w:r>
+          </w:p>
+          <w:p>
+            <w:pPr>
+              <w:rPr>
+                <w:lang w:val="vi-VN"/>
+              </w:rPr>
+            </w:pPr>
+            <w:r>
+              <w:rPr>
+                <w:lang w:val="vi-VN"/>
+              </w:rPr>
+              <w:t xml:space="preserve">- </w:t>
+            </w:r>
+            <w:r>
+              <w:t>Thực hiện kiểm thử toàn diện trên môi trường production sau deploy. Kiểm tra log, biến môi trường trên Azure. Viết tài liệu hướng dẫn cài đặt/sử dụng và bàn giao cho đơn vị quản lý.</w:t>
+            </w:r>
+          </w:p>
+          <w:p>
+            <w:pPr>
+              <w:rPr>
+                <w:lang w:val="vi-VN"/>
+              </w:rPr>
+            </w:pPr>
+            <w:r>
+              <w:rPr>
+                <w:lang w:val="vi-VN"/>
+              </w:rPr>
+              <w:t xml:space="preserve">- </w:t>
+            </w:r>
+            <w:r>
+              <w:rPr>
+                <w:lang w:val="vi-VN"/>
+              </w:rPr>
+              <w:t xml:space="preserve">Tổng hợp báo cáo cuối kỳ, liệt kê các điểm mạnh (đã hoàn thành chức năng đúng yêu cầu, áp dụng được công nghệ mới) và thiếu sót (tối ưu hiệu năng chưa cao, thiếu một số test case). </w:t>
+            </w:r>
+            <w:r>
+              <w:t>Viết bài thu hoạch.</w:t>
+            </w:r>
+            <w:r>
+              <w:rPr>
+                <w:lang w:val="vi-VN"/>
+              </w:rPr>
+              <w:t xml:space="preserve"> </w:t>
+            </w:r>
+          </w:p>
+        </w:tc>
+        <w:tc>
+          <w:tcPr>
+            <w:tcW w:w="2944" w:type="dxa"/>
+            <w:tcBorders>
+              <w:top w:val="single" w:sz="4" w:space="0" w:color="auto"/>
+              <w:left w:val="single" w:sz="4" w:space="0" w:color="auto"/>
+              <w:bottom w:val="single" w:sz="4" w:space="0" w:color="auto"/>
+              <w:right w:val="single" w:sz="4" w:space="0" w:color="auto"/>
+            </w:tcBorders>
+          </w:tcPr>
+          <w:p>
+            <w:pPr>
+              <w:spacing w:after="160" w:line="278" w:lineRule="auto"/>
+              <w:rPr>
+                <w:lang w:val="vi-VN"/>
+              </w:rPr>
+            </w:pPr>
+            <w:r>
+              <w:rPr>
+                <w:lang w:val="vi-VN"/>
+              </w:rPr>
+              <w:t xml:space="preserve">- </w:t>
+            </w:r>
+            <w:r>
+              <w:rPr>
+                <w:lang w:val="vi-VN"/>
+              </w:rPr>
+              <w:t>Hiểu được quy trình đóng gói ứng dụng thành container, sẵn sàng triển khai trên nhiều môi trường</w:t>
+            </w:r>
+            <w:r>
+              <w:rPr>
+                <w:lang w:val="vi-VN"/>
+              </w:rPr>
+              <w:t>.</w:t>
+            </w:r>
+          </w:p>
+          <w:p>
+            <w:pPr>
+              <w:spacing w:after="160" w:line="278" w:lineRule="auto"/>
+              <w:rPr>
+                <w:lang w:val="vi-VN"/>
+              </w:rPr>
+            </w:pPr>
+            <w:r>
+              <w:rPr>
+                <w:lang w:val="vi-VN"/>
+              </w:rPr>
+              <w:t xml:space="preserve">- </w:t>
+            </w:r>
+            <w:r>
+              <w:rPr>
+                <w:lang w:val="vi-VN"/>
+              </w:rPr>
+              <w:t>Nắm được quy trình tự động hóa việc build, test và triển khai, giảm thiểu rủi ro khi lên production.</w:t>
+            </w:r>
+          </w:p>
+          <w:p>
+            <w:pPr>
+              <w:spacing w:after="160" w:line="278" w:lineRule="auto"/>
+              <w:rPr>
+                <w:lang w:val="vi-VN"/>
+              </w:rPr>
+            </w:pPr>
+            <w:r>
+              <w:rPr>
+                <w:lang w:val="vi-VN"/>
+              </w:rPr>
+              <w:t xml:space="preserve">- </w:t>
+            </w:r>
+            <w:r>
+              <w:rPr>
+                <w:lang w:val="vi-VN"/>
+              </w:rPr>
+              <w:t>Hoàn thiện sản phẩm cuối, có khả năng kiểm tra và xử lý lỗi dựa trên log hệ thống.</w:t>
+            </w:r>
+          </w:p>
+          <w:p>
+            <w:pPr>
+              <w:spacing w:after="160" w:line="278" w:lineRule="auto"/>
+              <w:rPr>
+                <w:lang w:val="vi-VN"/>
+              </w:rPr>
+            </w:pPr>
+            <w:r>
+              <w:rPr>
+                <w:lang w:val="vi-VN"/>
+              </w:rPr>
+              <w:t xml:space="preserve">- </w:t>
+            </w:r>
+            <w:r>
+              <w:rPr>
+                <w:lang w:val="vi-VN"/>
+              </w:rPr>
+              <w:t>Rút ra được bài học kinh nghiệm cho bản thân, cải thiện kỹ năng quản lý thời gian, tài liệu hóa và làm việc nhóm.</w:t>
+            </w:r>
+          </w:p>
+          <w:p>
+            <w:pPr>
+              <w:spacing w:after="160" w:line="278" w:lineRule="auto"/>
+              <w:rPr>
+                <w:lang w:val="vi-VN"/>
+              </w:rPr>
+            </w:pPr>
+          </w:p>
+        </w:tc>
+      </w:tr>
+    </w:tbl>
+    <w:p>
+      <w:pPr>
+        <w:pStyle w:val="Heading1"/>
+        <w:rPr>
+          <w:lang w:val="vi-VN"/>
+        </w:rPr>
+      </w:pPr>
+      <w:r>
+        <w:rPr>
+          <w:lang w:val="vi-VN"/>
+        </w:rPr>
+        <w:lastRenderedPageBreak/>
+        <w:t>Kết quả thực tập</w:t>
+      </w:r>
+    </w:p>
+    <w:p>
+      <w:pPr>
+        <w:pStyle w:val="Heading2"/>
+        <w:rPr>
+          <w:lang w:val="vi-VN"/>
+        </w:rPr>
+      </w:pPr>
+      <w:r>
+        <w:rPr>
+          <w:lang w:val="vi-VN"/>
+        </w:rPr>
+        <w:t>Những yêu cầu cần phải có để tham gia vào hoạt động doanh nghiệp.</w:t>
+      </w:r>
+    </w:p>
+    <w:p>
+      <w:pPr>
+        <w:rPr>
+          <w:lang w:val="vi-VN"/>
+        </w:rPr>
+      </w:pPr>
+      <w:r>
+        <w:rPr>
+          <w:lang w:val="vi-VN"/>
+        </w:rPr>
+        <w:t>Qua quá trình thực tập tại doanh nghiệp, tôi nhận thấy để tham gia hiệu quả vào hoạt động phát triển phần mềm, một nhân viên thực tập hoặc nhân viên chính thức cần đáp ứng các yêu cầu sau:</w:t>
+      </w:r>
+    </w:p>
+    <w:p>
+      <w:pPr>
+        <w:pStyle w:val="ListParagraph"/>
+        <w:numPr>
+          <w:ilvl w:val="0"/>
+          <w:numId w:val="2"/>
+        </w:numPr>
+      </w:pPr>
+      <w:r>
+        <w:t>Tư duy:</w:t>
+      </w:r>
+    </w:p>
+    <w:p>
+      <w:pPr>
+        <w:pStyle w:val="ListParagraph"/>
+        <w:numPr>
+          <w:ilvl w:val="1"/>
+          <w:numId w:val="2"/>
+        </w:numPr>
+      </w:pPr>
+      <w:r>
+        <w:t>Tư duy hệ thống, phân tích nghiệp vụ thành các chức năng cụ thể.</w:t>
+      </w:r>
+    </w:p>
+    <w:p>
+      <w:pPr>
+        <w:pStyle w:val="ListParagraph"/>
+        <w:numPr>
+          <w:ilvl w:val="1"/>
+          <w:numId w:val="2"/>
+        </w:numPr>
+      </w:pPr>
+      <w:r>
+        <w:t>Tư duy giải quyết vấn đề (problem-solving), đặc biệt khi gặp lỗi hoặc thay đổi yêu cầu.</w:t>
+      </w:r>
+    </w:p>
+    <w:p>
+      <w:pPr>
+        <w:pStyle w:val="ListParagraph"/>
+        <w:numPr>
+          <w:ilvl w:val="1"/>
+          <w:numId w:val="2"/>
+        </w:numPr>
+      </w:pPr>
+      <w:r>
+        <w:t>Tư duy phản biện để trao đổi với cán bộ quản lý, đảm bảo hiểu đúng nghiệp vụ.</w:t>
+      </w:r>
+    </w:p>
+    <w:p>
+      <w:pPr>
+        <w:pStyle w:val="ListParagraph"/>
+        <w:numPr>
+          <w:ilvl w:val="0"/>
+          <w:numId w:val="2"/>
+        </w:numPr>
+      </w:pPr>
+      <w:r>
+        <w:t>Kiến thức:</w:t>
+      </w:r>
+    </w:p>
+    <w:p>
+      <w:pPr>
+        <w:pStyle w:val="ListParagraph"/>
+        <w:numPr>
+          <w:ilvl w:val="1"/>
+          <w:numId w:val="2"/>
+        </w:numPr>
+      </w:pPr>
+      <w:r>
+        <w:t>Kiến thức về cơ sở dữ liệu (thiết kế bảng, quan hệ, truy vấn).</w:t>
+      </w:r>
+    </w:p>
+    <w:p>
+      <w:pPr>
+        <w:pStyle w:val="ListParagraph"/>
+        <w:numPr>
+          <w:ilvl w:val="1"/>
+          <w:numId w:val="2"/>
+        </w:numPr>
+      </w:pPr>
+      <w:r>
+        <w:t>Kiến thức về lập trình web/ứng dụng (</w:t>
+      </w:r>
+      <w:hyperlink r:id="rId10" w:tgtFrame="_blank" w:history="1">
+        <w:r>
+          <w:rPr>
+            <w:rStyle w:val="Hyperlink"/>
+          </w:rPr>
+          <w:t>ASP.NET</w:t>
+        </w:r>
+      </w:hyperlink>
+      <w:r>
+        <w:t> Core, RESTful API, Docker).</w:t>
+      </w:r>
+    </w:p>
+    <w:p>
+      <w:pPr>
+        <w:pStyle w:val="ListParagraph"/>
+        <w:numPr>
+          <w:ilvl w:val="1"/>
+          <w:numId w:val="2"/>
+        </w:numPr>
+      </w:pPr>
+      <w:r>
+        <w:t>Hiểu biết về quy trình phát triển phần mềm (khảo sát, phân tích, thiết kế, code, kiểm thử, triển khai).</w:t>
+      </w:r>
+    </w:p>
+    <w:p>
+      <w:pPr>
+        <w:pStyle w:val="ListParagraph"/>
+        <w:numPr>
+          <w:ilvl w:val="1"/>
+          <w:numId w:val="2"/>
+        </w:numPr>
+      </w:pPr>
+      <w:r>
+        <w:t>Kiến thức cơ bản về CI/CD, môi trường production, bảo mật biến môi trường.</w:t>
+      </w:r>
+    </w:p>
+    <w:p>
+      <w:pPr>
+        <w:pStyle w:val="ListParagraph"/>
+        <w:numPr>
+          <w:ilvl w:val="0"/>
+          <w:numId w:val="2"/>
+        </w:numPr>
+      </w:pPr>
+      <w:r>
+        <w:t>Kỹ năng:</w:t>
+      </w:r>
+    </w:p>
+    <w:p>
+      <w:pPr>
+        <w:pStyle w:val="ListParagraph"/>
+        <w:numPr>
+          <w:ilvl w:val="1"/>
+          <w:numId w:val="2"/>
+        </w:numPr>
+      </w:pPr>
+      <w:r>
+        <w:t>Kỹ năng làm việc nhóm và giao tiếp với cán bộ hướng dẫn.</w:t>
+      </w:r>
+    </w:p>
+    <w:p>
+      <w:pPr>
+        <w:pStyle w:val="ListParagraph"/>
+        <w:numPr>
+          <w:ilvl w:val="1"/>
+          <w:numId w:val="2"/>
+        </w:numPr>
+      </w:pPr>
+      <w:r>
+        <w:t>Kỹ năng sử dụng công cụ: Visual Studio, Git/GitHub, Postman, Swagger, Docker, Azure (hoặc VPS).</w:t>
+      </w:r>
+    </w:p>
+    <w:p>
+      <w:pPr>
+        <w:pStyle w:val="ListParagraph"/>
+        <w:numPr>
+          <w:ilvl w:val="1"/>
+          <w:numId w:val="2"/>
+        </w:numPr>
+      </w:pPr>
+      <w:r>
+        <w:t>Kỹ năng viết tài liệu kỹ thuật và báo cáo.</w:t>
+      </w:r>
+    </w:p>
+    <w:p>
+      <w:pPr>
+        <w:pStyle w:val="ListParagraph"/>
+        <w:numPr>
+          <w:ilvl w:val="1"/>
+          <w:numId w:val="2"/>
+        </w:numPr>
+      </w:pPr>
+      <w:r>
+        <w:t>Kỹ năng kiểm thử và fix bug có hệ thống.</w:t>
+      </w:r>
+    </w:p>
+    <w:p>
+      <w:pPr>
+        <w:pStyle w:val="ListParagraph"/>
+        <w:numPr>
+          <w:ilvl w:val="0"/>
+          <w:numId w:val="2"/>
+        </w:numPr>
+      </w:pPr>
+      <w:r>
+        <w:t>Thái độ:</w:t>
+      </w:r>
+    </w:p>
+    <w:p>
+      <w:pPr>
+        <w:pStyle w:val="ListParagraph"/>
+        <w:numPr>
+          <w:ilvl w:val="1"/>
+          <w:numId w:val="2"/>
+        </w:numPr>
+      </w:pPr>
+      <w:r>
+        <w:t>Cầu thị, chủ động học hỏi và tiếp thu ý kiến đóng góp.</w:t>
+      </w:r>
+    </w:p>
+    <w:p>
+      <w:pPr>
+        <w:pStyle w:val="ListParagraph"/>
+        <w:numPr>
+          <w:ilvl w:val="1"/>
+          <w:numId w:val="2"/>
+        </w:numPr>
+      </w:pPr>
+      <w:r>
+        <w:t>Cẩn thận, tỉ mỉ trong khi code và kiểm thử.</w:t>
+      </w:r>
+    </w:p>
+    <w:p>
+      <w:pPr>
+        <w:pStyle w:val="ListParagraph"/>
+        <w:numPr>
+          <w:ilvl w:val="1"/>
+          <w:numId w:val="2"/>
+        </w:numPr>
+      </w:pPr>
+      <w:r>
+        <w:t>Trung thực trong báo cáo tiến độ và kết quả công việc.</w:t>
+      </w:r>
+    </w:p>
+    <w:p>
+      <w:pPr>
+        <w:pStyle w:val="ListParagraph"/>
+        <w:numPr>
+          <w:ilvl w:val="1"/>
+          <w:numId w:val="2"/>
+        </w:numPr>
+      </w:pPr>
+      <w:r>
+        <w:t>Có trách nhiệm với sản phẩm bàn giao.</w:t>
+      </w:r>
+    </w:p>
+    <w:p>
+      <w:pPr>
+        <w:pStyle w:val="Heading2"/>
+        <w:rPr>
+          <w:lang w:val="vi-VN"/>
+        </w:rPr>
+      </w:pPr>
+      <w:r>
+        <w:rPr>
+          <w:lang w:val="vi-VN"/>
+        </w:rPr>
+        <w:t>Đánh giá bản thân</w:t>
+      </w:r>
+    </w:p>
+    <w:p>
+      <w:pPr>
+        <w:rPr>
+          <w:b/>
+          <w:bCs/>
+          <w:lang w:val="vi-VN"/>
+        </w:rPr>
+      </w:pPr>
+      <w:r>
+        <w:rPr>
+          <w:b/>
+          <w:bCs/>
+          <w:lang w:val="vi-VN"/>
+        </w:rPr>
+        <w:t>3.2.1. Những điều đã học hỏi và rèn luyện được</w:t>
+      </w:r>
+    </w:p>
+    <w:p>
+      <w:r>
+        <w:rPr>
+          <w:b/>
+          <w:bCs/>
+        </w:rPr>
+        <w:t>Kiến thức:</w:t>
+      </w:r>
+    </w:p>
+    <w:p>
+      <w:pPr>
+        <w:numPr>
+          <w:ilvl w:val="0"/>
+          <w:numId w:val="4"/>
+        </w:numPr>
+      </w:pPr>
+      <w:r>
+        <w:lastRenderedPageBreak/>
+        <w:t>Hiểu rõ nghiệp vụ quản lý buổi thực hành, bài thu hoạch và điểm danh – những chức năng cốt lõi của hệ thống đào tạo.</w:t>
+      </w:r>
+    </w:p>
+    <w:p>
+      <w:pPr>
+        <w:numPr>
+          <w:ilvl w:val="0"/>
+          <w:numId w:val="4"/>
+        </w:numPr>
+      </w:pPr>
+      <w:r>
+        <w:t>Nắm được quy trình triển khai một chức năng từ khảo sát → phân rã API → thiết kế màn hình → code → kiểm thử → deploy.</w:t>
+      </w:r>
+    </w:p>
+    <w:p>
+      <w:pPr>
+        <w:numPr>
+          <w:ilvl w:val="0"/>
+          <w:numId w:val="4"/>
+        </w:numPr>
+      </w:pPr>
+      <w:r>
+        <w:t>Biết cách sử dụng Docker để đóng gói ứng dụng và deploy lên Azure.</w:t>
+      </w:r>
+    </w:p>
+    <w:p>
+      <w:r>
+        <w:rPr>
+          <w:b/>
+          <w:bCs/>
+        </w:rPr>
+        <w:t>Kỹ năng:</w:t>
+      </w:r>
+    </w:p>
+    <w:p>
+      <w:pPr>
+        <w:numPr>
+          <w:ilvl w:val="0"/>
+          <w:numId w:val="5"/>
+        </w:numPr>
+      </w:pPr>
+      <w:r>
+        <w:t>Thành thạo thiết kế API RESTful, kiểm thử bằng Swagger và Postman.</w:t>
+      </w:r>
+    </w:p>
+    <w:p>
+      <w:pPr>
+        <w:numPr>
+          <w:ilvl w:val="0"/>
+          <w:numId w:val="5"/>
+        </w:numPr>
+      </w:pPr>
+      <w:r>
+        <w:t>Rèn luyện kỹ năng trao đổi với cán bộ quản lý để làm rõ yêu cầu, điều chỉnh kịp thời.</w:t>
+      </w:r>
+    </w:p>
+    <w:p>
+      <w:pPr>
+        <w:numPr>
+          <w:ilvl w:val="0"/>
+          <w:numId w:val="5"/>
+        </w:numPr>
+      </w:pPr>
+      <w:r>
+        <w:t>Kỹ năng sử dụng công cụ AI (ChatGPT, Claude) để thiết kế màn hình dự kiến, tăng tốc độ phát triển.</w:t>
+      </w:r>
+    </w:p>
+    <w:p>
+      <w:pPr>
+        <w:numPr>
+          <w:ilvl w:val="0"/>
+          <w:numId w:val="5"/>
+        </w:numPr>
+      </w:pPr>
+      <w:r>
+        <w:t>Kỹ năng quản lý code với Git, viết commit message rõ ràng.</w:t>
+      </w:r>
+    </w:p>
+    <w:p>
+      <w:r>
+        <w:rPr>
+          <w:b/>
+          <w:bCs/>
+        </w:rPr>
+        <w:t>Thái độ:</w:t>
+      </w:r>
+    </w:p>
+    <w:p>
+      <w:pPr>
+        <w:numPr>
+          <w:ilvl w:val="0"/>
+          <w:numId w:val="6"/>
+        </w:numPr>
+      </w:pPr>
+      <w:r>
+        <w:t>Tác phong làm việc chuyên nghiệp hơn: báo cáo tiến độ đúng hạn, chủ động xin phản hồi.</w:t>
+      </w:r>
+    </w:p>
+    <w:p>
+      <w:pPr>
+        <w:numPr>
+          <w:ilvl w:val="0"/>
+          <w:numId w:val="6"/>
+        </w:numPr>
+      </w:pPr>
+      <w:r>
+        <w:t>Kiên nhẫn khi debug và fix lỗi, không bỏ qua lỗi nhỏ.</w:t>
+      </w:r>
+    </w:p>
+    <w:p>
+      <w:pPr>
+        <w:rPr>
+          <w:b/>
+          <w:bCs/>
+        </w:rPr>
+      </w:pPr>
+      <w:r>
+        <w:rPr>
+          <w:b/>
+          <w:bCs/>
+        </w:rPr>
+        <w:t>3.2.2. Những khiếm khuyết, yếu kém còn tồn tại</w:t>
+      </w:r>
+    </w:p>
+    <w:p>
+      <w:pPr>
+        <w:numPr>
+          <w:ilvl w:val="0"/>
+          <w:numId w:val="7"/>
+        </w:numPr>
+      </w:pPr>
+      <w:r>
+        <w:rPr>
+          <w:b/>
+          <w:bCs/>
+        </w:rPr>
+        <w:t>Kiến thức:</w:t>
+      </w:r>
+      <w:r>
+        <w:t> Còn hạn chế về tối ưu hiệu suất truy vấn khi lượng dữ liệu lớn; chưa nắm vững các mẫu kiến trúc nâng cao (Microservices, CQRS).</w:t>
+      </w:r>
+    </w:p>
+    <w:p>
+      <w:pPr>
+        <w:numPr>
+          <w:ilvl w:val="0"/>
+          <w:numId w:val="7"/>
+        </w:numPr>
+      </w:pPr>
+      <w:r>
+        <w:rPr>
+          <w:b/>
+          <w:bCs/>
+        </w:rPr>
+        <w:t>Kỹ năng:</w:t>
+      </w:r>
+      <w:r>
+        <w:t> Kỹ năng viết unit test chưa được thực hành nhiều; việc xử lý ngoại lệ và log trong hệ thống đôi khi chưa chi tiết.</w:t>
+      </w:r>
+    </w:p>
+    <w:p>
+      <w:pPr>
+        <w:numPr>
+          <w:ilvl w:val="0"/>
+          <w:numId w:val="7"/>
+        </w:numPr>
+      </w:pPr>
+      <w:r>
+        <w:rPr>
+          <w:b/>
+          <w:bCs/>
+        </w:rPr>
+        <w:t>Thái độ:</w:t>
+      </w:r>
+      <w:r>
+        <w:t> Thỉnh thoảng còn ngại đặt câu hỏi khi gặp vấn đề phức tạp, dẫn đến mất thời gian tự mày mò.</w:t>
+      </w:r>
+    </w:p>
+    <w:p>
+      <w:pPr>
+        <w:rPr>
+          <w:b/>
+          <w:bCs/>
+        </w:rPr>
+      </w:pPr>
+      <w:r>
+        <w:rPr>
+          <w:b/>
+          <w:bCs/>
+        </w:rPr>
+        <w:t>3.2.3. Hướng khắc phục và bổ sung</w:t>
+      </w:r>
+    </w:p>
+    <w:p>
+      <w:pPr>
+        <w:numPr>
+          <w:ilvl w:val="0"/>
+          <w:numId w:val="8"/>
+        </w:numPr>
+      </w:pPr>
+      <w:r>
+        <w:t>Tự học thêm về tối ưu cơ sở dữ liệu và các bài tập về hiệu năng.</w:t>
+      </w:r>
+    </w:p>
+    <w:p>
+      <w:pPr>
+        <w:numPr>
+          <w:ilvl w:val="0"/>
+          <w:numId w:val="8"/>
+        </w:numPr>
+      </w:pPr>
+      <w:r>
+        <w:t>Thực hành viết unit test cho các API, sử dụng xUnit hoặc NUnit.</w:t>
+      </w:r>
+    </w:p>
+    <w:p>
+      <w:pPr>
+        <w:numPr>
+          <w:ilvl w:val="0"/>
+          <w:numId w:val="8"/>
+        </w:numPr>
+      </w:pPr>
+      <w:r>
+        <w:t>Rèn luyện kỹ năng đặt câu hỏi thông minh, tận dụng sự hỗ trợ của cán bộ hướng dẫn khi cần.</w:t>
+      </w:r>
+    </w:p>
+    <w:p>
+      <w:pPr>
+        <w:numPr>
+          <w:ilvl w:val="0"/>
+          <w:numId w:val="8"/>
+        </w:numPr>
+      </w:pPr>
+      <w:r>
+        <w:lastRenderedPageBreak/>
+        <w:t>Tham gia các khóa học ngắn về CI/CD và Docker nâng cao.</w:t>
+      </w:r>
+    </w:p>
+    <w:p>
+      <w:pPr>
+        <w:pStyle w:val="Heading2"/>
+        <w:rPr>
+          <w:lang w:val="vi-VN"/>
+        </w:rPr>
+      </w:pPr>
+      <w:r>
+        <w:rPr>
+          <w:lang w:val="vi-VN"/>
+        </w:rPr>
+        <w:t>Đề xuất, kiến nghị</w:t>
+      </w:r>
+    </w:p>
+    <w:p>
+      <w:pPr>
+        <w:rPr>
+          <w:b/>
+          <w:bCs/>
+        </w:rPr>
+      </w:pPr>
+      <w:r>
+        <w:rPr>
+          <w:b/>
+          <w:bCs/>
+        </w:rPr>
+        <w:t>3.3.1. Đối với doanh nghiệp</w:t>
+      </w:r>
+    </w:p>
+    <w:p>
+      <w:pPr>
+        <w:numPr>
+          <w:ilvl w:val="0"/>
+          <w:numId w:val="9"/>
+        </w:numPr>
+      </w:pPr>
+      <w:r>
+        <w:t>Nên có tài liệu mô tả nghiệp vụ chi tiết hơn, kèm theo các tình huống đặc biệt (ví dụ: điểm danh bù, sinh viên nộp bài trễ) để sinh viên thực tập dễ hình dung.</w:t>
+      </w:r>
+    </w:p>
+    <w:p>
+      <w:pPr>
+        <w:numPr>
+          <w:ilvl w:val="0"/>
+          <w:numId w:val="9"/>
+        </w:numPr>
+      </w:pPr>
+      <w:r>
+        <w:t>Tạo thêm cơ hội cho thực tập sinh tham gia các buổi họp sprint (nếu dùng Agile) để rèn luyện kỹ năng làm việc nhóm thực tế.</w:t>
+      </w:r>
+    </w:p>
+    <w:p>
+      <w:pPr>
+        <w:rPr>
+          <w:b/>
+          <w:bCs/>
+        </w:rPr>
+      </w:pPr>
+      <w:r>
+        <w:rPr>
+          <w:b/>
+          <w:bCs/>
+        </w:rPr>
+        <w:t>3.3.2. Đối với nhà trường</w:t>
+      </w:r>
+    </w:p>
+    <w:p>
+      <w:pPr>
+        <w:numPr>
+          <w:ilvl w:val="0"/>
+          <w:numId w:val="10"/>
+        </w:numPr>
+      </w:pPr>
+      <w:r>
+        <w:t>Nên bổ sung các bài thực hành về deploy (Docker, CI/CD) vào chương trình học trước khi sinh viên đi thực tập.</w:t>
+      </w:r>
+    </w:p>
+    <w:p>
+      <w:pPr>
+        <w:numPr>
+          <w:ilvl w:val="0"/>
+          <w:numId w:val="10"/>
+        </w:numPr>
+      </w:pPr>
+      <w:r>
+        <w:t>Hướng dẫn sinh viên kỹ năng viết báo cáo và thuyết trình kết quả thực tập một cách bài bản hơn.</w:t>
+      </w:r>
+    </w:p>
+    <w:p>
+      <w:pPr>
+        <w:numPr>
+          <w:ilvl w:val="0"/>
+          <w:numId w:val="10"/>
+        </w:numPr>
+      </w:pPr>
+      <w:r>
+        <w:t>Có thể tổ chức các buổi gặp gỡ giữa doanh nghiệp và sinh viên trước khi thực tập để sinh viên hiểu rõ văn hóa, yêu cầu của doanh nghiệp.</w:t>
+      </w:r>
+    </w:p>
+    <w:p>
+      <w:pPr>
+        <w:rPr>
+          <w:b/>
+          <w:bCs/>
+        </w:rPr>
+      </w:pPr>
+      <w:r>
+        <w:rPr>
+          <w:b/>
+          <w:bCs/>
+        </w:rPr>
+        <w:t>3.3.3. Đối với sinh viên khóa sau</w:t>
+      </w:r>
+    </w:p>
+    <w:p>
+      <w:pPr>
+        <w:numPr>
+          <w:ilvl w:val="0"/>
+          <w:numId w:val="11"/>
+        </w:numPr>
+      </w:pPr>
+      <w:r>
+        <w:t>Chủ động ôn tập kiến thức về lập trình web, cơ sở dữ liệu trước khi đi thực tập.</w:t>
+      </w:r>
+    </w:p>
+    <w:p>
+      <w:pPr>
+        <w:numPr>
+          <w:ilvl w:val="0"/>
+          <w:numId w:val="11"/>
+        </w:numPr>
+      </w:pPr>
+      <w:r>
+        <w:t>Rèn luyện kỹ năng đọc hiểu tài liệu tiếng Anh chuyên ngành.</w:t>
+      </w:r>
+    </w:p>
+    <w:p>
+      <w:pPr>
+        <w:numPr>
+          <w:ilvl w:val="0"/>
+          <w:numId w:val="11"/>
+        </w:numPr>
+      </w:pPr>
+      <w:r>
+        <w:t>Luôn đặt câu hỏi "tại sao" và "như thế nào" khi phân tích nghiệp vụ để hiểu sâu vấn đề.</w:t>
+      </w:r>
+    </w:p>
+    <w:p>
+      <w:pPr>
+        <w:rPr>
+          <w:lang w:val="vi-VN"/>
+        </w:rPr>
+      </w:pPr>
+    </w:p>
+    <w:p>
+      <w:pPr>
+        <w:rPr>
+          <w:lang w:val="vi-VN"/>
+        </w:rPr>
+      </w:pPr>
+    </w:p>
+    <w:p>
+      <w:pPr>
+        <w:rPr>
+          <w:lang w:val="vi-VN"/>
+        </w:rPr>
+      </w:pPr>
+    </w:p>
+    <w:p>
+      <w:pPr>
+        <w:rPr>
+          <w:lang w:val="vi-VN"/>
+        </w:rPr>
+      </w:pPr>
+    </w:p>
+    <w:p>
+      <w:pPr>
+        <w:rPr>
+          <w:lang w:val="vi-VN"/>
+        </w:rPr>
+      </w:pPr>
+    </w:p>
+    <w:p>
+      <w:pPr>
+        <w:rPr>
+          <w:lang w:val="vi-VN"/>
+        </w:rPr>
+      </w:pPr>
+    </w:p>
+    <w:p>
+      <w:pPr>
+        <w:rPr>
+          <w:lang w:val="vi-VN"/>
+        </w:rPr>
+      </w:pPr>
+    </w:p>
+    <w:p>
+      <w:pPr>
+        <w:rPr>
+          <w:lang w:val="vi-VN"/>
+        </w:rPr>
+      </w:pPr>
+    </w:p>
+    <w:p>
+      <w:pPr>
+        <w:rPr>
+          <w:lang w:val="vi-VN"/>
+        </w:rPr>
+      </w:pPr>
+    </w:p>
+    <w:p>
+      <w:pPr>
+        <w:jc w:val="center"/>
+        <w:rPr>
+          <w:b/>
+          <w:bCs/>
+        </w:rPr>
+      </w:pPr>
+      <w:r>
+        <w:rPr>
+          <w:b/>
+          <w:bCs/>
+        </w:rPr>
+        <w:lastRenderedPageBreak/>
+        <w:t>KẾT LUẬN</w:t>
+      </w:r>
+    </w:p>
+    <w:p>
+      <w:r>
+        <w:t xml:space="preserve">Quá trình thực tập từ tuần </w:t>
+      </w:r>
+      <w:r>
+        <w:t>1</w:t>
+      </w:r>
+      <w:r>
+        <w:t xml:space="preserve"> đến tuần 12 đã giúp tôi hoàn thiện các chức năng cốt lõi của hệ thống quản lý đào tạo, bao gồm: </w:t>
+      </w:r>
+      <w:r>
+        <w:rPr>
+          <w:b/>
+          <w:bCs/>
+        </w:rPr>
+        <w:t>quản lý buổi thực hành</w:t>
+      </w:r>
+      <w:r>
+        <w:t>, </w:t>
+      </w:r>
+      <w:r>
+        <w:rPr>
+          <w:b/>
+          <w:bCs/>
+        </w:rPr>
+        <w:t>quản lý bài thu hoạch</w:t>
+      </w:r>
+      <w:r>
+        <w:t>, </w:t>
+      </w:r>
+      <w:r>
+        <w:rPr>
+          <w:b/>
+          <w:bCs/>
+        </w:rPr>
+        <w:t>điểm danh lịch học/buổi thực hành</w:t>
+      </w:r>
+      <w:r>
+        <w:t> và </w:t>
+      </w:r>
+      <w:r>
+        <w:rPr>
+          <w:b/>
+          <w:bCs/>
+        </w:rPr>
+        <w:t>triển khai (deploy) ứng dụng</w:t>
+      </w:r>
+      <w:r>
+        <w:t> lên môi trường production trên Azure.</w:t>
+      </w:r>
+    </w:p>
+    <w:p>
+      <w:r>
+        <w:t>Tôi đã thực hiện được các công việc cụ thể:</w:t>
+      </w:r>
+    </w:p>
+    <w:p>
+      <w:pPr>
+        <w:numPr>
+          <w:ilvl w:val="0"/>
+          <w:numId w:val="12"/>
+        </w:numPr>
+      </w:pPr>
+      <w:r>
+        <w:t>Khảo sát nghiệp vụ, phân rã API, dựng màn hình bằng công cụ AI.</w:t>
+      </w:r>
+    </w:p>
+    <w:p>
+      <w:pPr>
+        <w:numPr>
+          <w:ilvl w:val="0"/>
+          <w:numId w:val="12"/>
+        </w:numPr>
+      </w:pPr>
+      <w:r>
+        <w:t>Code chức năng trên Visual Studio, kiểm thử API bằng Swagger và Postman.</w:t>
+      </w:r>
+    </w:p>
+    <w:p>
+      <w:pPr>
+        <w:numPr>
+          <w:ilvl w:val="0"/>
+          <w:numId w:val="12"/>
+        </w:numPr>
+      </w:pPr>
+      <w:r>
+        <w:t>Đóng gói ứng dụng bằng Docker, triển khai trên Azure, kiểm tra log và biến môi trường.</w:t>
+      </w:r>
+    </w:p>
+    <w:p>
+      <w:pPr>
+        <w:numPr>
+          <w:ilvl w:val="0"/>
+          <w:numId w:val="12"/>
+        </w:numPr>
+      </w:pPr>
+      <w:r>
+        <w:t>Fix bug, kiểm thử toàn diện và bàn giao sản phẩm đúng tiến độ.</w:t>
+      </w:r>
+    </w:p>
+    <w:p>
+      <w:r>
+        <w:t>Qua đó, tôi đã rèn luyện được tư duy phân tích hệ thống, kỹ năng làm việc với cán bộ quản lý, kỹ năng sử dụng công cụ hiện đại (Docker, Git, Postman) cũng như thái độ làm việc chuyên nghiệp, cầu thị.</w:t>
+      </w:r>
+    </w:p>
+    <w:p>
+      <w:r>
+        <w:t>Tuy vẫn còn những khiếm khuyết về tối ưu hiệu suất và viết unit test, nhưng đây là bài học quý giá để tôi tiếp tục hoàn thiện. Trong tương lai, tôi có thể </w:t>
+      </w:r>
+      <w:r>
+        <w:rPr>
+          <w:b/>
+          <w:bCs/>
+        </w:rPr>
+        <w:t>mở rộng vấn đề</w:t>
+      </w:r>
+      <w:r>
+        <w:t> bằng cách tham gia các dự án thực tế lớn hơn (ví dụ: tích hợp thanh toán học phí, xây dựng hệ thống cảnh báo chuyên cần tự động) hoặc nghiên cứu sâu hơn về kiến trúc microservices và CI/CD chuyên nghiệp.</w:t>
+      </w:r>
+    </w:p>
+    <w:p>
+      <w:r>
+        <w:t>Nhìn chung, chương trình thực tập đã giúp tôi trưởng thành hơn về chuyên môn lẫn kỹ năng mềm, tạo nền tảng vững chắc để phát triển sự nghiệp trong lĩnh vực công nghệ phần mềm.</w:t>
+      </w:r>
+    </w:p>
+    <w:p>
+      <w:pPr>
+        <w:rPr>
+          <w:lang w:val="vi-VN"/>
+        </w:rPr>
+      </w:pPr>
+    </w:p>
     <w:p>
       <w:pPr>
         <w:rPr>
@@ -3948,6 +6629,155 @@
 <file path=word/numbering.xml><?xml version="1.0" encoding="utf-8"?>
 <w:numbering xmlns:wpc="http://schemas.microsoft.com/office/word/2010/wordprocessingCanvas" xmlns:cx="http://schemas.microsoft.com/office/drawing/2014/chartex" xmlns:cx1="http://schemas.microsoft.com/office/drawing/2015/9/8/chartex" xmlns:cx2="http://schemas.microsoft.com/office/drawing/2015/10/21/chartex" xmlns:cx3="http://schemas.microsoft.com/office/drawing/2016/5/9/chartex" xmlns:cx4="http://schemas.microsoft.com/office/drawing/2016/5/10/chartex" xmlns:cx5="http://schemas.microsoft.com/office/drawing/2016/5/11/chartex" xmlns:cx6="http://schemas.microsoft.com/office/drawing/2016/5/12/chartex" xmlns:cx7="http://schemas.microsoft.com/office/drawing/2016/5/13/chartex" xmlns:cx8="http://schemas.microsoft.com/office/drawing/2016/5/14/chartex" xmlns:mc="http://schemas.openxmlformats.org/markup-compatibility/2006" xmlns:aink="http://schemas.microsoft.com/office/drawing/2016/ink" xmlns:am3d="http://schemas.microsoft.com/office/drawing/2017/model3d" xmlns:o="urn:schemas-microsoft-com:office:office" xmlns:oel="http://schemas.microsoft.com/office/2019/extlst" xmlns:r="http://schemas.openxmlformats.org/officeDocument/2006/relationships" xmlns:m="http://schemas.openxmlformats.org/officeDocument/2006/math" xmlns:v="urn:schemas-microsoft-com:vml" xmlns:wp14="http://schemas.microsoft.com/office/word/2010/wordprocessingDrawing" xmlns:wp="http://schemas.openxmlformats.org/drawingml/2006/wordprocessingDrawing" xmlns:w10="urn:schemas-microsoft-com:office:word" xmlns:w="http://schemas.openxmlformats.org/wordprocessingml/2006/main" xmlns:w14="http://schemas.microsoft.com/office/word/2010/wordml" xmlns:w15="http://schemas.microsoft.com/office/word/2012/wordml" xmlns:w16cex="http://schemas.microsoft.com/office/word/2018/wordml/cex" xmlns:w16cid="http://schemas.microsoft.com/office/word/2016/wordml/cid" xmlns:w16="http://schemas.microsoft.com/office/word/2018/wordml" xmlns:w16du="http://schemas.microsoft.com/office/word/2023/wordml/word16du" xmlns:w16sdtdh="http://schemas.microsoft.com/office/word/2020/wordml/sdtdatahash" xmlns:w16sdtfl="http://schemas.microsoft.com/office/word/2024/wordml/sdtformatlock" xmlns:w16se="http://schemas.microsoft.com/office/word/2015/wordml/symex" xmlns:wpg="http://schemas.microsoft.com/office/word/2010/wordprocessingGroup" xmlns:wpi="http://schemas.microsoft.com/office/word/2010/wordprocessingInk" xmlns:wne="http://schemas.microsoft.com/office/word/2006/wordml" xmlns:wps="http://schemas.microsoft.com/office/word/2010/wordprocessingShape" mc:Ignorable="w14 w15 w16se w16cid w16 w16cex w16sdtdh w16sdtfl w16du wp14">
   <w:abstractNum w:abstractNumId="0" w15:restartNumberingAfterBreak="0">
+    <w:nsid w:val="17EC6046"/>
+    <w:multiLevelType w:val="multilevel"/>
+    <w:tmpl w:val="4A24AB2E"/>
+    <w:lvl w:ilvl="0">
+      <w:start w:val="1"/>
+      <w:numFmt w:val="bullet"/>
+      <w:lvlText w:val=""/>
+      <w:lvlJc w:val="left"/>
+      <w:pPr>
+        <w:tabs>
+          <w:tab w:val="num" w:pos="720"/>
+        </w:tabs>
+        <w:ind w:left="720" w:hanging="360"/>
+      </w:pPr>
+      <w:rPr>
+        <w:rFonts w:ascii="Symbol" w:hAnsi="Symbol" w:hint="default"/>
+        <w:sz w:val="20"/>
+      </w:rPr>
+    </w:lvl>
+    <w:lvl w:ilvl="1" w:tentative="1">
+      <w:start w:val="1"/>
+      <w:numFmt w:val="bullet"/>
+      <w:lvlText w:val="o"/>
+      <w:lvlJc w:val="left"/>
+      <w:pPr>
+        <w:tabs>
+          <w:tab w:val="num" w:pos="1440"/>
+        </w:tabs>
+        <w:ind w:left="1440" w:hanging="360"/>
+      </w:pPr>
+      <w:rPr>
+        <w:rFonts w:ascii="Courier New" w:hAnsi="Courier New" w:hint="default"/>
+        <w:sz w:val="20"/>
+      </w:rPr>
+    </w:lvl>
+    <w:lvl w:ilvl="2" w:tentative="1">
+      <w:start w:val="1"/>
+      <w:numFmt w:val="bullet"/>
+      <w:lvlText w:val=""/>
+      <w:lvlJc w:val="left"/>
+      <w:pPr>
+        <w:tabs>
+          <w:tab w:val="num" w:pos="2160"/>
+        </w:tabs>
+        <w:ind w:left="2160" w:hanging="360"/>
+      </w:pPr>
+      <w:rPr>
+        <w:rFonts w:ascii="Wingdings" w:hAnsi="Wingdings" w:hint="default"/>
+        <w:sz w:val="20"/>
+      </w:rPr>
+    </w:lvl>
+    <w:lvl w:ilvl="3" w:tentative="1">
+      <w:start w:val="1"/>
+      <w:numFmt w:val="bullet"/>
+      <w:lvlText w:val=""/>
+      <w:lvlJc w:val="left"/>
+      <w:pPr>
+        <w:tabs>
+          <w:tab w:val="num" w:pos="2880"/>
+        </w:tabs>
+        <w:ind w:left="2880" w:hanging="360"/>
+      </w:pPr>
+      <w:rPr>
+        <w:rFonts w:ascii="Wingdings" w:hAnsi="Wingdings" w:hint="default"/>
+        <w:sz w:val="20"/>
+      </w:rPr>
+    </w:lvl>
+    <w:lvl w:ilvl="4" w:tentative="1">
+      <w:start w:val="1"/>
+      <w:numFmt w:val="bullet"/>
+      <w:lvlText w:val=""/>
+      <w:lvlJc w:val="left"/>
+      <w:pPr>
+        <w:tabs>
+          <w:tab w:val="num" w:pos="3600"/>
+        </w:tabs>
+        <w:ind w:left="3600" w:hanging="360"/>
+      </w:pPr>
+      <w:rPr>
+        <w:rFonts w:ascii="Wingdings" w:hAnsi="Wingdings" w:hint="default"/>
+        <w:sz w:val="20"/>
+      </w:rPr>
+    </w:lvl>
+    <w:lvl w:ilvl="5" w:tentative="1">
+      <w:start w:val="1"/>
+      <w:numFmt w:val="bullet"/>
+      <w:lvlText w:val=""/>
+      <w:lvlJc w:val="left"/>
+      <w:pPr>
+        <w:tabs>
+          <w:tab w:val="num" w:pos="4320"/>
+        </w:tabs>
+        <w:ind w:left="4320" w:hanging="360"/>
+      </w:pPr>
+      <w:rPr>
+        <w:rFonts w:ascii="Wingdings" w:hAnsi="Wingdings" w:hint="default"/>
+        <w:sz w:val="20"/>
+      </w:rPr>
+    </w:lvl>
+    <w:lvl w:ilvl="6" w:tentative="1">
+      <w:start w:val="1"/>
+      <w:numFmt w:val="bullet"/>
+      <w:lvlText w:val=""/>
+      <w:lvlJc w:val="left"/>
+      <w:pPr>
+        <w:tabs>
+          <w:tab w:val="num" w:pos="5040"/>
+        </w:tabs>
+        <w:ind w:left="5040" w:hanging="360"/>
+      </w:pPr>
+      <w:rPr>
+        <w:rFonts w:ascii="Wingdings" w:hAnsi="Wingdings" w:hint="default"/>
+        <w:sz w:val="20"/>
+      </w:rPr>
+    </w:lvl>
+    <w:lvl w:ilvl="7" w:tentative="1">
+      <w:start w:val="1"/>
+      <w:numFmt w:val="bullet"/>
+      <w:lvlText w:val=""/>
+      <w:lvlJc w:val="left"/>
+      <w:pPr>
+        <w:tabs>
+          <w:tab w:val="num" w:pos="5760"/>
+        </w:tabs>
+        <w:ind w:left="5760" w:hanging="360"/>
+      </w:pPr>
+      <w:rPr>
+        <w:rFonts w:ascii="Wingdings" w:hAnsi="Wingdings" w:hint="default"/>
+        <w:sz w:val="20"/>
+      </w:rPr>
+    </w:lvl>
+    <w:lvl w:ilvl="8" w:tentative="1">
+      <w:start w:val="1"/>
+      <w:numFmt w:val="bullet"/>
+      <w:lvlText w:val=""/>
+      <w:lvlJc w:val="left"/>
+      <w:pPr>
+        <w:tabs>
+          <w:tab w:val="num" w:pos="6480"/>
+        </w:tabs>
+        <w:ind w:left="6480" w:hanging="360"/>
+      </w:pPr>
+      <w:rPr>
+        <w:rFonts w:ascii="Wingdings" w:hAnsi="Wingdings" w:hint="default"/>
+        <w:sz w:val="20"/>
+      </w:rPr>
+    </w:lvl>
+  </w:abstractNum>
+  <w:abstractNum w:abstractNumId="1" w15:restartNumberingAfterBreak="0">
     <w:nsid w:val="197010B9"/>
     <w:multiLevelType w:val="multilevel"/>
     <w:tmpl w:val="AB94EAA2"/>
@@ -4063,7 +6893,454 @@
       </w:rPr>
     </w:lvl>
   </w:abstractNum>
-  <w:abstractNum w:abstractNumId="1" w15:restartNumberingAfterBreak="0">
+  <w:abstractNum w:abstractNumId="2" w15:restartNumberingAfterBreak="0">
+    <w:nsid w:val="26CD4231"/>
+    <w:multiLevelType w:val="multilevel"/>
+    <w:tmpl w:val="3D2E8708"/>
+    <w:lvl w:ilvl="0">
+      <w:start w:val="1"/>
+      <w:numFmt w:val="bullet"/>
+      <w:lvlText w:val=""/>
+      <w:lvlJc w:val="left"/>
+      <w:pPr>
+        <w:tabs>
+          <w:tab w:val="num" w:pos="720"/>
+        </w:tabs>
+        <w:ind w:left="720" w:hanging="360"/>
+      </w:pPr>
+      <w:rPr>
+        <w:rFonts w:ascii="Symbol" w:hAnsi="Symbol" w:hint="default"/>
+        <w:sz w:val="20"/>
+      </w:rPr>
+    </w:lvl>
+    <w:lvl w:ilvl="1" w:tentative="1">
+      <w:start w:val="1"/>
+      <w:numFmt w:val="bullet"/>
+      <w:lvlText w:val="o"/>
+      <w:lvlJc w:val="left"/>
+      <w:pPr>
+        <w:tabs>
+          <w:tab w:val="num" w:pos="1440"/>
+        </w:tabs>
+        <w:ind w:left="1440" w:hanging="360"/>
+      </w:pPr>
+      <w:rPr>
+        <w:rFonts w:ascii="Courier New" w:hAnsi="Courier New" w:hint="default"/>
+        <w:sz w:val="20"/>
+      </w:rPr>
+    </w:lvl>
+    <w:lvl w:ilvl="2" w:tentative="1">
+      <w:start w:val="1"/>
+      <w:numFmt w:val="bullet"/>
+      <w:lvlText w:val=""/>
+      <w:lvlJc w:val="left"/>
+      <w:pPr>
+        <w:tabs>
+          <w:tab w:val="num" w:pos="2160"/>
+        </w:tabs>
+        <w:ind w:left="2160" w:hanging="360"/>
+      </w:pPr>
+      <w:rPr>
+        <w:rFonts w:ascii="Wingdings" w:hAnsi="Wingdings" w:hint="default"/>
+        <w:sz w:val="20"/>
+      </w:rPr>
+    </w:lvl>
+    <w:lvl w:ilvl="3" w:tentative="1">
+      <w:start w:val="1"/>
+      <w:numFmt w:val="bullet"/>
+      <w:lvlText w:val=""/>
+      <w:lvlJc w:val="left"/>
+      <w:pPr>
+        <w:tabs>
+          <w:tab w:val="num" w:pos="2880"/>
+        </w:tabs>
+        <w:ind w:left="2880" w:hanging="360"/>
+      </w:pPr>
+      <w:rPr>
+        <w:rFonts w:ascii="Wingdings" w:hAnsi="Wingdings" w:hint="default"/>
+        <w:sz w:val="20"/>
+      </w:rPr>
+    </w:lvl>
+    <w:lvl w:ilvl="4" w:tentative="1">
+      <w:start w:val="1"/>
+      <w:numFmt w:val="bullet"/>
+      <w:lvlText w:val=""/>
+      <w:lvlJc w:val="left"/>
+      <w:pPr>
+        <w:tabs>
+          <w:tab w:val="num" w:pos="3600"/>
+        </w:tabs>
+        <w:ind w:left="3600" w:hanging="360"/>
+      </w:pPr>
+      <w:rPr>
+        <w:rFonts w:ascii="Wingdings" w:hAnsi="Wingdings" w:hint="default"/>
+        <w:sz w:val="20"/>
+      </w:rPr>
+    </w:lvl>
+    <w:lvl w:ilvl="5" w:tentative="1">
+      <w:start w:val="1"/>
+      <w:numFmt w:val="bullet"/>
+      <w:lvlText w:val=""/>
+      <w:lvlJc w:val="left"/>
+      <w:pPr>
+        <w:tabs>
+          <w:tab w:val="num" w:pos="4320"/>
+        </w:tabs>
+        <w:ind w:left="4320" w:hanging="360"/>
+      </w:pPr>
+      <w:rPr>
+        <w:rFonts w:ascii="Wingdings" w:hAnsi="Wingdings" w:hint="default"/>
+        <w:sz w:val="20"/>
+      </w:rPr>
+    </w:lvl>
+    <w:lvl w:ilvl="6" w:tentative="1">
+      <w:start w:val="1"/>
+      <w:numFmt w:val="bullet"/>
+      <w:lvlText w:val=""/>
+      <w:lvlJc w:val="left"/>
+      <w:pPr>
+        <w:tabs>
+          <w:tab w:val="num" w:pos="5040"/>
+        </w:tabs>
+        <w:ind w:left="5040" w:hanging="360"/>
+      </w:pPr>
+      <w:rPr>
+        <w:rFonts w:ascii="Wingdings" w:hAnsi="Wingdings" w:hint="default"/>
+        <w:sz w:val="20"/>
+      </w:rPr>
+    </w:lvl>
+    <w:lvl w:ilvl="7" w:tentative="1">
+      <w:start w:val="1"/>
+      <w:numFmt w:val="bullet"/>
+      <w:lvlText w:val=""/>
+      <w:lvlJc w:val="left"/>
+      <w:pPr>
+        <w:tabs>
+          <w:tab w:val="num" w:pos="5760"/>
+        </w:tabs>
+        <w:ind w:left="5760" w:hanging="360"/>
+      </w:pPr>
+      <w:rPr>
+        <w:rFonts w:ascii="Wingdings" w:hAnsi="Wingdings" w:hint="default"/>
+        <w:sz w:val="20"/>
+      </w:rPr>
+    </w:lvl>
+    <w:lvl w:ilvl="8" w:tentative="1">
+      <w:start w:val="1"/>
+      <w:numFmt w:val="bullet"/>
+      <w:lvlText w:val=""/>
+      <w:lvlJc w:val="left"/>
+      <w:pPr>
+        <w:tabs>
+          <w:tab w:val="num" w:pos="6480"/>
+        </w:tabs>
+        <w:ind w:left="6480" w:hanging="360"/>
+      </w:pPr>
+      <w:rPr>
+        <w:rFonts w:ascii="Wingdings" w:hAnsi="Wingdings" w:hint="default"/>
+        <w:sz w:val="20"/>
+      </w:rPr>
+    </w:lvl>
+  </w:abstractNum>
+  <w:abstractNum w:abstractNumId="3" w15:restartNumberingAfterBreak="0">
+    <w:nsid w:val="2E941499"/>
+    <w:multiLevelType w:val="multilevel"/>
+    <w:tmpl w:val="A83CB8A6"/>
+    <w:lvl w:ilvl="0">
+      <w:start w:val="1"/>
+      <w:numFmt w:val="bullet"/>
+      <w:lvlText w:val=""/>
+      <w:lvlJc w:val="left"/>
+      <w:pPr>
+        <w:tabs>
+          <w:tab w:val="num" w:pos="720"/>
+        </w:tabs>
+        <w:ind w:left="720" w:hanging="360"/>
+      </w:pPr>
+      <w:rPr>
+        <w:rFonts w:ascii="Symbol" w:hAnsi="Symbol" w:hint="default"/>
+        <w:sz w:val="20"/>
+      </w:rPr>
+    </w:lvl>
+    <w:lvl w:ilvl="1" w:tentative="1">
+      <w:start w:val="1"/>
+      <w:numFmt w:val="bullet"/>
+      <w:lvlText w:val="o"/>
+      <w:lvlJc w:val="left"/>
+      <w:pPr>
+        <w:tabs>
+          <w:tab w:val="num" w:pos="1440"/>
+        </w:tabs>
+        <w:ind w:left="1440" w:hanging="360"/>
+      </w:pPr>
+      <w:rPr>
+        <w:rFonts w:ascii="Courier New" w:hAnsi="Courier New" w:hint="default"/>
+        <w:sz w:val="20"/>
+      </w:rPr>
+    </w:lvl>
+    <w:lvl w:ilvl="2" w:tentative="1">
+      <w:start w:val="1"/>
+      <w:numFmt w:val="bullet"/>
+      <w:lvlText w:val=""/>
+      <w:lvlJc w:val="left"/>
+      <w:pPr>
+        <w:tabs>
+          <w:tab w:val="num" w:pos="2160"/>
+        </w:tabs>
+        <w:ind w:left="2160" w:hanging="360"/>
+      </w:pPr>
+      <w:rPr>
+        <w:rFonts w:ascii="Wingdings" w:hAnsi="Wingdings" w:hint="default"/>
+        <w:sz w:val="20"/>
+      </w:rPr>
+    </w:lvl>
+    <w:lvl w:ilvl="3" w:tentative="1">
+      <w:start w:val="1"/>
+      <w:numFmt w:val="bullet"/>
+      <w:lvlText w:val=""/>
+      <w:lvlJc w:val="left"/>
+      <w:pPr>
+        <w:tabs>
+          <w:tab w:val="num" w:pos="2880"/>
+        </w:tabs>
+        <w:ind w:left="2880" w:hanging="360"/>
+      </w:pPr>
+      <w:rPr>
+        <w:rFonts w:ascii="Wingdings" w:hAnsi="Wingdings" w:hint="default"/>
+        <w:sz w:val="20"/>
+      </w:rPr>
+    </w:lvl>
+    <w:lvl w:ilvl="4" w:tentative="1">
+      <w:start w:val="1"/>
+      <w:numFmt w:val="bullet"/>
+      <w:lvlText w:val=""/>
+      <w:lvlJc w:val="left"/>
+      <w:pPr>
+        <w:tabs>
+          <w:tab w:val="num" w:pos="3600"/>
+        </w:tabs>
+        <w:ind w:left="3600" w:hanging="360"/>
+      </w:pPr>
+      <w:rPr>
+        <w:rFonts w:ascii="Wingdings" w:hAnsi="Wingdings" w:hint="default"/>
+        <w:sz w:val="20"/>
+      </w:rPr>
+    </w:lvl>
+    <w:lvl w:ilvl="5" w:tentative="1">
+      <w:start w:val="1"/>
+      <w:numFmt w:val="bullet"/>
+      <w:lvlText w:val=""/>
+      <w:lvlJc w:val="left"/>
+      <w:pPr>
+        <w:tabs>
+          <w:tab w:val="num" w:pos="4320"/>
+        </w:tabs>
+        <w:ind w:left="4320" w:hanging="360"/>
+      </w:pPr>
+      <w:rPr>
+        <w:rFonts w:ascii="Wingdings" w:hAnsi="Wingdings" w:hint="default"/>
+        <w:sz w:val="20"/>
+      </w:rPr>
+    </w:lvl>
+    <w:lvl w:ilvl="6" w:tentative="1">
+      <w:start w:val="1"/>
+      <w:numFmt w:val="bullet"/>
+      <w:lvlText w:val=""/>
+      <w:lvlJc w:val="left"/>
+      <w:pPr>
+        <w:tabs>
+          <w:tab w:val="num" w:pos="5040"/>
+        </w:tabs>
+        <w:ind w:left="5040" w:hanging="360"/>
+      </w:pPr>
+      <w:rPr>
+        <w:rFonts w:ascii="Wingdings" w:hAnsi="Wingdings" w:hint="default"/>
+        <w:sz w:val="20"/>
+      </w:rPr>
+    </w:lvl>
+    <w:lvl w:ilvl="7" w:tentative="1">
+      <w:start w:val="1"/>
+      <w:numFmt w:val="bullet"/>
+      <w:lvlText w:val=""/>
+      <w:lvlJc w:val="left"/>
+      <w:pPr>
+        <w:tabs>
+          <w:tab w:val="num" w:pos="5760"/>
+        </w:tabs>
+        <w:ind w:left="5760" w:hanging="360"/>
+      </w:pPr>
+      <w:rPr>
+        <w:rFonts w:ascii="Wingdings" w:hAnsi="Wingdings" w:hint="default"/>
+        <w:sz w:val="20"/>
+      </w:rPr>
+    </w:lvl>
+    <w:lvl w:ilvl="8" w:tentative="1">
+      <w:start w:val="1"/>
+      <w:numFmt w:val="bullet"/>
+      <w:lvlText w:val=""/>
+      <w:lvlJc w:val="left"/>
+      <w:pPr>
+        <w:tabs>
+          <w:tab w:val="num" w:pos="6480"/>
+        </w:tabs>
+        <w:ind w:left="6480" w:hanging="360"/>
+      </w:pPr>
+      <w:rPr>
+        <w:rFonts w:ascii="Wingdings" w:hAnsi="Wingdings" w:hint="default"/>
+        <w:sz w:val="20"/>
+      </w:rPr>
+    </w:lvl>
+  </w:abstractNum>
+  <w:abstractNum w:abstractNumId="4" w15:restartNumberingAfterBreak="0">
+    <w:nsid w:val="34141EFC"/>
+    <w:multiLevelType w:val="multilevel"/>
+    <w:tmpl w:val="D5166230"/>
+    <w:lvl w:ilvl="0">
+      <w:start w:val="1"/>
+      <w:numFmt w:val="bullet"/>
+      <w:lvlText w:val=""/>
+      <w:lvlJc w:val="left"/>
+      <w:pPr>
+        <w:tabs>
+          <w:tab w:val="num" w:pos="720"/>
+        </w:tabs>
+        <w:ind w:left="720" w:hanging="360"/>
+      </w:pPr>
+      <w:rPr>
+        <w:rFonts w:ascii="Symbol" w:hAnsi="Symbol" w:hint="default"/>
+        <w:sz w:val="20"/>
+      </w:rPr>
+    </w:lvl>
+    <w:lvl w:ilvl="1" w:tentative="1">
+      <w:start w:val="1"/>
+      <w:numFmt w:val="bullet"/>
+      <w:lvlText w:val="o"/>
+      <w:lvlJc w:val="left"/>
+      <w:pPr>
+        <w:tabs>
+          <w:tab w:val="num" w:pos="1440"/>
+        </w:tabs>
+        <w:ind w:left="1440" w:hanging="360"/>
+      </w:pPr>
+      <w:rPr>
+        <w:rFonts w:ascii="Courier New" w:hAnsi="Courier New" w:hint="default"/>
+        <w:sz w:val="20"/>
+      </w:rPr>
+    </w:lvl>
+    <w:lvl w:ilvl="2" w:tentative="1">
+      <w:start w:val="1"/>
+      <w:numFmt w:val="bullet"/>
+      <w:lvlText w:val=""/>
+      <w:lvlJc w:val="left"/>
+      <w:pPr>
+        <w:tabs>
+          <w:tab w:val="num" w:pos="2160"/>
+        </w:tabs>
+        <w:ind w:left="2160" w:hanging="360"/>
+      </w:pPr>
+      <w:rPr>
+        <w:rFonts w:ascii="Wingdings" w:hAnsi="Wingdings" w:hint="default"/>
+        <w:sz w:val="20"/>
+      </w:rPr>
+    </w:lvl>
+    <w:lvl w:ilvl="3" w:tentative="1">
+      <w:start w:val="1"/>
+      <w:numFmt w:val="bullet"/>
+      <w:lvlText w:val=""/>
+      <w:lvlJc w:val="left"/>
+      <w:pPr>
+        <w:tabs>
+          <w:tab w:val="num" w:pos="2880"/>
+        </w:tabs>
+        <w:ind w:left="2880" w:hanging="360"/>
+      </w:pPr>
+      <w:rPr>
+        <w:rFonts w:ascii="Wingdings" w:hAnsi="Wingdings" w:hint="default"/>
+        <w:sz w:val="20"/>
+      </w:rPr>
+    </w:lvl>
+    <w:lvl w:ilvl="4" w:tentative="1">
+      <w:start w:val="1"/>
+      <w:numFmt w:val="bullet"/>
+      <w:lvlText w:val=""/>
+      <w:lvlJc w:val="left"/>
+      <w:pPr>
+        <w:tabs>
+          <w:tab w:val="num" w:pos="3600"/>
+        </w:tabs>
+        <w:ind w:left="3600" w:hanging="360"/>
+      </w:pPr>
+      <w:rPr>
+        <w:rFonts w:ascii="Wingdings" w:hAnsi="Wingdings" w:hint="default"/>
+        <w:sz w:val="20"/>
+      </w:rPr>
+    </w:lvl>
+    <w:lvl w:ilvl="5" w:tentative="1">
+      <w:start w:val="1"/>
+      <w:numFmt w:val="bullet"/>
+      <w:lvlText w:val=""/>
+      <w:lvlJc w:val="left"/>
+      <w:pPr>
+        <w:tabs>
+          <w:tab w:val="num" w:pos="4320"/>
+        </w:tabs>
+        <w:ind w:left="4320" w:hanging="360"/>
+      </w:pPr>
+      <w:rPr>
+        <w:rFonts w:ascii="Wingdings" w:hAnsi="Wingdings" w:hint="default"/>
+        <w:sz w:val="20"/>
+      </w:rPr>
+    </w:lvl>
+    <w:lvl w:ilvl="6" w:tentative="1">
+      <w:start w:val="1"/>
+      <w:numFmt w:val="bullet"/>
+      <w:lvlText w:val=""/>
+      <w:lvlJc w:val="left"/>
+      <w:pPr>
+        <w:tabs>
+          <w:tab w:val="num" w:pos="5040"/>
+        </w:tabs>
+        <w:ind w:left="5040" w:hanging="360"/>
+      </w:pPr>
+      <w:rPr>
+        <w:rFonts w:ascii="Wingdings" w:hAnsi="Wingdings" w:hint="default"/>
+        <w:sz w:val="20"/>
+      </w:rPr>
+    </w:lvl>
+    <w:lvl w:ilvl="7" w:tentative="1">
+      <w:start w:val="1"/>
+      <w:numFmt w:val="bullet"/>
+      <w:lvlText w:val=""/>
+      <w:lvlJc w:val="left"/>
+      <w:pPr>
+        <w:tabs>
+          <w:tab w:val="num" w:pos="5760"/>
+        </w:tabs>
+        <w:ind w:left="5760" w:hanging="360"/>
+      </w:pPr>
+      <w:rPr>
+        <w:rFonts w:ascii="Wingdings" w:hAnsi="Wingdings" w:hint="default"/>
+        <w:sz w:val="20"/>
+      </w:rPr>
+    </w:lvl>
+    <w:lvl w:ilvl="8" w:tentative="1">
+      <w:start w:val="1"/>
+      <w:numFmt w:val="bullet"/>
+      <w:lvlText w:val=""/>
+      <w:lvlJc w:val="left"/>
+      <w:pPr>
+        <w:tabs>
+          <w:tab w:val="num" w:pos="6480"/>
+        </w:tabs>
+        <w:ind w:left="6480" w:hanging="360"/>
+      </w:pPr>
+      <w:rPr>
+        <w:rFonts w:ascii="Wingdings" w:hAnsi="Wingdings" w:hint="default"/>
+        <w:sz w:val="20"/>
+      </w:rPr>
+    </w:lvl>
+  </w:abstractNum>
+  <w:abstractNum w:abstractNumId="5" w15:restartNumberingAfterBreak="0">
     <w:nsid w:val="481646AC"/>
     <w:multiLevelType w:val="hybridMultilevel"/>
     <w:tmpl w:val="475E41CC"/>
@@ -4175,11 +7452,935 @@
       </w:rPr>
     </w:lvl>
   </w:abstractNum>
+  <w:abstractNum w:abstractNumId="6" w15:restartNumberingAfterBreak="0">
+    <w:nsid w:val="580032D6"/>
+    <w:multiLevelType w:val="multilevel"/>
+    <w:tmpl w:val="FE42ACBA"/>
+    <w:lvl w:ilvl="0">
+      <w:start w:val="1"/>
+      <w:numFmt w:val="bullet"/>
+      <w:lvlText w:val=""/>
+      <w:lvlJc w:val="left"/>
+      <w:pPr>
+        <w:tabs>
+          <w:tab w:val="num" w:pos="720"/>
+        </w:tabs>
+        <w:ind w:left="720" w:hanging="360"/>
+      </w:pPr>
+      <w:rPr>
+        <w:rFonts w:ascii="Symbol" w:hAnsi="Symbol" w:hint="default"/>
+        <w:sz w:val="20"/>
+      </w:rPr>
+    </w:lvl>
+    <w:lvl w:ilvl="1" w:tentative="1">
+      <w:start w:val="1"/>
+      <w:numFmt w:val="bullet"/>
+      <w:lvlText w:val="o"/>
+      <w:lvlJc w:val="left"/>
+      <w:pPr>
+        <w:tabs>
+          <w:tab w:val="num" w:pos="1440"/>
+        </w:tabs>
+        <w:ind w:left="1440" w:hanging="360"/>
+      </w:pPr>
+      <w:rPr>
+        <w:rFonts w:ascii="Courier New" w:hAnsi="Courier New" w:hint="default"/>
+        <w:sz w:val="20"/>
+      </w:rPr>
+    </w:lvl>
+    <w:lvl w:ilvl="2" w:tentative="1">
+      <w:start w:val="1"/>
+      <w:numFmt w:val="bullet"/>
+      <w:lvlText w:val=""/>
+      <w:lvlJc w:val="left"/>
+      <w:pPr>
+        <w:tabs>
+          <w:tab w:val="num" w:pos="2160"/>
+        </w:tabs>
+        <w:ind w:left="2160" w:hanging="360"/>
+      </w:pPr>
+      <w:rPr>
+        <w:rFonts w:ascii="Wingdings" w:hAnsi="Wingdings" w:hint="default"/>
+        <w:sz w:val="20"/>
+      </w:rPr>
+    </w:lvl>
+    <w:lvl w:ilvl="3" w:tentative="1">
+      <w:start w:val="1"/>
+      <w:numFmt w:val="bullet"/>
+      <w:lvlText w:val=""/>
+      <w:lvlJc w:val="left"/>
+      <w:pPr>
+        <w:tabs>
+          <w:tab w:val="num" w:pos="2880"/>
+        </w:tabs>
+        <w:ind w:left="2880" w:hanging="360"/>
+      </w:pPr>
+      <w:rPr>
+        <w:rFonts w:ascii="Wingdings" w:hAnsi="Wingdings" w:hint="default"/>
+        <w:sz w:val="20"/>
+      </w:rPr>
+    </w:lvl>
+    <w:lvl w:ilvl="4" w:tentative="1">
+      <w:start w:val="1"/>
+      <w:numFmt w:val="bullet"/>
+      <w:lvlText w:val=""/>
+      <w:lvlJc w:val="left"/>
+      <w:pPr>
+        <w:tabs>
+          <w:tab w:val="num" w:pos="3600"/>
+        </w:tabs>
+        <w:ind w:left="3600" w:hanging="360"/>
+      </w:pPr>
+      <w:rPr>
+        <w:rFonts w:ascii="Wingdings" w:hAnsi="Wingdings" w:hint="default"/>
+        <w:sz w:val="20"/>
+      </w:rPr>
+    </w:lvl>
+    <w:lvl w:ilvl="5" w:tentative="1">
+      <w:start w:val="1"/>
+      <w:numFmt w:val="bullet"/>
+      <w:lvlText w:val=""/>
+      <w:lvlJc w:val="left"/>
+      <w:pPr>
+        <w:tabs>
+          <w:tab w:val="num" w:pos="4320"/>
+        </w:tabs>
+        <w:ind w:left="4320" w:hanging="360"/>
+      </w:pPr>
+      <w:rPr>
+        <w:rFonts w:ascii="Wingdings" w:hAnsi="Wingdings" w:hint="default"/>
+        <w:sz w:val="20"/>
+      </w:rPr>
+    </w:lvl>
+    <w:lvl w:ilvl="6" w:tentative="1">
+      <w:start w:val="1"/>
+      <w:numFmt w:val="bullet"/>
+      <w:lvlText w:val=""/>
+      <w:lvlJc w:val="left"/>
+      <w:pPr>
+        <w:tabs>
+          <w:tab w:val="num" w:pos="5040"/>
+        </w:tabs>
+        <w:ind w:left="5040" w:hanging="360"/>
+      </w:pPr>
+      <w:rPr>
+        <w:rFonts w:ascii="Wingdings" w:hAnsi="Wingdings" w:hint="default"/>
+        <w:sz w:val="20"/>
+      </w:rPr>
+    </w:lvl>
+    <w:lvl w:ilvl="7" w:tentative="1">
+      <w:start w:val="1"/>
+      <w:numFmt w:val="bullet"/>
+      <w:lvlText w:val=""/>
+      <w:lvlJc w:val="left"/>
+      <w:pPr>
+        <w:tabs>
+          <w:tab w:val="num" w:pos="5760"/>
+        </w:tabs>
+        <w:ind w:left="5760" w:hanging="360"/>
+      </w:pPr>
+      <w:rPr>
+        <w:rFonts w:ascii="Wingdings" w:hAnsi="Wingdings" w:hint="default"/>
+        <w:sz w:val="20"/>
+      </w:rPr>
+    </w:lvl>
+    <w:lvl w:ilvl="8" w:tentative="1">
+      <w:start w:val="1"/>
+      <w:numFmt w:val="bullet"/>
+      <w:lvlText w:val=""/>
+      <w:lvlJc w:val="left"/>
+      <w:pPr>
+        <w:tabs>
+          <w:tab w:val="num" w:pos="6480"/>
+        </w:tabs>
+        <w:ind w:left="6480" w:hanging="360"/>
+      </w:pPr>
+      <w:rPr>
+        <w:rFonts w:ascii="Wingdings" w:hAnsi="Wingdings" w:hint="default"/>
+        <w:sz w:val="20"/>
+      </w:rPr>
+    </w:lvl>
+  </w:abstractNum>
+  <w:abstractNum w:abstractNumId="7" w15:restartNumberingAfterBreak="0">
+    <w:nsid w:val="64195835"/>
+    <w:multiLevelType w:val="multilevel"/>
+    <w:tmpl w:val="5AC815FC"/>
+    <w:lvl w:ilvl="0">
+      <w:start w:val="1"/>
+      <w:numFmt w:val="bullet"/>
+      <w:lvlText w:val=""/>
+      <w:lvlJc w:val="left"/>
+      <w:pPr>
+        <w:tabs>
+          <w:tab w:val="num" w:pos="720"/>
+        </w:tabs>
+        <w:ind w:left="720" w:hanging="360"/>
+      </w:pPr>
+      <w:rPr>
+        <w:rFonts w:ascii="Symbol" w:hAnsi="Symbol" w:hint="default"/>
+        <w:sz w:val="20"/>
+      </w:rPr>
+    </w:lvl>
+    <w:lvl w:ilvl="1" w:tentative="1">
+      <w:start w:val="1"/>
+      <w:numFmt w:val="bullet"/>
+      <w:lvlText w:val="o"/>
+      <w:lvlJc w:val="left"/>
+      <w:pPr>
+        <w:tabs>
+          <w:tab w:val="num" w:pos="1440"/>
+        </w:tabs>
+        <w:ind w:left="1440" w:hanging="360"/>
+      </w:pPr>
+      <w:rPr>
+        <w:rFonts w:ascii="Courier New" w:hAnsi="Courier New" w:hint="default"/>
+        <w:sz w:val="20"/>
+      </w:rPr>
+    </w:lvl>
+    <w:lvl w:ilvl="2" w:tentative="1">
+      <w:start w:val="1"/>
+      <w:numFmt w:val="bullet"/>
+      <w:lvlText w:val=""/>
+      <w:lvlJc w:val="left"/>
+      <w:pPr>
+        <w:tabs>
+          <w:tab w:val="num" w:pos="2160"/>
+        </w:tabs>
+        <w:ind w:left="2160" w:hanging="360"/>
+      </w:pPr>
+      <w:rPr>
+        <w:rFonts w:ascii="Wingdings" w:hAnsi="Wingdings" w:hint="default"/>
+        <w:sz w:val="20"/>
+      </w:rPr>
+    </w:lvl>
+    <w:lvl w:ilvl="3" w:tentative="1">
+      <w:start w:val="1"/>
+      <w:numFmt w:val="bullet"/>
+      <w:lvlText w:val=""/>
+      <w:lvlJc w:val="left"/>
+      <w:pPr>
+        <w:tabs>
+          <w:tab w:val="num" w:pos="2880"/>
+        </w:tabs>
+        <w:ind w:left="2880" w:hanging="360"/>
+      </w:pPr>
+      <w:rPr>
+        <w:rFonts w:ascii="Wingdings" w:hAnsi="Wingdings" w:hint="default"/>
+        <w:sz w:val="20"/>
+      </w:rPr>
+    </w:lvl>
+    <w:lvl w:ilvl="4" w:tentative="1">
+      <w:start w:val="1"/>
+      <w:numFmt w:val="bullet"/>
+      <w:lvlText w:val=""/>
+      <w:lvlJc w:val="left"/>
+      <w:pPr>
+        <w:tabs>
+          <w:tab w:val="num" w:pos="3600"/>
+        </w:tabs>
+        <w:ind w:left="3600" w:hanging="360"/>
+      </w:pPr>
+      <w:rPr>
+        <w:rFonts w:ascii="Wingdings" w:hAnsi="Wingdings" w:hint="default"/>
+        <w:sz w:val="20"/>
+      </w:rPr>
+    </w:lvl>
+    <w:lvl w:ilvl="5" w:tentative="1">
+      <w:start w:val="1"/>
+      <w:numFmt w:val="bullet"/>
+      <w:lvlText w:val=""/>
+      <w:lvlJc w:val="left"/>
+      <w:pPr>
+        <w:tabs>
+          <w:tab w:val="num" w:pos="4320"/>
+        </w:tabs>
+        <w:ind w:left="4320" w:hanging="360"/>
+      </w:pPr>
+      <w:rPr>
+        <w:rFonts w:ascii="Wingdings" w:hAnsi="Wingdings" w:hint="default"/>
+        <w:sz w:val="20"/>
+      </w:rPr>
+    </w:lvl>
+    <w:lvl w:ilvl="6" w:tentative="1">
+      <w:start w:val="1"/>
+      <w:numFmt w:val="bullet"/>
+      <w:lvlText w:val=""/>
+      <w:lvlJc w:val="left"/>
+      <w:pPr>
+        <w:tabs>
+          <w:tab w:val="num" w:pos="5040"/>
+        </w:tabs>
+        <w:ind w:left="5040" w:hanging="360"/>
+      </w:pPr>
+      <w:rPr>
+        <w:rFonts w:ascii="Wingdings" w:hAnsi="Wingdings" w:hint="default"/>
+        <w:sz w:val="20"/>
+      </w:rPr>
+    </w:lvl>
+    <w:lvl w:ilvl="7" w:tentative="1">
+      <w:start w:val="1"/>
+      <w:numFmt w:val="bullet"/>
+      <w:lvlText w:val=""/>
+      <w:lvlJc w:val="left"/>
+      <w:pPr>
+        <w:tabs>
+          <w:tab w:val="num" w:pos="5760"/>
+        </w:tabs>
+        <w:ind w:left="5760" w:hanging="360"/>
+      </w:pPr>
+      <w:rPr>
+        <w:rFonts w:ascii="Wingdings" w:hAnsi="Wingdings" w:hint="default"/>
+        <w:sz w:val="20"/>
+      </w:rPr>
+    </w:lvl>
+    <w:lvl w:ilvl="8" w:tentative="1">
+      <w:start w:val="1"/>
+      <w:numFmt w:val="bullet"/>
+      <w:lvlText w:val=""/>
+      <w:lvlJc w:val="left"/>
+      <w:pPr>
+        <w:tabs>
+          <w:tab w:val="num" w:pos="6480"/>
+        </w:tabs>
+        <w:ind w:left="6480" w:hanging="360"/>
+      </w:pPr>
+      <w:rPr>
+        <w:rFonts w:ascii="Wingdings" w:hAnsi="Wingdings" w:hint="default"/>
+        <w:sz w:val="20"/>
+      </w:rPr>
+    </w:lvl>
+  </w:abstractNum>
+  <w:abstractNum w:abstractNumId="8" w15:restartNumberingAfterBreak="0">
+    <w:nsid w:val="643353B2"/>
+    <w:multiLevelType w:val="multilevel"/>
+    <w:tmpl w:val="2E886E36"/>
+    <w:lvl w:ilvl="0">
+      <w:start w:val="1"/>
+      <w:numFmt w:val="bullet"/>
+      <w:lvlText w:val=""/>
+      <w:lvlJc w:val="left"/>
+      <w:pPr>
+        <w:tabs>
+          <w:tab w:val="num" w:pos="720"/>
+        </w:tabs>
+        <w:ind w:left="720" w:hanging="360"/>
+      </w:pPr>
+      <w:rPr>
+        <w:rFonts w:ascii="Symbol" w:hAnsi="Symbol" w:hint="default"/>
+        <w:sz w:val="20"/>
+      </w:rPr>
+    </w:lvl>
+    <w:lvl w:ilvl="1">
+      <w:start w:val="1"/>
+      <w:numFmt w:val="bullet"/>
+      <w:lvlText w:val="o"/>
+      <w:lvlJc w:val="left"/>
+      <w:pPr>
+        <w:tabs>
+          <w:tab w:val="num" w:pos="1440"/>
+        </w:tabs>
+        <w:ind w:left="1440" w:hanging="360"/>
+      </w:pPr>
+      <w:rPr>
+        <w:rFonts w:ascii="Courier New" w:hAnsi="Courier New" w:hint="default"/>
+        <w:sz w:val="20"/>
+      </w:rPr>
+    </w:lvl>
+    <w:lvl w:ilvl="2" w:tentative="1">
+      <w:start w:val="1"/>
+      <w:numFmt w:val="bullet"/>
+      <w:lvlText w:val=""/>
+      <w:lvlJc w:val="left"/>
+      <w:pPr>
+        <w:tabs>
+          <w:tab w:val="num" w:pos="2160"/>
+        </w:tabs>
+        <w:ind w:left="2160" w:hanging="360"/>
+      </w:pPr>
+      <w:rPr>
+        <w:rFonts w:ascii="Wingdings" w:hAnsi="Wingdings" w:hint="default"/>
+        <w:sz w:val="20"/>
+      </w:rPr>
+    </w:lvl>
+    <w:lvl w:ilvl="3" w:tentative="1">
+      <w:start w:val="1"/>
+      <w:numFmt w:val="bullet"/>
+      <w:lvlText w:val=""/>
+      <w:lvlJc w:val="left"/>
+      <w:pPr>
+        <w:tabs>
+          <w:tab w:val="num" w:pos="2880"/>
+        </w:tabs>
+        <w:ind w:left="2880" w:hanging="360"/>
+      </w:pPr>
+      <w:rPr>
+        <w:rFonts w:ascii="Wingdings" w:hAnsi="Wingdings" w:hint="default"/>
+        <w:sz w:val="20"/>
+      </w:rPr>
+    </w:lvl>
+    <w:lvl w:ilvl="4" w:tentative="1">
+      <w:start w:val="1"/>
+      <w:numFmt w:val="bullet"/>
+      <w:lvlText w:val=""/>
+      <w:lvlJc w:val="left"/>
+      <w:pPr>
+        <w:tabs>
+          <w:tab w:val="num" w:pos="3600"/>
+        </w:tabs>
+        <w:ind w:left="3600" w:hanging="360"/>
+      </w:pPr>
+      <w:rPr>
+        <w:rFonts w:ascii="Wingdings" w:hAnsi="Wingdings" w:hint="default"/>
+        <w:sz w:val="20"/>
+      </w:rPr>
+    </w:lvl>
+    <w:lvl w:ilvl="5" w:tentative="1">
+      <w:start w:val="1"/>
+      <w:numFmt w:val="bullet"/>
+      <w:lvlText w:val=""/>
+      <w:lvlJc w:val="left"/>
+      <w:pPr>
+        <w:tabs>
+          <w:tab w:val="num" w:pos="4320"/>
+        </w:tabs>
+        <w:ind w:left="4320" w:hanging="360"/>
+      </w:pPr>
+      <w:rPr>
+        <w:rFonts w:ascii="Wingdings" w:hAnsi="Wingdings" w:hint="default"/>
+        <w:sz w:val="20"/>
+      </w:rPr>
+    </w:lvl>
+    <w:lvl w:ilvl="6" w:tentative="1">
+      <w:start w:val="1"/>
+      <w:numFmt w:val="bullet"/>
+      <w:lvlText w:val=""/>
+      <w:lvlJc w:val="left"/>
+      <w:pPr>
+        <w:tabs>
+          <w:tab w:val="num" w:pos="5040"/>
+        </w:tabs>
+        <w:ind w:left="5040" w:hanging="360"/>
+      </w:pPr>
+      <w:rPr>
+        <w:rFonts w:ascii="Wingdings" w:hAnsi="Wingdings" w:hint="default"/>
+        <w:sz w:val="20"/>
+      </w:rPr>
+    </w:lvl>
+    <w:lvl w:ilvl="7" w:tentative="1">
+      <w:start w:val="1"/>
+      <w:numFmt w:val="bullet"/>
+      <w:lvlText w:val=""/>
+      <w:lvlJc w:val="left"/>
+      <w:pPr>
+        <w:tabs>
+          <w:tab w:val="num" w:pos="5760"/>
+        </w:tabs>
+        <w:ind w:left="5760" w:hanging="360"/>
+      </w:pPr>
+      <w:rPr>
+        <w:rFonts w:ascii="Wingdings" w:hAnsi="Wingdings" w:hint="default"/>
+        <w:sz w:val="20"/>
+      </w:rPr>
+    </w:lvl>
+    <w:lvl w:ilvl="8" w:tentative="1">
+      <w:start w:val="1"/>
+      <w:numFmt w:val="bullet"/>
+      <w:lvlText w:val=""/>
+      <w:lvlJc w:val="left"/>
+      <w:pPr>
+        <w:tabs>
+          <w:tab w:val="num" w:pos="6480"/>
+        </w:tabs>
+        <w:ind w:left="6480" w:hanging="360"/>
+      </w:pPr>
+      <w:rPr>
+        <w:rFonts w:ascii="Wingdings" w:hAnsi="Wingdings" w:hint="default"/>
+        <w:sz w:val="20"/>
+      </w:rPr>
+    </w:lvl>
+  </w:abstractNum>
+  <w:abstractNum w:abstractNumId="9" w15:restartNumberingAfterBreak="0">
+    <w:nsid w:val="77136134"/>
+    <w:multiLevelType w:val="multilevel"/>
+    <w:tmpl w:val="B5644BB8"/>
+    <w:lvl w:ilvl="0">
+      <w:start w:val="1"/>
+      <w:numFmt w:val="bullet"/>
+      <w:lvlText w:val=""/>
+      <w:lvlJc w:val="left"/>
+      <w:pPr>
+        <w:tabs>
+          <w:tab w:val="num" w:pos="720"/>
+        </w:tabs>
+        <w:ind w:left="720" w:hanging="360"/>
+      </w:pPr>
+      <w:rPr>
+        <w:rFonts w:ascii="Symbol" w:hAnsi="Symbol" w:hint="default"/>
+        <w:sz w:val="20"/>
+      </w:rPr>
+    </w:lvl>
+    <w:lvl w:ilvl="1" w:tentative="1">
+      <w:start w:val="1"/>
+      <w:numFmt w:val="bullet"/>
+      <w:lvlText w:val="o"/>
+      <w:lvlJc w:val="left"/>
+      <w:pPr>
+        <w:tabs>
+          <w:tab w:val="num" w:pos="1440"/>
+        </w:tabs>
+        <w:ind w:left="1440" w:hanging="360"/>
+      </w:pPr>
+      <w:rPr>
+        <w:rFonts w:ascii="Courier New" w:hAnsi="Courier New" w:hint="default"/>
+        <w:sz w:val="20"/>
+      </w:rPr>
+    </w:lvl>
+    <w:lvl w:ilvl="2" w:tentative="1">
+      <w:start w:val="1"/>
+      <w:numFmt w:val="bullet"/>
+      <w:lvlText w:val=""/>
+      <w:lvlJc w:val="left"/>
+      <w:pPr>
+        <w:tabs>
+          <w:tab w:val="num" w:pos="2160"/>
+        </w:tabs>
+        <w:ind w:left="2160" w:hanging="360"/>
+      </w:pPr>
+      <w:rPr>
+        <w:rFonts w:ascii="Wingdings" w:hAnsi="Wingdings" w:hint="default"/>
+        <w:sz w:val="20"/>
+      </w:rPr>
+    </w:lvl>
+    <w:lvl w:ilvl="3" w:tentative="1">
+      <w:start w:val="1"/>
+      <w:numFmt w:val="bullet"/>
+      <w:lvlText w:val=""/>
+      <w:lvlJc w:val="left"/>
+      <w:pPr>
+        <w:tabs>
+          <w:tab w:val="num" w:pos="2880"/>
+        </w:tabs>
+        <w:ind w:left="2880" w:hanging="360"/>
+      </w:pPr>
+      <w:rPr>
+        <w:rFonts w:ascii="Wingdings" w:hAnsi="Wingdings" w:hint="default"/>
+        <w:sz w:val="20"/>
+      </w:rPr>
+    </w:lvl>
+    <w:lvl w:ilvl="4" w:tentative="1">
+      <w:start w:val="1"/>
+      <w:numFmt w:val="bullet"/>
+      <w:lvlText w:val=""/>
+      <w:lvlJc w:val="left"/>
+      <w:pPr>
+        <w:tabs>
+          <w:tab w:val="num" w:pos="3600"/>
+        </w:tabs>
+        <w:ind w:left="3600" w:hanging="360"/>
+      </w:pPr>
+      <w:rPr>
+        <w:rFonts w:ascii="Wingdings" w:hAnsi="Wingdings" w:hint="default"/>
+        <w:sz w:val="20"/>
+      </w:rPr>
+    </w:lvl>
+    <w:lvl w:ilvl="5" w:tentative="1">
+      <w:start w:val="1"/>
+      <w:numFmt w:val="bullet"/>
+      <w:lvlText w:val=""/>
+      <w:lvlJc w:val="left"/>
+      <w:pPr>
+        <w:tabs>
+          <w:tab w:val="num" w:pos="4320"/>
+        </w:tabs>
+        <w:ind w:left="4320" w:hanging="360"/>
+      </w:pPr>
+      <w:rPr>
+        <w:rFonts w:ascii="Wingdings" w:hAnsi="Wingdings" w:hint="default"/>
+        <w:sz w:val="20"/>
+      </w:rPr>
+    </w:lvl>
+    <w:lvl w:ilvl="6" w:tentative="1">
+      <w:start w:val="1"/>
+      <w:numFmt w:val="bullet"/>
+      <w:lvlText w:val=""/>
+      <w:lvlJc w:val="left"/>
+      <w:pPr>
+        <w:tabs>
+          <w:tab w:val="num" w:pos="5040"/>
+        </w:tabs>
+        <w:ind w:left="5040" w:hanging="360"/>
+      </w:pPr>
+      <w:rPr>
+        <w:rFonts w:ascii="Wingdings" w:hAnsi="Wingdings" w:hint="default"/>
+        <w:sz w:val="20"/>
+      </w:rPr>
+    </w:lvl>
+    <w:lvl w:ilvl="7" w:tentative="1">
+      <w:start w:val="1"/>
+      <w:numFmt w:val="bullet"/>
+      <w:lvlText w:val=""/>
+      <w:lvlJc w:val="left"/>
+      <w:pPr>
+        <w:tabs>
+          <w:tab w:val="num" w:pos="5760"/>
+        </w:tabs>
+        <w:ind w:left="5760" w:hanging="360"/>
+      </w:pPr>
+      <w:rPr>
+        <w:rFonts w:ascii="Wingdings" w:hAnsi="Wingdings" w:hint="default"/>
+        <w:sz w:val="20"/>
+      </w:rPr>
+    </w:lvl>
+    <w:lvl w:ilvl="8" w:tentative="1">
+      <w:start w:val="1"/>
+      <w:numFmt w:val="bullet"/>
+      <w:lvlText w:val=""/>
+      <w:lvlJc w:val="left"/>
+      <w:pPr>
+        <w:tabs>
+          <w:tab w:val="num" w:pos="6480"/>
+        </w:tabs>
+        <w:ind w:left="6480" w:hanging="360"/>
+      </w:pPr>
+      <w:rPr>
+        <w:rFonts w:ascii="Wingdings" w:hAnsi="Wingdings" w:hint="default"/>
+        <w:sz w:val="20"/>
+      </w:rPr>
+    </w:lvl>
+  </w:abstractNum>
+  <w:abstractNum w:abstractNumId="10" w15:restartNumberingAfterBreak="0">
+    <w:nsid w:val="7C6E4A65"/>
+    <w:multiLevelType w:val="multilevel"/>
+    <w:tmpl w:val="89062264"/>
+    <w:lvl w:ilvl="0">
+      <w:start w:val="1"/>
+      <w:numFmt w:val="bullet"/>
+      <w:lvlText w:val=""/>
+      <w:lvlJc w:val="left"/>
+      <w:pPr>
+        <w:tabs>
+          <w:tab w:val="num" w:pos="720"/>
+        </w:tabs>
+        <w:ind w:left="720" w:hanging="360"/>
+      </w:pPr>
+      <w:rPr>
+        <w:rFonts w:ascii="Symbol" w:hAnsi="Symbol" w:hint="default"/>
+        <w:sz w:val="20"/>
+      </w:rPr>
+    </w:lvl>
+    <w:lvl w:ilvl="1" w:tentative="1">
+      <w:start w:val="1"/>
+      <w:numFmt w:val="bullet"/>
+      <w:lvlText w:val="o"/>
+      <w:lvlJc w:val="left"/>
+      <w:pPr>
+        <w:tabs>
+          <w:tab w:val="num" w:pos="1440"/>
+        </w:tabs>
+        <w:ind w:left="1440" w:hanging="360"/>
+      </w:pPr>
+      <w:rPr>
+        <w:rFonts w:ascii="Courier New" w:hAnsi="Courier New" w:hint="default"/>
+        <w:sz w:val="20"/>
+      </w:rPr>
+    </w:lvl>
+    <w:lvl w:ilvl="2" w:tentative="1">
+      <w:start w:val="1"/>
+      <w:numFmt w:val="bullet"/>
+      <w:lvlText w:val=""/>
+      <w:lvlJc w:val="left"/>
+      <w:pPr>
+        <w:tabs>
+          <w:tab w:val="num" w:pos="2160"/>
+        </w:tabs>
+        <w:ind w:left="2160" w:hanging="360"/>
+      </w:pPr>
+      <w:rPr>
+        <w:rFonts w:ascii="Wingdings" w:hAnsi="Wingdings" w:hint="default"/>
+        <w:sz w:val="20"/>
+      </w:rPr>
+    </w:lvl>
+    <w:lvl w:ilvl="3" w:tentative="1">
+      <w:start w:val="1"/>
+      <w:numFmt w:val="bullet"/>
+      <w:lvlText w:val=""/>
+      <w:lvlJc w:val="left"/>
+      <w:pPr>
+        <w:tabs>
+          <w:tab w:val="num" w:pos="2880"/>
+        </w:tabs>
+        <w:ind w:left="2880" w:hanging="360"/>
+      </w:pPr>
+      <w:rPr>
+        <w:rFonts w:ascii="Wingdings" w:hAnsi="Wingdings" w:hint="default"/>
+        <w:sz w:val="20"/>
+      </w:rPr>
+    </w:lvl>
+    <w:lvl w:ilvl="4" w:tentative="1">
+      <w:start w:val="1"/>
+      <w:numFmt w:val="bullet"/>
+      <w:lvlText w:val=""/>
+      <w:lvlJc w:val="left"/>
+      <w:pPr>
+        <w:tabs>
+          <w:tab w:val="num" w:pos="3600"/>
+        </w:tabs>
+        <w:ind w:left="3600" w:hanging="360"/>
+      </w:pPr>
+      <w:rPr>
+        <w:rFonts w:ascii="Wingdings" w:hAnsi="Wingdings" w:hint="default"/>
+        <w:sz w:val="20"/>
+      </w:rPr>
+    </w:lvl>
+    <w:lvl w:ilvl="5" w:tentative="1">
+      <w:start w:val="1"/>
+      <w:numFmt w:val="bullet"/>
+      <w:lvlText w:val=""/>
+      <w:lvlJc w:val="left"/>
+      <w:pPr>
+        <w:tabs>
+          <w:tab w:val="num" w:pos="4320"/>
+        </w:tabs>
+        <w:ind w:left="4320" w:hanging="360"/>
+      </w:pPr>
+      <w:rPr>
+        <w:rFonts w:ascii="Wingdings" w:hAnsi="Wingdings" w:hint="default"/>
+        <w:sz w:val="20"/>
+      </w:rPr>
+    </w:lvl>
+    <w:lvl w:ilvl="6" w:tentative="1">
+      <w:start w:val="1"/>
+      <w:numFmt w:val="bullet"/>
+      <w:lvlText w:val=""/>
+      <w:lvlJc w:val="left"/>
+      <w:pPr>
+        <w:tabs>
+          <w:tab w:val="num" w:pos="5040"/>
+        </w:tabs>
+        <w:ind w:left="5040" w:hanging="360"/>
+      </w:pPr>
+      <w:rPr>
+        <w:rFonts w:ascii="Wingdings" w:hAnsi="Wingdings" w:hint="default"/>
+        <w:sz w:val="20"/>
+      </w:rPr>
+    </w:lvl>
+    <w:lvl w:ilvl="7" w:tentative="1">
+      <w:start w:val="1"/>
+      <w:numFmt w:val="bullet"/>
+      <w:lvlText w:val=""/>
+      <w:lvlJc w:val="left"/>
+      <w:pPr>
+        <w:tabs>
+          <w:tab w:val="num" w:pos="5760"/>
+        </w:tabs>
+        <w:ind w:left="5760" w:hanging="360"/>
+      </w:pPr>
+      <w:rPr>
+        <w:rFonts w:ascii="Wingdings" w:hAnsi="Wingdings" w:hint="default"/>
+        <w:sz w:val="20"/>
+      </w:rPr>
+    </w:lvl>
+    <w:lvl w:ilvl="8" w:tentative="1">
+      <w:start w:val="1"/>
+      <w:numFmt w:val="bullet"/>
+      <w:lvlText w:val=""/>
+      <w:lvlJc w:val="left"/>
+      <w:pPr>
+        <w:tabs>
+          <w:tab w:val="num" w:pos="6480"/>
+        </w:tabs>
+        <w:ind w:left="6480" w:hanging="360"/>
+      </w:pPr>
+      <w:rPr>
+        <w:rFonts w:ascii="Wingdings" w:hAnsi="Wingdings" w:hint="default"/>
+        <w:sz w:val="20"/>
+      </w:rPr>
+    </w:lvl>
+  </w:abstractNum>
+  <w:abstractNum w:abstractNumId="11" w15:restartNumberingAfterBreak="0">
+    <w:nsid w:val="7F930DEC"/>
+    <w:multiLevelType w:val="multilevel"/>
+    <w:tmpl w:val="7C1CB900"/>
+    <w:lvl w:ilvl="0">
+      <w:start w:val="1"/>
+      <w:numFmt w:val="bullet"/>
+      <w:lvlText w:val=""/>
+      <w:lvlJc w:val="left"/>
+      <w:pPr>
+        <w:tabs>
+          <w:tab w:val="num" w:pos="720"/>
+        </w:tabs>
+        <w:ind w:left="720" w:hanging="360"/>
+      </w:pPr>
+      <w:rPr>
+        <w:rFonts w:ascii="Symbol" w:hAnsi="Symbol" w:hint="default"/>
+        <w:sz w:val="20"/>
+      </w:rPr>
+    </w:lvl>
+    <w:lvl w:ilvl="1" w:tentative="1">
+      <w:start w:val="1"/>
+      <w:numFmt w:val="bullet"/>
+      <w:lvlText w:val="o"/>
+      <w:lvlJc w:val="left"/>
+      <w:pPr>
+        <w:tabs>
+          <w:tab w:val="num" w:pos="1440"/>
+        </w:tabs>
+        <w:ind w:left="1440" w:hanging="360"/>
+      </w:pPr>
+      <w:rPr>
+        <w:rFonts w:ascii="Courier New" w:hAnsi="Courier New" w:hint="default"/>
+        <w:sz w:val="20"/>
+      </w:rPr>
+    </w:lvl>
+    <w:lvl w:ilvl="2" w:tentative="1">
+      <w:start w:val="1"/>
+      <w:numFmt w:val="bullet"/>
+      <w:lvlText w:val=""/>
+      <w:lvlJc w:val="left"/>
+      <w:pPr>
+        <w:tabs>
+          <w:tab w:val="num" w:pos="2160"/>
+        </w:tabs>
+        <w:ind w:left="2160" w:hanging="360"/>
+      </w:pPr>
+      <w:rPr>
+        <w:rFonts w:ascii="Wingdings" w:hAnsi="Wingdings" w:hint="default"/>
+        <w:sz w:val="20"/>
+      </w:rPr>
+    </w:lvl>
+    <w:lvl w:ilvl="3" w:tentative="1">
+      <w:start w:val="1"/>
+      <w:numFmt w:val="bullet"/>
+      <w:lvlText w:val=""/>
+      <w:lvlJc w:val="left"/>
+      <w:pPr>
+        <w:tabs>
+          <w:tab w:val="num" w:pos="2880"/>
+        </w:tabs>
+        <w:ind w:left="2880" w:hanging="360"/>
+      </w:pPr>
+      <w:rPr>
+        <w:rFonts w:ascii="Wingdings" w:hAnsi="Wingdings" w:hint="default"/>
+        <w:sz w:val="20"/>
+      </w:rPr>
+    </w:lvl>
+    <w:lvl w:ilvl="4" w:tentative="1">
+      <w:start w:val="1"/>
+      <w:numFmt w:val="bullet"/>
+      <w:lvlText w:val=""/>
+      <w:lvlJc w:val="left"/>
+      <w:pPr>
+        <w:tabs>
+          <w:tab w:val="num" w:pos="3600"/>
+        </w:tabs>
+        <w:ind w:left="3600" w:hanging="360"/>
+      </w:pPr>
+      <w:rPr>
+        <w:rFonts w:ascii="Wingdings" w:hAnsi="Wingdings" w:hint="default"/>
+        <w:sz w:val="20"/>
+      </w:rPr>
+    </w:lvl>
+    <w:lvl w:ilvl="5" w:tentative="1">
+      <w:start w:val="1"/>
+      <w:numFmt w:val="bullet"/>
+      <w:lvlText w:val=""/>
+      <w:lvlJc w:val="left"/>
+      <w:pPr>
+        <w:tabs>
+          <w:tab w:val="num" w:pos="4320"/>
+        </w:tabs>
+        <w:ind w:left="4320" w:hanging="360"/>
+      </w:pPr>
+      <w:rPr>
+        <w:rFonts w:ascii="Wingdings" w:hAnsi="Wingdings" w:hint="default"/>
+        <w:sz w:val="20"/>
+      </w:rPr>
+    </w:lvl>
+    <w:lvl w:ilvl="6" w:tentative="1">
+      <w:start w:val="1"/>
+      <w:numFmt w:val="bullet"/>
+      <w:lvlText w:val=""/>
+      <w:lvlJc w:val="left"/>
+      <w:pPr>
+        <w:tabs>
+          <w:tab w:val="num" w:pos="5040"/>
+        </w:tabs>
+        <w:ind w:left="5040" w:hanging="360"/>
+      </w:pPr>
+      <w:rPr>
+        <w:rFonts w:ascii="Wingdings" w:hAnsi="Wingdings" w:hint="default"/>
+        <w:sz w:val="20"/>
+      </w:rPr>
+    </w:lvl>
+    <w:lvl w:ilvl="7" w:tentative="1">
+      <w:start w:val="1"/>
+      <w:numFmt w:val="bullet"/>
+      <w:lvlText w:val=""/>
+      <w:lvlJc w:val="left"/>
+      <w:pPr>
+        <w:tabs>
+          <w:tab w:val="num" w:pos="5760"/>
+        </w:tabs>
+        <w:ind w:left="5760" w:hanging="360"/>
+      </w:pPr>
+      <w:rPr>
+        <w:rFonts w:ascii="Wingdings" w:hAnsi="Wingdings" w:hint="default"/>
+        <w:sz w:val="20"/>
+      </w:rPr>
+    </w:lvl>
+    <w:lvl w:ilvl="8" w:tentative="1">
+      <w:start w:val="1"/>
+      <w:numFmt w:val="bullet"/>
+      <w:lvlText w:val=""/>
+      <w:lvlJc w:val="left"/>
+      <w:pPr>
+        <w:tabs>
+          <w:tab w:val="num" w:pos="6480"/>
+        </w:tabs>
+        <w:ind w:left="6480" w:hanging="360"/>
+      </w:pPr>
+      <w:rPr>
+        <w:rFonts w:ascii="Wingdings" w:hAnsi="Wingdings" w:hint="default"/>
+        <w:sz w:val="20"/>
+      </w:rPr>
+    </w:lvl>
+  </w:abstractNum>
   <w:num w:numId="1" w16cid:durableId="1779181774">
+    <w:abstractNumId w:val="1"/>
+  </w:num>
+  <w:num w:numId="2" w16cid:durableId="942882893">
+    <w:abstractNumId w:val="5"/>
+  </w:num>
+  <w:num w:numId="3" w16cid:durableId="934745409">
+    <w:abstractNumId w:val="8"/>
+  </w:num>
+  <w:num w:numId="4" w16cid:durableId="1106925197">
     <w:abstractNumId w:val="0"/>
   </w:num>
-  <w:num w:numId="2" w16cid:durableId="942882893">
-    <w:abstractNumId w:val="1"/>
+  <w:num w:numId="5" w16cid:durableId="856117139">
+    <w:abstractNumId w:val="4"/>
+  </w:num>
+  <w:num w:numId="6" w16cid:durableId="2002349430">
+    <w:abstractNumId w:val="11"/>
+  </w:num>
+  <w:num w:numId="7" w16cid:durableId="1376850060">
+    <w:abstractNumId w:val="2"/>
+  </w:num>
+  <w:num w:numId="8" w16cid:durableId="868185550">
+    <w:abstractNumId w:val="9"/>
+  </w:num>
+  <w:num w:numId="9" w16cid:durableId="1727751587">
+    <w:abstractNumId w:val="10"/>
+  </w:num>
+  <w:num w:numId="10" w16cid:durableId="1872496739">
+    <w:abstractNumId w:val="6"/>
+  </w:num>
+  <w:num w:numId="11" w16cid:durableId="1391659510">
+    <w:abstractNumId w:val="7"/>
+  </w:num>
+  <w:num w:numId="12" w16cid:durableId="447356117">
+    <w:abstractNumId w:val="3"/>
   </w:num>
 </w:numbering>
 </file>
@@ -4584,7 +8785,7 @@
   <w:style w:type="paragraph" w:default="1" w:styleId="Normal">
     <w:name w:val="Normal"/>
     <w:qFormat/>
-    <w:rsid w:val="00F1007A"/>
+    <w:rsid w:val="00397AA8"/>
     <w:pPr>
       <w:jc w:val="both"/>
     </w:pPr>
@@ -5178,6 +9379,57 @@
       </w:tblBorders>
     </w:tblPr>
   </w:style>
+  <w:style w:type="character" w:styleId="Hyperlink">
+    <w:name w:val="Hyperlink"/>
+    <w:basedOn w:val="DefaultParagraphFont"/>
+    <w:uiPriority w:val="99"/>
+    <w:unhideWhenUsed/>
+    <w:rsid w:val="00907096"/>
+    <w:rPr>
+      <w:color w:val="0563C1" w:themeColor="hyperlink"/>
+      <w:u w:val="single"/>
+    </w:rPr>
+  </w:style>
+  <w:style w:type="character" w:styleId="UnresolvedMention">
+    <w:name w:val="Unresolved Mention"/>
+    <w:basedOn w:val="DefaultParagraphFont"/>
+    <w:uiPriority w:val="99"/>
+    <w:semiHidden/>
+    <w:unhideWhenUsed/>
+    <w:rsid w:val="00907096"/>
+    <w:rPr>
+      <w:color w:val="605E5C"/>
+      <w:shd w:val="clear" w:color="auto" w:fill="E1DFDD"/>
+    </w:rPr>
+  </w:style>
+  <w:style w:type="paragraph" w:customStyle="1" w:styleId="ds-markdown-paragraph">
+    <w:name w:val="ds-markdown-paragraph"/>
+    <w:basedOn w:val="Normal"/>
+    <w:rsid w:val="00740A7C"/>
+    <w:pPr>
+      <w:spacing w:before="100" w:beforeAutospacing="1" w:after="100" w:afterAutospacing="1" w:line="240" w:lineRule="auto"/>
+      <w:jc w:val="left"/>
+    </w:pPr>
+    <w:rPr>
+      <w:rFonts w:eastAsia="Times New Roman" w:cs="Times New Roman"/>
+      <w:kern w:val="0"/>
+      <w:sz w:val="24"/>
+      <w:szCs w:val="24"/>
+      <w:lang w:bidi="ar-SA"/>
+      <w14:ligatures w14:val="none"/>
+    </w:rPr>
+  </w:style>
+  <w:style w:type="character" w:styleId="Strong">
+    <w:name w:val="Strong"/>
+    <w:basedOn w:val="DefaultParagraphFont"/>
+    <w:uiPriority w:val="22"/>
+    <w:qFormat/>
+    <w:rsid w:val="00740A7C"/>
+    <w:rPr>
+      <w:b/>
+      <w:bCs/>
+    </w:rPr>
+  </w:style>
 </w:styles>
 </file>
 

</xml_diff>